<commit_message>
Render report equations with LaTeX
</commit_message>
<xml_diff>
--- a/reports/ut_reproduction_report.docx
+++ b/reports/ut_reproduction_report.docx
@@ -74,47 +74,122 @@
     </w:p>
     <w:p>
       <w:pPr>
-        <w:spacing w:before="40" w:after="160"/>
+        <w:spacing w:before="80" w:after="160"/>
         <w:jc w:val="center"/>
       </w:pPr>
       <w:r>
-        <w:rPr>
-          <w:rFonts w:ascii="Cambria Math" w:hAnsi="Cambria Math" w:eastAsia="PingFang SC"/>
-          <w:b w:val="0"/>
-          <w:color w:val="111827"/>
-          <w:sz w:val="21"/>
-        </w:rPr>
-        <w:t>dN_i/dt = (r_i - phi_i u(t) - M_i G(N(t))) N_i(t)</w:t>
+        <w:drawing>
+          <wp:inline xmlns:a="http://schemas.openxmlformats.org/drawingml/2006/main" xmlns:pic="http://schemas.openxmlformats.org/drawingml/2006/picture">
+            <wp:extent cx="5623560" cy="314360"/>
+            <wp:docPr id="1" name="Picture 1"/>
+            <wp:cNvGraphicFramePr>
+              <a:graphicFrameLocks noChangeAspect="1"/>
+            </wp:cNvGraphicFramePr>
+            <a:graphic>
+              <a:graphicData uri="http://schemas.openxmlformats.org/drawingml/2006/picture">
+                <pic:pic>
+                  <pic:nvPicPr>
+                    <pic:cNvPr id="0" name="eq_dc1d9633422d.png"/>
+                    <pic:cNvPicPr/>
+                  </pic:nvPicPr>
+                  <pic:blipFill>
+                    <a:blip r:embed="rId9"/>
+                    <a:stretch>
+                      <a:fillRect/>
+                    </a:stretch>
+                  </pic:blipFill>
+                  <pic:spPr>
+                    <a:xfrm>
+                      <a:off x="0" y="0"/>
+                      <a:ext cx="5623560" cy="314360"/>
+                    </a:xfrm>
+                    <a:prstGeom prst="rect"/>
+                  </pic:spPr>
+                </pic:pic>
+              </a:graphicData>
+            </a:graphic>
+          </wp:inline>
+        </w:drawing>
       </w:r>
     </w:p>
     <w:p>
       <w:pPr>
-        <w:spacing w:before="40" w:after="160"/>
+        <w:spacing w:before="80" w:after="160"/>
         <w:jc w:val="center"/>
       </w:pPr>
       <w:r>
-        <w:rPr>
-          <w:rFonts w:ascii="Cambria Math" w:hAnsi="Cambria Math" w:eastAsia="PingFang SC"/>
-          <w:b w:val="0"/>
-          <w:color w:val="111827"/>
-          <w:sz w:val="21"/>
-        </w:rPr>
-        <w:t>G(N) = log(1 + (1/m) sum_k N_k)</w:t>
+        <w:drawing>
+          <wp:inline xmlns:a="http://schemas.openxmlformats.org/drawingml/2006/main" xmlns:pic="http://schemas.openxmlformats.org/drawingml/2006/picture">
+            <wp:extent cx="5623560" cy="574387"/>
+            <wp:docPr id="2" name="Picture 2"/>
+            <wp:cNvGraphicFramePr>
+              <a:graphicFrameLocks noChangeAspect="1"/>
+            </wp:cNvGraphicFramePr>
+            <a:graphic>
+              <a:graphicData uri="http://schemas.openxmlformats.org/drawingml/2006/picture">
+                <pic:pic>
+                  <pic:nvPicPr>
+                    <pic:cNvPr id="0" name="eq_09dc63995389.png"/>
+                    <pic:cNvPicPr/>
+                  </pic:nvPicPr>
+                  <pic:blipFill>
+                    <a:blip r:embed="rId10"/>
+                    <a:stretch>
+                      <a:fillRect/>
+                    </a:stretch>
+                  </pic:blipFill>
+                  <pic:spPr>
+                    <a:xfrm>
+                      <a:off x="0" y="0"/>
+                      <a:ext cx="5623560" cy="574387"/>
+                    </a:xfrm>
+                    <a:prstGeom prst="rect"/>
+                  </pic:spPr>
+                </pic:pic>
+              </a:graphicData>
+            </a:graphic>
+          </wp:inline>
+        </w:drawing>
       </w:r>
     </w:p>
     <w:p>
       <w:pPr>
-        <w:spacing w:before="40" w:after="160"/>
+        <w:spacing w:before="80" w:after="160"/>
         <w:jc w:val="center"/>
       </w:pPr>
       <w:r>
-        <w:rPr>
-          <w:rFonts w:ascii="Cambria Math" w:hAnsi="Cambria Math" w:eastAsia="PingFang SC"/>
-          <w:b w:val="0"/>
-          <w:color w:val="111827"/>
-          <w:sz w:val="21"/>
-        </w:rPr>
-        <w:t>J(u) = alpha^T N(T) + int_0^T [ beta^T N(t) + gamma u(t) ] dt</w:t>
+        <w:drawing>
+          <wp:inline xmlns:a="http://schemas.openxmlformats.org/drawingml/2006/main" xmlns:pic="http://schemas.openxmlformats.org/drawingml/2006/picture">
+            <wp:extent cx="5623560" cy="485124"/>
+            <wp:docPr id="3" name="Picture 3"/>
+            <wp:cNvGraphicFramePr>
+              <a:graphicFrameLocks noChangeAspect="1"/>
+            </wp:cNvGraphicFramePr>
+            <a:graphic>
+              <a:graphicData uri="http://schemas.openxmlformats.org/drawingml/2006/picture">
+                <pic:pic>
+                  <pic:nvPicPr>
+                    <pic:cNvPr id="0" name="eq_3ff045c72401.png"/>
+                    <pic:cNvPicPr/>
+                  </pic:nvPicPr>
+                  <pic:blipFill>
+                    <a:blip r:embed="rId11"/>
+                    <a:stretch>
+                      <a:fillRect/>
+                    </a:stretch>
+                  </pic:blipFill>
+                  <pic:spPr>
+                    <a:xfrm>
+                      <a:off x="0" y="0"/>
+                      <a:ext cx="5623560" cy="485124"/>
+                    </a:xfrm>
+                    <a:prstGeom prst="rect"/>
+                  </pic:spPr>
+                </pic:pic>
+              </a:graphicData>
+            </a:graphic>
+          </wp:inline>
+        </w:drawing>
       </w:r>
     </w:p>
     <w:p>
@@ -147,17 +222,42 @@
     </w:p>
     <w:p>
       <w:pPr>
-        <w:spacing w:before="40" w:after="160"/>
+        <w:spacing w:before="80" w:after="160"/>
         <w:jc w:val="center"/>
       </w:pPr>
       <w:r>
-        <w:rPr>
-          <w:rFonts w:ascii="Cambria Math" w:hAnsi="Cambria Math" w:eastAsia="PingFang SC"/>
-          <w:b w:val="0"/>
-          <w:color w:val="111827"/>
-          <w:sz w:val="21"/>
-        </w:rPr>
-        <w:t>psi(t) = H_u(N, lambda, u) = gamma - sum_i phi_i lambda_i(t) N_i(t).</w:t>
+        <w:drawing>
+          <wp:inline xmlns:a="http://schemas.openxmlformats.org/drawingml/2006/main" xmlns:pic="http://schemas.openxmlformats.org/drawingml/2006/picture">
+            <wp:extent cx="5623560" cy="465719"/>
+            <wp:docPr id="4" name="Picture 4"/>
+            <wp:cNvGraphicFramePr>
+              <a:graphicFrameLocks noChangeAspect="1"/>
+            </wp:cNvGraphicFramePr>
+            <a:graphic>
+              <a:graphicData uri="http://schemas.openxmlformats.org/drawingml/2006/picture">
+                <pic:pic>
+                  <pic:nvPicPr>
+                    <pic:cNvPr id="0" name="eq_e9de8a385d4f.png"/>
+                    <pic:cNvPicPr/>
+                  </pic:nvPicPr>
+                  <pic:blipFill>
+                    <a:blip r:embed="rId12"/>
+                    <a:stretch>
+                      <a:fillRect/>
+                    </a:stretch>
+                  </pic:blipFill>
+                  <pic:spPr>
+                    <a:xfrm>
+                      <a:off x="0" y="0"/>
+                      <a:ext cx="5623560" cy="465719"/>
+                    </a:xfrm>
+                    <a:prstGeom prst="rect"/>
+                  </pic:spPr>
+                </pic:pic>
+              </a:graphicData>
+            </a:graphic>
+          </wp:inline>
+        </w:drawing>
       </w:r>
     </w:p>
     <w:tbl>
@@ -180,7 +280,7 @@
           </w:tcPr>
           <w:p>
             <w:pPr>
-              <w:spacing w:after="0"/>
+              <w:spacing w:before="20" w:after="20" w:line="252" w:lineRule="auto"/>
               <w:jc w:val="center"/>
             </w:pPr>
             <w:r>
@@ -202,7 +302,7 @@
           </w:tcPr>
           <w:p>
             <w:pPr>
-              <w:spacing w:after="0"/>
+              <w:spacing w:before="20" w:after="20" w:line="252" w:lineRule="auto"/>
               <w:jc w:val="center"/>
             </w:pPr>
             <w:r>
@@ -225,7 +325,7 @@
           </w:tcPr>
           <w:p>
             <w:pPr>
-              <w:spacing w:after="0"/>
+              <w:spacing w:before="20" w:after="20" w:line="252" w:lineRule="auto"/>
               <w:jc w:val="left"/>
             </w:pPr>
             <w:r>
@@ -246,7 +346,7 @@
           </w:tcPr>
           <w:p>
             <w:pPr>
-              <w:spacing w:after="0"/>
+              <w:spacing w:before="20" w:after="20" w:line="252" w:lineRule="auto"/>
               <w:jc w:val="left"/>
             </w:pPr>
             <w:r>
@@ -269,7 +369,7 @@
           </w:tcPr>
           <w:p>
             <w:pPr>
-              <w:spacing w:after="0"/>
+              <w:spacing w:before="20" w:after="20" w:line="252" w:lineRule="auto"/>
               <w:jc w:val="left"/>
             </w:pPr>
             <w:r>
@@ -290,7 +390,7 @@
           </w:tcPr>
           <w:p>
             <w:pPr>
-              <w:spacing w:after="0"/>
+              <w:spacing w:before="20" w:after="20" w:line="252" w:lineRule="auto"/>
               <w:jc w:val="left"/>
             </w:pPr>
             <w:r>
@@ -361,8 +461,8 @@
       <w:r>
         <w:drawing>
           <wp:inline xmlns:a="http://schemas.openxmlformats.org/drawingml/2006/main" xmlns:pic="http://schemas.openxmlformats.org/drawingml/2006/picture">
-            <wp:extent cx="5806440" cy="5225796"/>
-            <wp:docPr id="1" name="Picture 1"/>
+            <wp:extent cx="5806440" cy="4734219"/>
+            <wp:docPr id="5" name="Picture 5"/>
             <wp:cNvGraphicFramePr>
               <a:graphicFrameLocks noChangeAspect="1"/>
             </wp:cNvGraphicFramePr>
@@ -374,7 +474,7 @@
                     <pic:cNvPicPr/>
                   </pic:nvPicPr>
                   <pic:blipFill>
-                    <a:blip r:embed="rId9"/>
+                    <a:blip r:embed="rId13"/>
                     <a:stretch>
                       <a:fillRect/>
                     </a:stretch>
@@ -382,7 +482,7 @@
                   <pic:spPr>
                     <a:xfrm>
                       <a:off x="0" y="0"/>
-                      <a:ext cx="5806440" cy="5225796"/>
+                      <a:ext cx="5806440" cy="4734219"/>
                     </a:xfrm>
                     <a:prstGeom prst="rect"/>
                   </pic:spPr>
@@ -416,7 +516,7 @@
         <w:drawing>
           <wp:inline xmlns:a="http://schemas.openxmlformats.org/drawingml/2006/main" xmlns:pic="http://schemas.openxmlformats.org/drawingml/2006/picture">
             <wp:extent cx="5806440" cy="2322576"/>
-            <wp:docPr id="2" name="Picture 2"/>
+            <wp:docPr id="6" name="Picture 6"/>
             <wp:cNvGraphicFramePr>
               <a:graphicFrameLocks noChangeAspect="1"/>
             </wp:cNvGraphicFramePr>
@@ -428,7 +528,7 @@
                     <pic:cNvPicPr/>
                   </pic:nvPicPr>
                   <pic:blipFill>
-                    <a:blip r:embed="rId10"/>
+                    <a:blip r:embed="rId14"/>
                     <a:stretch>
                       <a:fillRect/>
                     </a:stretch>
@@ -445,6 +545,11 @@
             </a:graphic>
           </wp:inline>
         </w:drawing>
+      </w:r>
+    </w:p>
+    <w:p>
+      <w:r>
+        <w:br w:type="page"/>
       </w:r>
     </w:p>
     <w:p>
@@ -495,7 +600,7 @@
           </w:tcPr>
           <w:p>
             <w:pPr>
-              <w:spacing w:after="0"/>
+              <w:spacing w:before="20" w:after="20" w:line="252" w:lineRule="auto"/>
               <w:jc w:val="center"/>
             </w:pPr>
             <w:r>
@@ -517,7 +622,7 @@
           </w:tcPr>
           <w:p>
             <w:pPr>
-              <w:spacing w:after="0"/>
+              <w:spacing w:before="20" w:after="20" w:line="252" w:lineRule="auto"/>
               <w:jc w:val="center"/>
             </w:pPr>
             <w:r>
@@ -540,7 +645,7 @@
           </w:tcPr>
           <w:p>
             <w:pPr>
-              <w:spacing w:after="0"/>
+              <w:spacing w:before="20" w:after="20" w:line="252" w:lineRule="auto"/>
               <w:jc w:val="left"/>
             </w:pPr>
             <w:r>
@@ -561,7 +666,7 @@
           </w:tcPr>
           <w:p>
             <w:pPr>
-              <w:spacing w:after="0"/>
+              <w:spacing w:before="20" w:after="20" w:line="252" w:lineRule="auto"/>
               <w:jc w:val="left"/>
             </w:pPr>
             <w:r>
@@ -584,7 +689,7 @@
           </w:tcPr>
           <w:p>
             <w:pPr>
-              <w:spacing w:after="0"/>
+              <w:spacing w:before="20" w:after="20" w:line="252" w:lineRule="auto"/>
               <w:jc w:val="left"/>
             </w:pPr>
             <w:r>
@@ -605,7 +710,7 @@
           </w:tcPr>
           <w:p>
             <w:pPr>
-              <w:spacing w:after="0"/>
+              <w:spacing w:before="20" w:after="20" w:line="252" w:lineRule="auto"/>
               <w:jc w:val="left"/>
             </w:pPr>
             <w:r>
@@ -628,7 +733,7 @@
           </w:tcPr>
           <w:p>
             <w:pPr>
-              <w:spacing w:after="0"/>
+              <w:spacing w:before="20" w:after="20" w:line="252" w:lineRule="auto"/>
               <w:jc w:val="left"/>
             </w:pPr>
             <w:r>
@@ -649,7 +754,7 @@
           </w:tcPr>
           <w:p>
             <w:pPr>
-              <w:spacing w:after="0"/>
+              <w:spacing w:before="20" w:after="20" w:line="252" w:lineRule="auto"/>
               <w:jc w:val="left"/>
             </w:pPr>
             <w:r>
@@ -672,7 +777,7 @@
           </w:tcPr>
           <w:p>
             <w:pPr>
-              <w:spacing w:after="0"/>
+              <w:spacing w:before="20" w:after="20" w:line="252" w:lineRule="auto"/>
               <w:jc w:val="left"/>
             </w:pPr>
             <w:r>
@@ -693,7 +798,7 @@
           </w:tcPr>
           <w:p>
             <w:pPr>
-              <w:spacing w:after="0"/>
+              <w:spacing w:before="20" w:after="20" w:line="252" w:lineRule="auto"/>
               <w:jc w:val="left"/>
             </w:pPr>
             <w:r>
@@ -716,7 +821,7 @@
           </w:tcPr>
           <w:p>
             <w:pPr>
-              <w:spacing w:after="0"/>
+              <w:spacing w:before="20" w:after="20" w:line="252" w:lineRule="auto"/>
               <w:jc w:val="left"/>
             </w:pPr>
             <w:r>
@@ -737,7 +842,7 @@
           </w:tcPr>
           <w:p>
             <w:pPr>
-              <w:spacing w:after="0"/>
+              <w:spacing w:before="20" w:after="20" w:line="252" w:lineRule="auto"/>
               <w:jc w:val="left"/>
             </w:pPr>
             <w:r>
@@ -760,7 +865,7 @@
           </w:tcPr>
           <w:p>
             <w:pPr>
-              <w:spacing w:after="0"/>
+              <w:spacing w:before="20" w:after="20" w:line="252" w:lineRule="auto"/>
               <w:jc w:val="left"/>
             </w:pPr>
             <w:r>
@@ -781,7 +886,7 @@
           </w:tcPr>
           <w:p>
             <w:pPr>
-              <w:spacing w:after="0"/>
+              <w:spacing w:before="20" w:after="20" w:line="252" w:lineRule="auto"/>
               <w:jc w:val="left"/>
             </w:pPr>
             <w:r>
@@ -811,7 +916,7 @@
         <w:drawing>
           <wp:inline xmlns:a="http://schemas.openxmlformats.org/drawingml/2006/main" xmlns:pic="http://schemas.openxmlformats.org/drawingml/2006/picture">
             <wp:extent cx="5806440" cy="4102454"/>
-            <wp:docPr id="3" name="Picture 3"/>
+            <wp:docPr id="7" name="Picture 7"/>
             <wp:cNvGraphicFramePr>
               <a:graphicFrameLocks noChangeAspect="1"/>
             </wp:cNvGraphicFramePr>
@@ -823,7 +928,7 @@
                     <pic:cNvPicPr/>
                   </pic:nvPicPr>
                   <pic:blipFill>
-                    <a:blip r:embed="rId11"/>
+                    <a:blip r:embed="rId15"/>
                     <a:stretch>
                       <a:fillRect/>
                     </a:stretch>
@@ -865,7 +970,7 @@
         <w:drawing>
           <wp:inline xmlns:a="http://schemas.openxmlformats.org/drawingml/2006/main" xmlns:pic="http://schemas.openxmlformats.org/drawingml/2006/picture">
             <wp:extent cx="5806440" cy="4163754"/>
-            <wp:docPr id="4" name="Picture 4"/>
+            <wp:docPr id="8" name="Picture 8"/>
             <wp:cNvGraphicFramePr>
               <a:graphicFrameLocks noChangeAspect="1"/>
             </wp:cNvGraphicFramePr>
@@ -877,7 +982,7 @@
                     <pic:cNvPicPr/>
                   </pic:nvPicPr>
                   <pic:blipFill>
-                    <a:blip r:embed="rId12"/>
+                    <a:blip r:embed="rId16"/>
                     <a:stretch>
                       <a:fillRect/>
                     </a:stretch>
@@ -947,7 +1052,7 @@
           </w:tcPr>
           <w:p>
             <w:pPr>
-              <w:spacing w:after="0"/>
+              <w:spacing w:before="20" w:after="20" w:line="252" w:lineRule="auto"/>
               <w:jc w:val="center"/>
             </w:pPr>
             <w:r>
@@ -969,7 +1074,7 @@
           </w:tcPr>
           <w:p>
             <w:pPr>
-              <w:spacing w:after="0"/>
+              <w:spacing w:before="20" w:after="20" w:line="252" w:lineRule="auto"/>
               <w:jc w:val="center"/>
             </w:pPr>
             <w:r>
@@ -991,7 +1096,7 @@
           </w:tcPr>
           <w:p>
             <w:pPr>
-              <w:spacing w:after="0"/>
+              <w:spacing w:before="20" w:after="20" w:line="252" w:lineRule="auto"/>
               <w:jc w:val="center"/>
             </w:pPr>
             <w:r>
@@ -1013,7 +1118,7 @@
           </w:tcPr>
           <w:p>
             <w:pPr>
-              <w:spacing w:after="0"/>
+              <w:spacing w:before="20" w:after="20" w:line="252" w:lineRule="auto"/>
               <w:jc w:val="center"/>
             </w:pPr>
             <w:r>
@@ -1035,7 +1140,7 @@
           </w:tcPr>
           <w:p>
             <w:pPr>
-              <w:spacing w:after="0"/>
+              <w:spacing w:before="20" w:after="20" w:line="252" w:lineRule="auto"/>
               <w:jc w:val="center"/>
             </w:pPr>
             <w:r>
@@ -1058,7 +1163,7 @@
           </w:tcPr>
           <w:p>
             <w:pPr>
-              <w:spacing w:after="0"/>
+              <w:spacing w:before="20" w:after="20" w:line="252" w:lineRule="auto"/>
               <w:jc w:val="left"/>
             </w:pPr>
             <w:r>
@@ -1079,7 +1184,7 @@
           </w:tcPr>
           <w:p>
             <w:pPr>
-              <w:spacing w:after="0"/>
+              <w:spacing w:before="20" w:after="20" w:line="252" w:lineRule="auto"/>
               <w:jc w:val="left"/>
             </w:pPr>
             <w:r>
@@ -1100,7 +1205,7 @@
           </w:tcPr>
           <w:p>
             <w:pPr>
-              <w:spacing w:after="0"/>
+              <w:spacing w:before="20" w:after="20" w:line="252" w:lineRule="auto"/>
               <w:jc w:val="center"/>
             </w:pPr>
             <w:r>
@@ -1121,7 +1226,7 @@
           </w:tcPr>
           <w:p>
             <w:pPr>
-              <w:spacing w:after="0"/>
+              <w:spacing w:before="20" w:after="20" w:line="252" w:lineRule="auto"/>
               <w:jc w:val="center"/>
             </w:pPr>
             <w:r>
@@ -1142,7 +1247,7 @@
           </w:tcPr>
           <w:p>
             <w:pPr>
-              <w:spacing w:after="0"/>
+              <w:spacing w:before="20" w:after="20" w:line="252" w:lineRule="auto"/>
               <w:jc w:val="center"/>
             </w:pPr>
             <w:r>
@@ -1165,7 +1270,7 @@
           </w:tcPr>
           <w:p>
             <w:pPr>
-              <w:spacing w:after="0"/>
+              <w:spacing w:before="20" w:after="20" w:line="252" w:lineRule="auto"/>
               <w:jc w:val="left"/>
             </w:pPr>
             <w:r>
@@ -1186,7 +1291,7 @@
           </w:tcPr>
           <w:p>
             <w:pPr>
-              <w:spacing w:after="0"/>
+              <w:spacing w:before="20" w:after="20" w:line="252" w:lineRule="auto"/>
               <w:jc w:val="left"/>
             </w:pPr>
             <w:r>
@@ -1207,7 +1312,7 @@
           </w:tcPr>
           <w:p>
             <w:pPr>
-              <w:spacing w:after="0"/>
+              <w:spacing w:before="20" w:after="20" w:line="252" w:lineRule="auto"/>
               <w:jc w:val="center"/>
             </w:pPr>
             <w:r>
@@ -1228,7 +1333,7 @@
           </w:tcPr>
           <w:p>
             <w:pPr>
-              <w:spacing w:after="0"/>
+              <w:spacing w:before="20" w:after="20" w:line="252" w:lineRule="auto"/>
               <w:jc w:val="center"/>
             </w:pPr>
             <w:r>
@@ -1249,7 +1354,7 @@
           </w:tcPr>
           <w:p>
             <w:pPr>
-              <w:spacing w:after="0"/>
+              <w:spacing w:before="20" w:after="20" w:line="252" w:lineRule="auto"/>
               <w:jc w:val="center"/>
             </w:pPr>
             <w:r>
@@ -1272,7 +1377,7 @@
           </w:tcPr>
           <w:p>
             <w:pPr>
-              <w:spacing w:after="0"/>
+              <w:spacing w:before="20" w:after="20" w:line="252" w:lineRule="auto"/>
               <w:jc w:val="left"/>
             </w:pPr>
             <w:r>
@@ -1293,7 +1398,7 @@
           </w:tcPr>
           <w:p>
             <w:pPr>
-              <w:spacing w:after="0"/>
+              <w:spacing w:before="20" w:after="20" w:line="252" w:lineRule="auto"/>
               <w:jc w:val="left"/>
             </w:pPr>
             <w:r>
@@ -1314,7 +1419,7 @@
           </w:tcPr>
           <w:p>
             <w:pPr>
-              <w:spacing w:after="0"/>
+              <w:spacing w:before="20" w:after="20" w:line="252" w:lineRule="auto"/>
               <w:jc w:val="center"/>
             </w:pPr>
             <w:r>
@@ -1335,7 +1440,7 @@
           </w:tcPr>
           <w:p>
             <w:pPr>
-              <w:spacing w:after="0"/>
+              <w:spacing w:before="20" w:after="20" w:line="252" w:lineRule="auto"/>
               <w:jc w:val="center"/>
             </w:pPr>
             <w:r>
@@ -1356,7 +1461,7 @@
           </w:tcPr>
           <w:p>
             <w:pPr>
-              <w:spacing w:after="0"/>
+              <w:spacing w:before="20" w:after="20" w:line="252" w:lineRule="auto"/>
               <w:jc w:val="center"/>
             </w:pPr>
             <w:r>
@@ -1379,7 +1484,7 @@
           </w:tcPr>
           <w:p>
             <w:pPr>
-              <w:spacing w:after="0"/>
+              <w:spacing w:before="20" w:after="20" w:line="252" w:lineRule="auto"/>
               <w:jc w:val="left"/>
             </w:pPr>
             <w:r>
@@ -1400,7 +1505,7 @@
           </w:tcPr>
           <w:p>
             <w:pPr>
-              <w:spacing w:after="0"/>
+              <w:spacing w:before="20" w:after="20" w:line="252" w:lineRule="auto"/>
               <w:jc w:val="left"/>
             </w:pPr>
             <w:r>
@@ -1421,7 +1526,7 @@
           </w:tcPr>
           <w:p>
             <w:pPr>
-              <w:spacing w:after="0"/>
+              <w:spacing w:before="20" w:after="20" w:line="252" w:lineRule="auto"/>
               <w:jc w:val="center"/>
             </w:pPr>
             <w:r>
@@ -1442,7 +1547,7 @@
           </w:tcPr>
           <w:p>
             <w:pPr>
-              <w:spacing w:after="0"/>
+              <w:spacing w:before="20" w:after="20" w:line="252" w:lineRule="auto"/>
               <w:jc w:val="center"/>
             </w:pPr>
             <w:r>
@@ -1463,7 +1568,7 @@
           </w:tcPr>
           <w:p>
             <w:pPr>
-              <w:spacing w:after="0"/>
+              <w:spacing w:before="20" w:after="20" w:line="252" w:lineRule="auto"/>
               <w:jc w:val="center"/>
             </w:pPr>
             <w:r>
@@ -1521,7 +1626,7 @@
         <w:drawing>
           <wp:inline xmlns:a="http://schemas.openxmlformats.org/drawingml/2006/main" xmlns:pic="http://schemas.openxmlformats.org/drawingml/2006/picture">
             <wp:extent cx="5806440" cy="3776072"/>
-            <wp:docPr id="5" name="Picture 5"/>
+            <wp:docPr id="9" name="Picture 9"/>
             <wp:cNvGraphicFramePr>
               <a:graphicFrameLocks noChangeAspect="1"/>
             </wp:cNvGraphicFramePr>
@@ -1533,7 +1638,7 @@
                     <pic:cNvPicPr/>
                   </pic:nvPicPr>
                   <pic:blipFill>
-                    <a:blip r:embed="rId13"/>
+                    <a:blip r:embed="rId17"/>
                     <a:stretch>
                       <a:fillRect/>
                     </a:stretch>
@@ -1561,7 +1666,7 @@
         <w:drawing>
           <wp:inline xmlns:a="http://schemas.openxmlformats.org/drawingml/2006/main" xmlns:pic="http://schemas.openxmlformats.org/drawingml/2006/picture">
             <wp:extent cx="5806440" cy="2408575"/>
-            <wp:docPr id="6" name="Picture 6"/>
+            <wp:docPr id="10" name="Picture 10"/>
             <wp:cNvGraphicFramePr>
               <a:graphicFrameLocks noChangeAspect="1"/>
             </wp:cNvGraphicFramePr>
@@ -1573,7 +1678,7 @@
                     <pic:cNvPicPr/>
                   </pic:nvPicPr>
                   <pic:blipFill>
-                    <a:blip r:embed="rId14"/>
+                    <a:blip r:embed="rId18"/>
                     <a:stretch>
                       <a:fillRect/>
                     </a:stretch>
@@ -1601,7 +1706,7 @@
         <w:drawing>
           <wp:inline xmlns:a="http://schemas.openxmlformats.org/drawingml/2006/main" xmlns:pic="http://schemas.openxmlformats.org/drawingml/2006/picture">
             <wp:extent cx="5806440" cy="3110938"/>
-            <wp:docPr id="7" name="Picture 7"/>
+            <wp:docPr id="11" name="Picture 11"/>
             <wp:cNvGraphicFramePr>
               <a:graphicFrameLocks noChangeAspect="1"/>
             </wp:cNvGraphicFramePr>
@@ -1613,7 +1718,7 @@
                     <pic:cNvPicPr/>
                   </pic:nvPicPr>
                   <pic:blipFill>
-                    <a:blip r:embed="rId15"/>
+                    <a:blip r:embed="rId19"/>
                     <a:stretch>
                       <a:fillRect/>
                     </a:stretch>

</xml_diff>

<commit_message>
Add page numbers and equation labels to report
</commit_message>
<xml_diff>
--- a/reports/ut_reproduction_report.docx
+++ b/reports/ut_reproduction_report.docx
@@ -80,7 +80,7 @@
       <w:r>
         <w:drawing>
           <wp:inline xmlns:a="http://schemas.openxmlformats.org/drawingml/2006/main" xmlns:pic="http://schemas.openxmlformats.org/drawingml/2006/picture">
-            <wp:extent cx="5623560" cy="314360"/>
+            <wp:extent cx="5806440" cy="252589"/>
             <wp:docPr id="1" name="Picture 1"/>
             <wp:cNvGraphicFramePr>
               <a:graphicFrameLocks noChangeAspect="1"/>
@@ -89,11 +89,11 @@
               <a:graphicData uri="http://schemas.openxmlformats.org/drawingml/2006/picture">
                 <pic:pic>
                   <pic:nvPicPr>
-                    <pic:cNvPr id="0" name="eq_dc1d9633422d.png"/>
+                    <pic:cNvPr id="0" name="eq_64e41f78e59a.png"/>
                     <pic:cNvPicPr/>
                   </pic:nvPicPr>
                   <pic:blipFill>
-                    <a:blip r:embed="rId9"/>
+                    <a:blip r:embed="rId10"/>
                     <a:stretch>
                       <a:fillRect/>
                     </a:stretch>
@@ -101,7 +101,7 @@
                   <pic:spPr>
                     <a:xfrm>
                       <a:off x="0" y="0"/>
-                      <a:ext cx="5623560" cy="314360"/>
+                      <a:ext cx="5806440" cy="252589"/>
                     </a:xfrm>
                     <a:prstGeom prst="rect"/>
                   </pic:spPr>
@@ -120,7 +120,7 @@
       <w:r>
         <w:drawing>
           <wp:inline xmlns:a="http://schemas.openxmlformats.org/drawingml/2006/main" xmlns:pic="http://schemas.openxmlformats.org/drawingml/2006/picture">
-            <wp:extent cx="5623560" cy="574387"/>
+            <wp:extent cx="5806440" cy="461522"/>
             <wp:docPr id="2" name="Picture 2"/>
             <wp:cNvGraphicFramePr>
               <a:graphicFrameLocks noChangeAspect="1"/>
@@ -129,11 +129,11 @@
               <a:graphicData uri="http://schemas.openxmlformats.org/drawingml/2006/picture">
                 <pic:pic>
                   <pic:nvPicPr>
-                    <pic:cNvPr id="0" name="eq_09dc63995389.png"/>
+                    <pic:cNvPr id="0" name="eq_88437e48782f.png"/>
                     <pic:cNvPicPr/>
                   </pic:nvPicPr>
                   <pic:blipFill>
-                    <a:blip r:embed="rId10"/>
+                    <a:blip r:embed="rId11"/>
                     <a:stretch>
                       <a:fillRect/>
                     </a:stretch>
@@ -141,7 +141,7 @@
                   <pic:spPr>
                     <a:xfrm>
                       <a:off x="0" y="0"/>
-                      <a:ext cx="5623560" cy="574387"/>
+                      <a:ext cx="5806440" cy="461522"/>
                     </a:xfrm>
                     <a:prstGeom prst="rect"/>
                   </pic:spPr>
@@ -160,7 +160,7 @@
       <w:r>
         <w:drawing>
           <wp:inline xmlns:a="http://schemas.openxmlformats.org/drawingml/2006/main" xmlns:pic="http://schemas.openxmlformats.org/drawingml/2006/picture">
-            <wp:extent cx="5623560" cy="485124"/>
+            <wp:extent cx="5806440" cy="389799"/>
             <wp:docPr id="3" name="Picture 3"/>
             <wp:cNvGraphicFramePr>
               <a:graphicFrameLocks noChangeAspect="1"/>
@@ -169,11 +169,11 @@
               <a:graphicData uri="http://schemas.openxmlformats.org/drawingml/2006/picture">
                 <pic:pic>
                   <pic:nvPicPr>
-                    <pic:cNvPr id="0" name="eq_3ff045c72401.png"/>
+                    <pic:cNvPr id="0" name="eq_4ed137114627.png"/>
                     <pic:cNvPicPr/>
                   </pic:nvPicPr>
                   <pic:blipFill>
-                    <a:blip r:embed="rId11"/>
+                    <a:blip r:embed="rId12"/>
                     <a:stretch>
                       <a:fillRect/>
                     </a:stretch>
@@ -181,7 +181,7 @@
                   <pic:spPr>
                     <a:xfrm>
                       <a:off x="0" y="0"/>
-                      <a:ext cx="5623560" cy="485124"/>
+                      <a:ext cx="5806440" cy="389799"/>
                     </a:xfrm>
                     <a:prstGeom prst="rect"/>
                   </pic:spPr>
@@ -228,7 +228,7 @@
       <w:r>
         <w:drawing>
           <wp:inline xmlns:a="http://schemas.openxmlformats.org/drawingml/2006/main" xmlns:pic="http://schemas.openxmlformats.org/drawingml/2006/picture">
-            <wp:extent cx="5623560" cy="465719"/>
+            <wp:extent cx="5806440" cy="374207"/>
             <wp:docPr id="4" name="Picture 4"/>
             <wp:cNvGraphicFramePr>
               <a:graphicFrameLocks noChangeAspect="1"/>
@@ -237,11 +237,11 @@
               <a:graphicData uri="http://schemas.openxmlformats.org/drawingml/2006/picture">
                 <pic:pic>
                   <pic:nvPicPr>
-                    <pic:cNvPr id="0" name="eq_e9de8a385d4f.png"/>
+                    <pic:cNvPr id="0" name="eq_3c4308428921.png"/>
                     <pic:cNvPicPr/>
                   </pic:nvPicPr>
                   <pic:blipFill>
-                    <a:blip r:embed="rId12"/>
+                    <a:blip r:embed="rId13"/>
                     <a:stretch>
                       <a:fillRect/>
                     </a:stretch>
@@ -249,7 +249,7 @@
                   <pic:spPr>
                     <a:xfrm>
                       <a:off x="0" y="0"/>
-                      <a:ext cx="5623560" cy="465719"/>
+                      <a:ext cx="5806440" cy="374207"/>
                     </a:xfrm>
                     <a:prstGeom prst="rect"/>
                   </pic:spPr>
@@ -474,7 +474,7 @@
                     <pic:cNvPicPr/>
                   </pic:nvPicPr>
                   <pic:blipFill>
-                    <a:blip r:embed="rId13"/>
+                    <a:blip r:embed="rId14"/>
                     <a:stretch>
                       <a:fillRect/>
                     </a:stretch>
@@ -528,7 +528,7 @@
                     <pic:cNvPicPr/>
                   </pic:nvPicPr>
                   <pic:blipFill>
-                    <a:blip r:embed="rId14"/>
+                    <a:blip r:embed="rId15"/>
                     <a:stretch>
                       <a:fillRect/>
                     </a:stretch>
@@ -928,7 +928,7 @@
                     <pic:cNvPicPr/>
                   </pic:nvPicPr>
                   <pic:blipFill>
-                    <a:blip r:embed="rId15"/>
+                    <a:blip r:embed="rId16"/>
                     <a:stretch>
                       <a:fillRect/>
                     </a:stretch>
@@ -982,7 +982,7 @@
                     <pic:cNvPicPr/>
                   </pic:nvPicPr>
                   <pic:blipFill>
-                    <a:blip r:embed="rId16"/>
+                    <a:blip r:embed="rId17"/>
                     <a:stretch>
                       <a:fillRect/>
                     </a:stretch>
@@ -1638,7 +1638,7 @@
                     <pic:cNvPicPr/>
                   </pic:nvPicPr>
                   <pic:blipFill>
-                    <a:blip r:embed="rId17"/>
+                    <a:blip r:embed="rId18"/>
                     <a:stretch>
                       <a:fillRect/>
                     </a:stretch>
@@ -1678,7 +1678,7 @@
                     <pic:cNvPicPr/>
                   </pic:nvPicPr>
                   <pic:blipFill>
-                    <a:blip r:embed="rId18"/>
+                    <a:blip r:embed="rId19"/>
                     <a:stretch>
                       <a:fillRect/>
                     </a:stretch>
@@ -1718,7 +1718,7 @@
                     <pic:cNvPicPr/>
                   </pic:nvPicPr>
                   <pic:blipFill>
-                    <a:blip r:embed="rId19"/>
+                    <a:blip r:embed="rId20"/>
                     <a:stretch>
                       <a:fillRect/>
                     </a:stretch>
@@ -1766,6 +1766,7 @@
       </w:r>
     </w:p>
     <w:sectPr>
+      <w:footerReference w:type="default" r:id="rId9"/>
       <w:pgSz w:w="12240" w:h="15840"/>
       <w:pgMar w:top="1080" w:right="1152" w:bottom="1080" w:left="1152" w:header="720" w:footer="720" w:gutter="0"/>
       <w:cols w:space="720"/>
@@ -1773,6 +1774,30 @@
     </w:sectPr>
   </w:body>
 </w:document>
+</file>
+
+<file path=word/footer1.xml><?xml version="1.0" encoding="utf-8"?>
+<w:ftr xmlns:m="http://schemas.openxmlformats.org/officeDocument/2006/math" xmlns:mc="http://schemas.openxmlformats.org/markup-compatibility/2006" xmlns:mo="http://schemas.microsoft.com/office/mac/office/2008/main" xmlns:mv="urn:schemas-microsoft-com:mac:vml" xmlns:o="urn:schemas-microsoft-com:office:office" xmlns:r="http://schemas.openxmlformats.org/officeDocument/2006/relationships" xmlns:v="urn:schemas-microsoft-com:vml" xmlns:w10="urn:schemas-microsoft-com:office:word" xmlns:w14="http://schemas.microsoft.com/office/word/2010/wordml" xmlns:w="http://schemas.openxmlformats.org/wordprocessingml/2006/main" xmlns:wne="http://schemas.microsoft.com/office/word/2006/wordml" xmlns:wp14="http://schemas.microsoft.com/office/word/2010/wordprocessingDrawing" xmlns:wp="http://schemas.openxmlformats.org/drawingml/2006/wordprocessingDrawing" xmlns:wpc="http://schemas.microsoft.com/office/word/2010/wordprocessingCanvas" xmlns:wpg="http://schemas.microsoft.com/office/word/2010/wordprocessingGroup" xmlns:wpi="http://schemas.microsoft.com/office/word/2010/wordprocessingInk" xmlns:wps="http://schemas.microsoft.com/office/word/2010/wordprocessingShape" mc:Ignorable="w14 wp14">
+  <w:p>
+    <w:pPr>
+      <w:pStyle w:val="Footer"/>
+      <w:spacing w:before="0" w:after="0"/>
+      <w:jc w:val="center"/>
+    </w:pPr>
+    <w:r>
+      <w:rPr>
+        <w:rFonts w:ascii="Calibri" w:hAnsi="Calibri" w:eastAsia="PingFang SC"/>
+        <w:b w:val="0"/>
+        <w:color w:val="52606D"/>
+        <w:sz w:val="17"/>
+      </w:rPr>
+      <w:t xml:space="preserve">Page </w:t>
+      <w:fldChar w:fldCharType="begin"/>
+      <w:instrText xml:space="preserve">PAGE</w:instrText>
+      <w:fldChar w:fldCharType="end"/>
+    </w:r>
+  </w:p>
+</w:ftr>
 </file>
 
 <file path=word/numbering.xml><?xml version="1.0" encoding="utf-8"?>

</xml_diff>

<commit_message>
Clarify Neural-PMP citation in report
</commit_message>
<xml_diff>
--- a/reports/ut_reproduction_report.docx
+++ b/reports/ut_reproduction_report.docx
@@ -1012,7 +1012,7 @@
           <w:color w:val="2E74B5"/>
           <w:sz w:val="30"/>
         </w:rPr>
-        <w:t>4. Comparison With Related Work [3]</w:t>
+        <w:t>4. Comparison With Gu et al. [3]</w:t>
       </w:r>
     </w:p>
     <w:p>
@@ -1026,7 +1026,7 @@
           <w:color w:val="1F2937"/>
           <w:sz w:val="21"/>
         </w:rPr>
-        <w:t>Related work [3], Neural-PMP / PMP-gradient, also follows a Pontryagin-style procedure: forward state integration, backward costate recursion, and Hamiltonian-gradient updates of a discrete control sequence. For comparison on the same model and parameters, we implemented the corresponding control-update step from [3].</w:t>
+        <w:t>Here [3] refers to Gu, Xiong, and Chen, Pontryagin Optimal Control via Neural Networks (arXiv:2212.14566). Their Neural-PMP / PMP-gradient method also follows a Pontryagin-style procedure: forward state integration, backward costate recursion, and Hamiltonian-gradient updates of a discrete control sequence. For comparison on the same model and parameters, we implemented the corresponding control-update step from [3].</w:t>
       </w:r>
     </w:p>
     <w:tbl>
@@ -1614,7 +1614,7 @@
           <w:color w:val="1F2937"/>
           <w:sz w:val="21"/>
         </w:rPr>
-        <w:t>Under the same PMP/KKT gap calculation, the Transformer u_theta(t) has a much smaller gap than the Neural-PMP implementation of [3]. When J is recomputed with the same numerical evaluator, the Transformer also has a slightly lower objective value in this run.</w:t>
+        <w:t>Under the same PMP/KKT gap calculation, the Transformer u_theta(t) has a much smaller gap than the Neural-PMP implementation of Gu et al. [3]. When J is recomputed with the same numerical evaluator, the Transformer also has a slightly lower objective value in this run.</w:t>
       </w:r>
     </w:p>
     <w:p>

</xml_diff>

<commit_message>
Clarify Neural-PMP baseline scope
</commit_message>
<xml_diff>
--- a/reports/ut_reproduction_report.docx
+++ b/reports/ut_reproduction_report.docx
@@ -1026,7 +1026,7 @@
           <w:color w:val="1F2937"/>
           <w:sz w:val="21"/>
         </w:rPr>
-        <w:t>Here [3] refers to Gu, Xiong, and Chen, Pontryagin Optimal Control via Neural Networks (arXiv:2212.14566). Their Neural-PMP / PMP-gradient method also follows a Pontryagin-style procedure: forward state integration, backward costate recursion, and Hamiltonian-gradient updates of a discrete control sequence. For comparison on the same model and parameters, we implemented the corresponding control-update step from [3].</w:t>
+        <w:t>Here [3] refers to Gu, Xiong, and Chen, Pontryagin Optimal Control via Neural Networks (arXiv:2212.14566). Their Neural-PMP method contains two parts: learning a differentiable dynamics model from data, and then using a PMP-gradient update to optimize the control sequence. Since the dynamics are known in our manuscript setting, we compare against an oracle-dynamics version of the second part only: forward state integration, backward costate recursion, and Hamiltonian-gradient updates of a discrete control sequence. Therefore this row is a controller-stage baseline following [3], not a full reproduction of the data-driven system-identification pipeline in [3].</w:t>
       </w:r>
     </w:p>
     <w:tbl>
@@ -1280,7 +1280,7 @@
                 <w:color w:val="1F2937"/>
                 <w:sz w:val="16"/>
               </w:rPr>
-              <w:t>Neural-PMP [3]</w:t>
+              <w:t>Neural-PMP controller-stage [3]</w:t>
             </w:r>
           </w:p>
         </w:tc>
@@ -1301,7 +1301,7 @@
                 <w:color w:val="1F2937"/>
                 <w:sz w:val="16"/>
               </w:rPr>
-              <w:t>Hamiltonian-gradient update of control sequence</w:t>
+              <w:t>Hamiltonian-gradient update with known dynamics</w:t>
             </w:r>
           </w:p>
         </w:tc>
@@ -1614,7 +1614,7 @@
           <w:color w:val="1F2937"/>
           <w:sz w:val="21"/>
         </w:rPr>
-        <w:t>Under the same PMP/KKT gap calculation, the Transformer u_theta(t) has a much smaller gap than the Neural-PMP implementation of Gu et al. [3]. When J is recomputed with the same numerical evaluator, the Transformer also has a slightly lower objective value in this run.</w:t>
+        <w:t>Under the same PMP/KKT gap calculation, the Transformer u_theta(t) has a much smaller gap than this Neural-PMP controller-stage baseline. When J is recomputed with the same numerical evaluator, the Transformer also has a slightly lower objective value in this run.</w:t>
       </w:r>
     </w:p>
     <w:p>
@@ -1625,7 +1625,7 @@
       <w:r>
         <w:drawing>
           <wp:inline xmlns:a="http://schemas.openxmlformats.org/drawingml/2006/main" xmlns:pic="http://schemas.openxmlformats.org/drawingml/2006/picture">
-            <wp:extent cx="5806440" cy="3776072"/>
+            <wp:extent cx="5806440" cy="3753899"/>
             <wp:docPr id="9" name="Picture 9"/>
             <wp:cNvGraphicFramePr>
               <a:graphicFrameLocks noChangeAspect="1"/>
@@ -1646,7 +1646,7 @@
                   <pic:spPr>
                     <a:xfrm>
                       <a:off x="0" y="0"/>
-                      <a:ext cx="5806440" cy="3776072"/>
+                      <a:ext cx="5806440" cy="3753899"/>
                     </a:xfrm>
                     <a:prstGeom prst="rect"/>
                   </pic:spPr>

</xml_diff>

<commit_message>
Revise N-u phase plot
</commit_message>
<xml_diff>
--- a/reports/ut_reproduction_report.docx
+++ b/reports/ut_reproduction_report.docx
@@ -504,7 +504,7 @@
           <w:color w:val="1F2937"/>
           <w:sz w:val="21"/>
         </w:rPr>
-        <w:t>The N(u) phase plot shows population directly against the applied control value; color indicates time.</w:t>
+        <w:t>The N(u) phase plot shows the same rollout as state-control pairs (u(t_k), N_i(t_k)). Each curve corresponds to one state component N_i; no mean or total population aggregation is used.</w:t>
       </w:r>
     </w:p>
     <w:p>
@@ -515,7 +515,7 @@
       <w:r>
         <w:drawing>
           <wp:inline xmlns:a="http://schemas.openxmlformats.org/drawingml/2006/main" xmlns:pic="http://schemas.openxmlformats.org/drawingml/2006/picture">
-            <wp:extent cx="5806440" cy="2322576"/>
+            <wp:extent cx="6172200" cy="4629150"/>
             <wp:docPr id="6" name="Picture 6"/>
             <wp:cNvGraphicFramePr>
               <a:graphicFrameLocks noChangeAspect="1"/>
@@ -536,7 +536,7 @@
                   <pic:spPr>
                     <a:xfrm>
                       <a:off x="0" y="0"/>
-                      <a:ext cx="5806440" cy="2322576"/>
+                      <a:ext cx="6172200" cy="4629150"/>
                     </a:xfrm>
                     <a:prstGeom prst="rect"/>
                   </pic:spPr>

</xml_diff>

<commit_message>
Add figure captions to report
</commit_message>
<xml_diff>
--- a/reports/ut_reproduction_report.docx
+++ b/reports/ut_reproduction_report.docx
@@ -495,6 +495,21 @@
     </w:p>
     <w:p>
       <w:pPr>
+        <w:spacing w:after="160"/>
+        <w:jc w:val="center"/>
+      </w:pPr>
+      <w:r>
+        <w:rPr>
+          <w:rFonts w:ascii="Calibri" w:hAnsi="Calibri" w:eastAsia="PingFang SC"/>
+          <w:b w:val="0"/>
+          <w:color w:val="52606D"/>
+          <w:sz w:val="18"/>
+        </w:rPr>
+        <w:t>Figure 1. Learned Transformer control u(t), population trajectory N(t), switching function psi(t), and singular weight q(t).</w:t>
+      </w:r>
+    </w:p>
+    <w:p>
+      <w:pPr>
         <w:spacing w:after="120" w:line="264" w:lineRule="auto"/>
       </w:pPr>
       <w:r>
@@ -545,6 +560,21 @@
             </a:graphic>
           </wp:inline>
         </w:drawing>
+      </w:r>
+    </w:p>
+    <w:p>
+      <w:pPr>
+        <w:spacing w:after="160"/>
+        <w:jc w:val="center"/>
+      </w:pPr>
+      <w:r>
+        <w:rPr>
+          <w:rFonts w:ascii="Calibri" w:hAnsi="Calibri" w:eastAsia="PingFang SC"/>
+          <w:b w:val="0"/>
+          <w:color w:val="52606D"/>
+          <w:sz w:val="18"/>
+        </w:rPr>
+        <w:t>Figure 2. N(u) phase plot using the state-control points (u(t_k), N_i(t_k)) for all state components.</w:t>
       </w:r>
     </w:p>
     <w:p>
@@ -949,6 +979,21 @@
     </w:p>
     <w:p>
       <w:pPr>
+        <w:spacing w:after="160"/>
+        <w:jc w:val="center"/>
+      </w:pPr>
+      <w:r>
+        <w:rPr>
+          <w:rFonts w:ascii="Calibri" w:hAnsi="Calibri" w:eastAsia="PingFang SC"/>
+          <w:b w:val="0"/>
+          <w:color w:val="52606D"/>
+          <w:sz w:val="18"/>
+        </w:rPr>
+        <w:t>Figure 3. Training trajectories of the total PMP/KKT optimality gap and its singular and non-singular components.</w:t>
+      </w:r>
+    </w:p>
+    <w:p>
+      <w:pPr>
         <w:spacing w:after="120" w:line="264" w:lineRule="auto"/>
       </w:pPr>
       <w:r>
@@ -999,6 +1044,21 @@
             </a:graphic>
           </wp:inline>
         </w:drawing>
+      </w:r>
+    </w:p>
+    <w:p>
+      <w:pPr>
+        <w:spacing w:after="160"/>
+        <w:jc w:val="center"/>
+      </w:pPr>
+      <w:r>
+        <w:rPr>
+          <w:rFonts w:ascii="Calibri" w:hAnsi="Calibri" w:eastAsia="PingFang SC"/>
+          <w:b w:val="0"/>
+          <w:color w:val="52606D"/>
+          <w:sz w:val="18"/>
+        </w:rPr>
+        <w:t>Figure 4. Pointwise singular-condition error and boundary KKT error along the final learned trajectory.</w:t>
       </w:r>
     </w:p>
     <w:p>
@@ -1659,6 +1719,21 @@
     </w:p>
     <w:p>
       <w:pPr>
+        <w:spacing w:after="160"/>
+        <w:jc w:val="center"/>
+      </w:pPr>
+      <w:r>
+        <w:rPr>
+          <w:rFonts w:ascii="Calibri" w:hAnsi="Calibri" w:eastAsia="PingFang SC"/>
+          <w:b w:val="0"/>
+          <w:color w:val="52606D"/>
+          <w:sz w:val="18"/>
+        </w:rPr>
+        <w:t>Figure 5. Neural-PMP controller-stage baseline [3]: control sequence and resulting state trajectory.</w:t>
+      </w:r>
+    </w:p>
+    <w:p>
+      <w:pPr>
         <w:spacing w:before="80" w:after="60"/>
         <w:jc w:val="center"/>
       </w:pPr>
@@ -1699,6 +1774,21 @@
     </w:p>
     <w:p>
       <w:pPr>
+        <w:spacing w:after="160"/>
+        <w:jc w:val="center"/>
+      </w:pPr>
+      <w:r>
+        <w:rPr>
+          <w:rFonts w:ascii="Calibri" w:hAnsi="Calibri" w:eastAsia="PingFang SC"/>
+          <w:b w:val="0"/>
+          <w:color w:val="52606D"/>
+          <w:sz w:val="18"/>
+        </w:rPr>
+        <w:t>Figure 6. Neural-PMP controller-stage baseline [3]: selected-run training trajectories.</w:t>
+      </w:r>
+    </w:p>
+    <w:p>
+      <w:pPr>
         <w:spacing w:before="80" w:after="60"/>
         <w:jc w:val="center"/>
       </w:pPr>
@@ -1735,6 +1825,21 @@
             </a:graphic>
           </wp:inline>
         </w:drawing>
+      </w:r>
+    </w:p>
+    <w:p>
+      <w:pPr>
+        <w:spacing w:after="160"/>
+        <w:jc w:val="center"/>
+      </w:pPr>
+      <w:r>
+        <w:rPr>
+          <w:rFonts w:ascii="Calibri" w:hAnsi="Calibri" w:eastAsia="PingFang SC"/>
+          <w:b w:val="0"/>
+          <w:color w:val="52606D"/>
+          <w:sz w:val="18"/>
+        </w:rPr>
+        <w:t>Figure 7. Objective J gap relative to the direct-cost reference under the common numerical evaluation.</w:t>
       </w:r>
     </w:p>
     <w:p>

</xml_diff>

<commit_message>
Render N-u plot math labels
</commit_message>
<xml_diff>
--- a/reports/ut_reproduction_report.docx
+++ b/reports/ut_reproduction_report.docx
@@ -203,7 +203,7 @@
           <w:color w:val="1F2937"/>
           <w:sz w:val="21"/>
         </w:rPr>
-        <w:t>Reported parameters: T=10, m=21, u_max=3, alpha=1, beta=0.1, gamma=20, and N_i(0)=10. The control is represented by a small Transformer encoder over normalized time: u_theta(t_k)=u_max sigma(g_theta(t_k)).</w:t>
+        <w:t>Reported parameters: T=10, m=21, u_max=3, alpha=1, beta=0.1, gamma=20, and N_i(0)=10. The control is represented by a small Transformer encoder over normalized time.</w:t>
       </w:r>
     </w:p>
     <w:p>
@@ -519,7 +519,7 @@
           <w:color w:val="1F2937"/>
           <w:sz w:val="21"/>
         </w:rPr>
-        <w:t>The N(u) phase plot shows the same rollout as state-control pairs (u(t_k), N_i(t_k)). Each curve corresponds to one state component N_i; no mean or total population aggregation is used.</w:t>
+        <w:t>The N(u) phase plot shows the same rollout by plotting each state component directly against the applied control. No mean or total population aggregation is used.</w:t>
       </w:r>
     </w:p>
     <w:p>
@@ -530,7 +530,7 @@
       <w:r>
         <w:drawing>
           <wp:inline xmlns:a="http://schemas.openxmlformats.org/drawingml/2006/main" xmlns:pic="http://schemas.openxmlformats.org/drawingml/2006/picture">
-            <wp:extent cx="6172200" cy="4629150"/>
+            <wp:extent cx="6172200" cy="4617323"/>
             <wp:docPr id="6" name="Picture 6"/>
             <wp:cNvGraphicFramePr>
               <a:graphicFrameLocks noChangeAspect="1"/>
@@ -551,7 +551,7 @@
                   <pic:spPr>
                     <a:xfrm>
                       <a:off x="0" y="0"/>
-                      <a:ext cx="6172200" cy="4629150"/>
+                      <a:ext cx="6172200" cy="4617323"/>
                     </a:xfrm>
                     <a:prstGeom prst="rect"/>
                   </pic:spPr>
@@ -574,7 +574,7 @@
           <w:color w:val="52606D"/>
           <w:sz w:val="18"/>
         </w:rPr>
-        <w:t>Figure 2. N(u) phase plot using the state-control points (u(t_k), N_i(t_k)) for all state components; colors distinguish state index i, not time.</w:t>
+        <w:t>Figure 2. N(u) phase plot: each state component is plotted against the applied control; colors distinguish the state index, not time.</w:t>
       </w:r>
     </w:p>
     <w:p>

</xml_diff>

<commit_message>
Polish N-u plot wording
</commit_message>
<xml_diff>
--- a/reports/ut_reproduction_report.docx
+++ b/reports/ut_reproduction_report.docx
@@ -519,7 +519,7 @@
           <w:color w:val="1F2937"/>
           <w:sz w:val="21"/>
         </w:rPr>
-        <w:t>The N(u) phase plot shows the same rollout by plotting each state component directly against the applied control. No mean or total population aggregation is used.</w:t>
+        <w:t>The N(u) phase plot shows the same rollout by plotting each state component directly against the applied control.</w:t>
       </w:r>
     </w:p>
     <w:p>
@@ -530,7 +530,7 @@
       <w:r>
         <w:drawing>
           <wp:inline xmlns:a="http://schemas.openxmlformats.org/drawingml/2006/main" xmlns:pic="http://schemas.openxmlformats.org/drawingml/2006/picture">
-            <wp:extent cx="6172200" cy="4617323"/>
+            <wp:extent cx="6172200" cy="4596186"/>
             <wp:docPr id="6" name="Picture 6"/>
             <wp:cNvGraphicFramePr>
               <a:graphicFrameLocks noChangeAspect="1"/>
@@ -551,7 +551,7 @@
                   <pic:spPr>
                     <a:xfrm>
                       <a:off x="0" y="0"/>
-                      <a:ext cx="6172200" cy="4617323"/>
+                      <a:ext cx="6172200" cy="4596186"/>
                     </a:xfrm>
                     <a:prstGeom prst="rect"/>
                   </pic:spPr>
@@ -574,7 +574,7 @@
           <w:color w:val="52606D"/>
           <w:sz w:val="18"/>
         </w:rPr>
-        <w:t>Figure 2. N(u) phase plot: each state component is plotted against the applied control; colors distinguish the state index, not time.</w:t>
+        <w:t>Figure 2. N(u) phase plot: each state component is plotted against the applied control; colors distinguish the state index.</w:t>
       </w:r>
     </w:p>
     <w:p>
@@ -1086,7 +1086,7 @@
           <w:color w:val="1F2937"/>
           <w:sz w:val="21"/>
         </w:rPr>
-        <w:t>Here [3] refers to Gu, Xiong, and Chen, Pontryagin Optimal Control via Neural Networks (arXiv:2212.14566). Their Neural-PMP method contains two parts: learning a differentiable dynamics model from data, and then using a PMP-gradient update to optimize the control sequence. Since the dynamics are known in our manuscript setting, we compare against an oracle-dynamics version of the second part only: forward state integration, backward costate recursion, and Hamiltonian-gradient updates of a discrete control sequence. Therefore this row is a controller-stage baseline following [3], not a full reproduction of the data-driven system-identification pipeline in [3].</w:t>
+        <w:t>Here [3] refers to Gu, Xiong, and Chen, Pontryagin Optimal Control via Neural Networks (arXiv:2212.14566). Their Neural-PMP method contains two parts: learning a differentiable dynamics model from data, and then using a PMP-gradient update to optimize the control sequence. Since the dynamics are known in our manuscript setting, we compare against an oracle-dynamics version of the second part: forward state integration, backward costate recursion, and Hamiltonian-gradient updates of a discrete control sequence. This row should therefore be read as a controller-stage baseline following [3].</w:t>
       </w:r>
     </w:p>
     <w:tbl>
@@ -1575,7 +1575,7 @@
                 <w:color w:val="1F2937"/>
                 <w:sz w:val="16"/>
               </w:rPr>
-              <w:t>no training</w:t>
+              <w:t>fixed control</w:t>
             </w:r>
           </w:p>
         </w:tc>
@@ -1867,7 +1867,7 @@
           <w:color w:val="1F2937"/>
           <w:sz w:val="21"/>
         </w:rPr>
-        <w:t>The requested u(t) reproduction is complete. The Transformer control trajectory trained with the manuscript's PMP/KKT optimality-gap loss is smooth and satisfies the control bounds, reduces the training optimality gap from 76.26 to 0.02637, and gives J approximately 386.70 under the common numerical evaluation. The state-dependent extension u(t,N) is not included in this report because it requires different optimality conditions.</w:t>
+        <w:t>The requested u(t) reproduction is complete. The Transformer control trajectory trained with the manuscript's PMP/KKT optimality-gap loss is smooth and satisfies the control bounds, reduces the training optimality gap from 76.26 to 0.02637, and gives J approximately 386.70 under the common numerical evaluation. The state-dependent extension u(t,N) is left for separate work because it requires different optimality conditions.</w:t>
       </w:r>
     </w:p>
     <w:sectPr>

</xml_diff>

<commit_message>
Use total population for N-u plot
</commit_message>
<xml_diff>
--- a/reports/ut_reproduction_report.docx
+++ b/reports/ut_reproduction_report.docx
@@ -519,7 +519,7 @@
           <w:color w:val="1F2937"/>
           <w:sz w:val="21"/>
         </w:rPr>
-        <w:t>The N(u) phase plot shows the same rollout by plotting each state component directly against the applied control.</w:t>
+        <w:t>The N(u) phase plot below uses the total population across all 21 subpopulations.</w:t>
       </w:r>
     </w:p>
     <w:p>
@@ -530,7 +530,7 @@
       <w:r>
         <w:drawing>
           <wp:inline xmlns:a="http://schemas.openxmlformats.org/drawingml/2006/main" xmlns:pic="http://schemas.openxmlformats.org/drawingml/2006/picture">
-            <wp:extent cx="6172200" cy="4596186"/>
+            <wp:extent cx="6172200" cy="4239809"/>
             <wp:docPr id="6" name="Picture 6"/>
             <wp:cNvGraphicFramePr>
               <a:graphicFrameLocks noChangeAspect="1"/>
@@ -551,7 +551,7 @@
                   <pic:spPr>
                     <a:xfrm>
                       <a:off x="0" y="0"/>
-                      <a:ext cx="6172200" cy="4596186"/>
+                      <a:ext cx="6172200" cy="4239809"/>
                     </a:xfrm>
                     <a:prstGeom prst="rect"/>
                   </pic:spPr>
@@ -574,7 +574,7 @@
           <w:color w:val="52606D"/>
           <w:sz w:val="18"/>
         </w:rPr>
-        <w:t>Figure 2. N(u) phase plot: each state component is plotted against the applied control; colors distinguish the state index.</w:t>
+        <w:t>Figure 2. N(u) phase plot using the total population across the 21 subpopulations.</w:t>
       </w:r>
     </w:p>
     <w:p>

</xml_diff>

<commit_message>
Add related work method comparison
</commit_message>
<xml_diff>
--- a/reports/ut_reproduction_report.docx
+++ b/reports/ut_reproduction_report.docx
@@ -1072,7 +1072,7 @@
           <w:color w:val="2E74B5"/>
           <w:sz w:val="30"/>
         </w:rPr>
-        <w:t>4. Comparison With Gu et al. [3]</w:t>
+        <w:t>4. Comparison With Related Work</w:t>
       </w:r>
     </w:p>
     <w:p>
@@ -1086,7 +1086,437 @@
           <w:color w:val="1F2937"/>
           <w:sz w:val="21"/>
         </w:rPr>
-        <w:t>Here [3] refers to Gu, Xiong, and Chen, Pontryagin Optimal Control via Neural Networks (arXiv:2212.14566). Their Neural-PMP method contains two parts: learning a differentiable dynamics model from data, and then using a PMP-gradient update to optimize the control sequence. Since the dynamics are known in our manuscript setting, we compare against an oracle-dynamics version of the second part: forward state integration, backward costate recursion, and Hamiltonian-gradient updates of a discrete control sequence. This row should therefore be read as a controller-stage baseline following [3].</w:t>
+        <w:t>The related work in the manuscript uses several different optimal-control formulations, so we first compare them at the level of the learned object and optimality condition before giving the numerical baseline.</w:t>
+      </w:r>
+    </w:p>
+    <w:tbl>
+      <w:tblPr>
+        <w:tblStyle w:val="TableGrid"/>
+        <w:tblW w:type="auto" w:w="0"/>
+        <w:jc w:val="center"/>
+        <w:tblLook w:firstColumn="1" w:firstRow="1" w:lastColumn="0" w:lastRow="0" w:noHBand="0" w:noVBand="1" w:val="04A0"/>
+      </w:tblPr>
+      <w:tblGrid>
+        <w:gridCol w:w="3312"/>
+        <w:gridCol w:w="3312"/>
+        <w:gridCol w:w="3312"/>
+      </w:tblGrid>
+      <w:tr>
+        <w:tc>
+          <w:tcPr>
+            <w:tcW w:type="dxa" w:w="2232"/>
+            <w:shd w:fill="F2F4F7"/>
+            <w:vAlign w:val="center"/>
+          </w:tcPr>
+          <w:p>
+            <w:pPr>
+              <w:spacing w:before="20" w:after="20" w:line="252" w:lineRule="auto"/>
+              <w:jc w:val="center"/>
+            </w:pPr>
+            <w:r>
+              <w:rPr>
+                <w:rFonts w:ascii="Calibri" w:hAnsi="Calibri" w:eastAsia="PingFang SC"/>
+                <w:b/>
+                <w:color w:val="1F2937"/>
+                <w:sz w:val="14"/>
+              </w:rPr>
+              <w:t>reference</w:t>
+            </w:r>
+          </w:p>
+        </w:tc>
+        <w:tc>
+          <w:tcPr>
+            <w:tcW w:type="dxa" w:w="3311"/>
+            <w:shd w:fill="F2F4F7"/>
+            <w:vAlign w:val="center"/>
+          </w:tcPr>
+          <w:p>
+            <w:pPr>
+              <w:spacing w:before="20" w:after="20" w:line="252" w:lineRule="auto"/>
+              <w:jc w:val="center"/>
+            </w:pPr>
+            <w:r>
+              <w:rPr>
+                <w:rFonts w:ascii="Calibri" w:hAnsi="Calibri" w:eastAsia="PingFang SC"/>
+                <w:b/>
+                <w:color w:val="1F2937"/>
+                <w:sz w:val="14"/>
+              </w:rPr>
+              <w:t>learned object / formulation</w:t>
+            </w:r>
+          </w:p>
+        </w:tc>
+        <w:tc>
+          <w:tcPr>
+            <w:tcW w:type="dxa" w:w="3744"/>
+            <w:shd w:fill="F2F4F7"/>
+            <w:vAlign w:val="center"/>
+          </w:tcPr>
+          <w:p>
+            <w:pPr>
+              <w:spacing w:before="20" w:after="20" w:line="252" w:lineRule="auto"/>
+              <w:jc w:val="center"/>
+            </w:pPr>
+            <w:r>
+              <w:rPr>
+                <w:rFonts w:ascii="Calibri" w:hAnsi="Calibri" w:eastAsia="PingFang SC"/>
+                <w:b/>
+                <w:color w:val="1F2937"/>
+                <w:sz w:val="14"/>
+              </w:rPr>
+              <w:t>relation to this report</w:t>
+            </w:r>
+          </w:p>
+        </w:tc>
+      </w:tr>
+      <w:tr>
+        <w:tc>
+          <w:tcPr>
+            <w:tcW w:type="dxa" w:w="2232"/>
+            <w:vAlign w:val="center"/>
+          </w:tcPr>
+          <w:p>
+            <w:pPr>
+              <w:spacing w:before="20" w:after="20" w:line="252" w:lineRule="auto"/>
+              <w:jc w:val="left"/>
+            </w:pPr>
+            <w:r>
+              <w:rPr>
+                <w:rFonts w:ascii="Calibri" w:hAnsi="Calibri" w:eastAsia="PingFang SC"/>
+                <w:b w:val="0"/>
+                <w:color w:val="1F2937"/>
+                <w:sz w:val="14"/>
+              </w:rPr>
+              <w:t>HJB / BSDE methods [1,2,7]</w:t>
+            </w:r>
+          </w:p>
+        </w:tc>
+        <w:tc>
+          <w:tcPr>
+            <w:tcW w:type="dxa" w:w="3311"/>
+            <w:vAlign w:val="center"/>
+          </w:tcPr>
+          <w:p>
+            <w:pPr>
+              <w:spacing w:before="20" w:after="20" w:line="252" w:lineRule="auto"/>
+              <w:jc w:val="left"/>
+            </w:pPr>
+            <w:r>
+              <w:rPr>
+                <w:rFonts w:ascii="Calibri" w:hAnsi="Calibri" w:eastAsia="PingFang SC"/>
+                <w:b w:val="0"/>
+                <w:color w:val="1F2937"/>
+                <w:sz w:val="14"/>
+              </w:rPr>
+              <w:t>value function V(t,N) or HJB PDE solution</w:t>
+            </w:r>
+          </w:p>
+        </w:tc>
+        <w:tc>
+          <w:tcPr>
+            <w:tcW w:type="dxa" w:w="3744"/>
+            <w:vAlign w:val="center"/>
+          </w:tcPr>
+          <w:p>
+            <w:pPr>
+              <w:spacing w:before="20" w:after="20" w:line="252" w:lineRule="auto"/>
+              <w:jc w:val="center"/>
+            </w:pPr>
+            <w:r>
+              <w:rPr>
+                <w:rFonts w:ascii="Calibri" w:hAnsi="Calibri" w:eastAsia="PingFang SC"/>
+                <w:b w:val="0"/>
+                <w:color w:val="1F2937"/>
+                <w:sz w:val="14"/>
+              </w:rPr>
+              <w:t>full state-domain feedback problem; not directly comparable to the requested time-dependent u(t) reproduction</w:t>
+            </w:r>
+          </w:p>
+        </w:tc>
+      </w:tr>
+      <w:tr>
+        <w:tc>
+          <w:tcPr>
+            <w:tcW w:type="dxa" w:w="2232"/>
+            <w:vAlign w:val="center"/>
+          </w:tcPr>
+          <w:p>
+            <w:pPr>
+              <w:spacing w:before="20" w:after="20" w:line="252" w:lineRule="auto"/>
+              <w:jc w:val="left"/>
+            </w:pPr>
+            <w:r>
+              <w:rPr>
+                <w:rFonts w:ascii="Calibri" w:hAnsi="Calibri" w:eastAsia="PingFang SC"/>
+                <w:b w:val="0"/>
+                <w:color w:val="1F2937"/>
+                <w:sz w:val="14"/>
+              </w:rPr>
+              <w:t>Neural-PMP [3]</w:t>
+            </w:r>
+          </w:p>
+        </w:tc>
+        <w:tc>
+          <w:tcPr>
+            <w:tcW w:type="dxa" w:w="3311"/>
+            <w:vAlign w:val="center"/>
+          </w:tcPr>
+          <w:p>
+            <w:pPr>
+              <w:spacing w:before="20" w:after="20" w:line="252" w:lineRule="auto"/>
+              <w:jc w:val="left"/>
+            </w:pPr>
+            <w:r>
+              <w:rPr>
+                <w:rFonts w:ascii="Calibri" w:hAnsi="Calibri" w:eastAsia="PingFang SC"/>
+                <w:b w:val="0"/>
+                <w:color w:val="1F2937"/>
+                <w:sz w:val="14"/>
+              </w:rPr>
+              <w:t>control sequence via forward rollout, backward costate recursion, and Hamiltonian-gradient updates</w:t>
+            </w:r>
+          </w:p>
+        </w:tc>
+        <w:tc>
+          <w:tcPr>
+            <w:tcW w:type="dxa" w:w="3744"/>
+            <w:vAlign w:val="center"/>
+          </w:tcPr>
+          <w:p>
+            <w:pPr>
+              <w:spacing w:before="20" w:after="20" w:line="252" w:lineRule="auto"/>
+              <w:jc w:val="center"/>
+            </w:pPr>
+            <w:r>
+              <w:rPr>
+                <w:rFonts w:ascii="Calibri" w:hAnsi="Calibri" w:eastAsia="PingFang SC"/>
+                <w:b w:val="0"/>
+                <w:color w:val="1F2937"/>
+                <w:sz w:val="14"/>
+              </w:rPr>
+              <w:t>closest related-work baseline for the present u(t) experiment; implemented numerically below</w:t>
+            </w:r>
+          </w:p>
+        </w:tc>
+      </w:tr>
+      <w:tr>
+        <w:tc>
+          <w:tcPr>
+            <w:tcW w:type="dxa" w:w="2232"/>
+            <w:vAlign w:val="center"/>
+          </w:tcPr>
+          <w:p>
+            <w:pPr>
+              <w:spacing w:before="20" w:after="20" w:line="252" w:lineRule="auto"/>
+              <w:jc w:val="left"/>
+            </w:pPr>
+            <w:r>
+              <w:rPr>
+                <w:rFonts w:ascii="Calibri" w:hAnsi="Calibri" w:eastAsia="PingFang SC"/>
+                <w:b w:val="0"/>
+                <w:color w:val="1F2937"/>
+                <w:sz w:val="14"/>
+              </w:rPr>
+              <w:t>DeepONet HJB policy iteration [5]</w:t>
+            </w:r>
+          </w:p>
+        </w:tc>
+        <w:tc>
+          <w:tcPr>
+            <w:tcW w:type="dxa" w:w="3311"/>
+            <w:vAlign w:val="center"/>
+          </w:tcPr>
+          <w:p>
+            <w:pPr>
+              <w:spacing w:before="20" w:after="20" w:line="252" w:lineRule="auto"/>
+              <w:jc w:val="left"/>
+            </w:pPr>
+            <w:r>
+              <w:rPr>
+                <w:rFonts w:ascii="Calibri" w:hAnsi="Calibri" w:eastAsia="PingFang SC"/>
+                <w:b w:val="0"/>
+                <w:color w:val="1F2937"/>
+                <w:sz w:val="14"/>
+              </w:rPr>
+              <w:t>operator for value-function / HJB policy-iteration solves</w:t>
+            </w:r>
+          </w:p>
+        </w:tc>
+        <w:tc>
+          <w:tcPr>
+            <w:tcW w:type="dxa" w:w="3744"/>
+            <w:vAlign w:val="center"/>
+          </w:tcPr>
+          <w:p>
+            <w:pPr>
+              <w:spacing w:before="20" w:after="20" w:line="252" w:lineRule="auto"/>
+              <w:jc w:val="center"/>
+            </w:pPr>
+            <w:r>
+              <w:rPr>
+                <w:rFonts w:ascii="Calibri" w:hAnsi="Calibri" w:eastAsia="PingFang SC"/>
+                <w:b w:val="0"/>
+                <w:color w:val="1F2937"/>
+                <w:sz w:val="14"/>
+              </w:rPr>
+              <w:t>methodological reference for feedback/value-function learning; requires a different training problem</w:t>
+            </w:r>
+          </w:p>
+        </w:tc>
+      </w:tr>
+      <w:tr>
+        <w:tc>
+          <w:tcPr>
+            <w:tcW w:type="dxa" w:w="2232"/>
+            <w:vAlign w:val="center"/>
+          </w:tcPr>
+          <w:p>
+            <w:pPr>
+              <w:spacing w:before="20" w:after="20" w:line="252" w:lineRule="auto"/>
+              <w:jc w:val="left"/>
+            </w:pPr>
+            <w:r>
+              <w:rPr>
+                <w:rFonts w:ascii="Calibri" w:hAnsi="Calibri" w:eastAsia="PingFang SC"/>
+                <w:b w:val="0"/>
+                <w:color w:val="1F2937"/>
+                <w:sz w:val="14"/>
+              </w:rPr>
+              <w:t>PINN policy iteration [6]</w:t>
+            </w:r>
+          </w:p>
+        </w:tc>
+        <w:tc>
+          <w:tcPr>
+            <w:tcW w:type="dxa" w:w="3311"/>
+            <w:vAlign w:val="center"/>
+          </w:tcPr>
+          <w:p>
+            <w:pPr>
+              <w:spacing w:before="20" w:after="20" w:line="252" w:lineRule="auto"/>
+              <w:jc w:val="left"/>
+            </w:pPr>
+            <w:r>
+              <w:rPr>
+                <w:rFonts w:ascii="Calibri" w:hAnsi="Calibri" w:eastAsia="PingFang SC"/>
+                <w:b w:val="0"/>
+                <w:color w:val="1F2937"/>
+                <w:sz w:val="14"/>
+              </w:rPr>
+              <w:t>policy evaluation / improvement PDEs with neural networks</w:t>
+            </w:r>
+          </w:p>
+        </w:tc>
+        <w:tc>
+          <w:tcPr>
+            <w:tcW w:type="dxa" w:w="3744"/>
+            <w:vAlign w:val="center"/>
+          </w:tcPr>
+          <w:p>
+            <w:pPr>
+              <w:spacing w:before="20" w:after="20" w:line="252" w:lineRule="auto"/>
+              <w:jc w:val="center"/>
+            </w:pPr>
+            <w:r>
+              <w:rPr>
+                <w:rFonts w:ascii="Calibri" w:hAnsi="Calibri" w:eastAsia="PingFang SC"/>
+                <w:b w:val="0"/>
+                <w:color w:val="1F2937"/>
+                <w:sz w:val="14"/>
+              </w:rPr>
+              <w:t>feedback/value-function route, not the same objective as trajectory-level u(t) PMP/KKT loss</w:t>
+            </w:r>
+          </w:p>
+        </w:tc>
+      </w:tr>
+      <w:tr>
+        <w:tc>
+          <w:tcPr>
+            <w:tcW w:type="dxa" w:w="2232"/>
+            <w:vAlign w:val="center"/>
+          </w:tcPr>
+          <w:p>
+            <w:pPr>
+              <w:spacing w:before="20" w:after="20" w:line="252" w:lineRule="auto"/>
+              <w:jc w:val="left"/>
+            </w:pPr>
+            <w:r>
+              <w:rPr>
+                <w:rFonts w:ascii="Calibri" w:hAnsi="Calibri" w:eastAsia="PingFang SC"/>
+                <w:b w:val="0"/>
+                <w:color w:val="1F2937"/>
+                <w:sz w:val="14"/>
+              </w:rPr>
+              <w:t>classical chemotherapy OC [4]</w:t>
+            </w:r>
+          </w:p>
+        </w:tc>
+        <w:tc>
+          <w:tcPr>
+            <w:tcW w:type="dxa" w:w="3311"/>
+            <w:vAlign w:val="center"/>
+          </w:tcPr>
+          <w:p>
+            <w:pPr>
+              <w:spacing w:before="20" w:after="20" w:line="252" w:lineRule="auto"/>
+              <w:jc w:val="left"/>
+            </w:pPr>
+            <w:r>
+              <w:rPr>
+                <w:rFonts w:ascii="Calibri" w:hAnsi="Calibri" w:eastAsia="PingFang SC"/>
+                <w:b w:val="0"/>
+                <w:color w:val="1F2937"/>
+                <w:sz w:val="14"/>
+              </w:rPr>
+              <w:t>PMP and singular-control structure for heterogeneous population model</w:t>
+            </w:r>
+          </w:p>
+        </w:tc>
+        <w:tc>
+          <w:tcPr>
+            <w:tcW w:type="dxa" w:w="3744"/>
+            <w:vAlign w:val="center"/>
+          </w:tcPr>
+          <w:p>
+            <w:pPr>
+              <w:spacing w:before="20" w:after="20" w:line="252" w:lineRule="auto"/>
+              <w:jc w:val="center"/>
+            </w:pPr>
+            <w:r>
+              <w:rPr>
+                <w:rFonts w:ascii="Calibri" w:hAnsi="Calibri" w:eastAsia="PingFang SC"/>
+                <w:b w:val="0"/>
+                <w:color w:val="1F2937"/>
+                <w:sz w:val="14"/>
+              </w:rPr>
+              <w:t>source of the singular-control formula used in the manuscript, not a separate learning baseline</w:t>
+            </w:r>
+          </w:p>
+        </w:tc>
+      </w:tr>
+    </w:tbl>
+    <w:p>
+      <w:pPr>
+        <w:spacing w:after="80"/>
+      </w:pPr>
+    </w:p>
+    <w:p>
+      <w:r>
+        <w:br w:type="page"/>
+      </w:r>
+    </w:p>
+    <w:p>
+      <w:pPr>
+        <w:spacing w:after="120" w:line="264" w:lineRule="auto"/>
+      </w:pPr>
+      <w:r>
+        <w:rPr>
+          <w:rFonts w:ascii="Calibri" w:hAnsi="Calibri" w:eastAsia="PingFang SC"/>
+          <w:b w:val="0"/>
+          <w:color w:val="1F2937"/>
+          <w:sz w:val="21"/>
+        </w:rPr>
+        <w:t>Among these, [3] is the closest apples-to-apples numerical comparison. Here [3] refers to Gu, Xiong, and Chen, Pontryagin Optimal Control via Neural Networks (arXiv:2212.14566). Their Neural-PMP method contains two parts: learning a differentiable dynamics model from data, and then using a PMP-gradient update to optimize the control sequence. Since the dynamics are known in our manuscript setting, we compare against an oracle-dynamics version of the second part: forward state integration, backward costate recursion, and Hamiltonian-gradient updates of a discrete control sequence. This row should therefore be read as a controller-stage baseline following [3].</w:t>
       </w:r>
     </w:p>
     <w:tbl>

</xml_diff>

<commit_message>
Add first-layer u(t) benchmark report
</commit_message>
<xml_diff>
--- a/reports/ut_reproduction_report.docx
+++ b/reports/ut_reproduction_report.docx
@@ -13,7 +13,7 @@
           <w:color w:val="1F2937"/>
           <w:sz w:val="46"/>
         </w:rPr>
-        <w:t>Transformer u(t) Experiment Report</w:t>
+        <w:t>Transformer u(t) First-Layer Experiment Report</w:t>
       </w:r>
     </w:p>
     <w:p>
@@ -27,7 +27,7 @@
           <w:color w:val="52606D"/>
           <w:sz w:val="21"/>
         </w:rPr>
-        <w:t>Manuscript time-dependent control trained by PMP/KKT optimality gaps</w:t>
+        <w:t>Fixed-initial-condition time-dependent control trained by PMP/KKT optimality gaps</w:t>
       </w:r>
     </w:p>
     <w:p>
@@ -41,7 +41,7 @@
           <w:color w:val="1F2937"/>
           <w:sz w:val="21"/>
         </w:rPr>
-        <w:t>This report reproduces the manuscript's time-dependent Transformer control strategy u_theta(t): [0,T] -&gt; [0,u_max].</w:t>
+        <w:t>This report focuses on the manuscript's time-dependent control strategy u_theta(t): [0,T] -&gt; [0,u_max] for the fixed initial condition. The state-dependent feedback extension u(t,N) is not included here.</w:t>
       </w:r>
     </w:p>
     <w:p>
@@ -1072,7 +1072,7 @@
           <w:color w:val="2E74B5"/>
           <w:sz w:val="30"/>
         </w:rPr>
-        <w:t>4. Comparison With Related Work</w:t>
+        <w:t>4. First-Layer Benchmark and Related Work</w:t>
       </w:r>
     </w:p>
     <w:p>
@@ -1086,7 +1086,7 @@
           <w:color w:val="1F2937"/>
           <w:sz w:val="21"/>
         </w:rPr>
-        <w:t>The related work in the manuscript uses several different optimal-control formulations, so we first compare them at the level of the learned object and optimality condition before giving the numerical baseline.</w:t>
+        <w:t>For this first-layer experiment, all numerical comparisons keep the same fixed initial condition and compare time-dependent controls u(t). Several related-work papers in the manuscript target value-function or feedback formulations; those are important method references, but they are not the same numerical task as this u(t) reproduction.</w:t>
       </w:r>
     </w:p>
     <w:tbl>
@@ -1118,7 +1118,7 @@
                 <w:rFonts w:ascii="Calibri" w:hAnsi="Calibri" w:eastAsia="PingFang SC"/>
                 <w:b/>
                 <w:color w:val="1F2937"/>
-                <w:sz w:val="14"/>
+                <w:sz w:val="15"/>
               </w:rPr>
               <w:t>reference</w:t>
             </w:r>
@@ -1140,7 +1140,7 @@
                 <w:rFonts w:ascii="Calibri" w:hAnsi="Calibri" w:eastAsia="PingFang SC"/>
                 <w:b/>
                 <w:color w:val="1F2937"/>
-                <w:sz w:val="14"/>
+                <w:sz w:val="15"/>
               </w:rPr>
               <w:t>learned object / formulation</w:t>
             </w:r>
@@ -1162,7 +1162,7 @@
                 <w:rFonts w:ascii="Calibri" w:hAnsi="Calibri" w:eastAsia="PingFang SC"/>
                 <w:b/>
                 <w:color w:val="1F2937"/>
-                <w:sz w:val="14"/>
+                <w:sz w:val="15"/>
               </w:rPr>
               <w:t>relation to this report</w:t>
             </w:r>
@@ -1185,7 +1185,7 @@
                 <w:rFonts w:ascii="Calibri" w:hAnsi="Calibri" w:eastAsia="PingFang SC"/>
                 <w:b w:val="0"/>
                 <w:color w:val="1F2937"/>
-                <w:sz w:val="14"/>
+                <w:sz w:val="15"/>
               </w:rPr>
               <w:t>HJB / BSDE methods [1,2,7]</w:t>
             </w:r>
@@ -1206,7 +1206,7 @@
                 <w:rFonts w:ascii="Calibri" w:hAnsi="Calibri" w:eastAsia="PingFang SC"/>
                 <w:b w:val="0"/>
                 <w:color w:val="1F2937"/>
-                <w:sz w:val="14"/>
+                <w:sz w:val="15"/>
               </w:rPr>
               <w:t>value function V(t,N) or HJB PDE solution</w:t>
             </w:r>
@@ -1227,9 +1227,9 @@
                 <w:rFonts w:ascii="Calibri" w:hAnsi="Calibri" w:eastAsia="PingFang SC"/>
                 <w:b w:val="0"/>
                 <w:color w:val="1F2937"/>
-                <w:sz w:val="14"/>
+                <w:sz w:val="15"/>
               </w:rPr>
-              <w:t>full state-domain feedback problem; not directly comparable to the requested time-dependent u(t) reproduction</w:t>
+              <w:t>state-domain feedback/value formulation; not a direct u(t) baseline</w:t>
             </w:r>
           </w:p>
         </w:tc>
@@ -1250,7 +1250,7 @@
                 <w:rFonts w:ascii="Calibri" w:hAnsi="Calibri" w:eastAsia="PingFang SC"/>
                 <w:b w:val="0"/>
                 <w:color w:val="1F2937"/>
-                <w:sz w:val="14"/>
+                <w:sz w:val="15"/>
               </w:rPr>
               <w:t>Neural-PMP [3]</w:t>
             </w:r>
@@ -1271,7 +1271,7 @@
                 <w:rFonts w:ascii="Calibri" w:hAnsi="Calibri" w:eastAsia="PingFang SC"/>
                 <w:b w:val="0"/>
                 <w:color w:val="1F2937"/>
-                <w:sz w:val="14"/>
+                <w:sz w:val="15"/>
               </w:rPr>
               <w:t>control sequence via forward rollout, backward costate recursion, and Hamiltonian-gradient updates</w:t>
             </w:r>
@@ -1292,7 +1292,7 @@
                 <w:rFonts w:ascii="Calibri" w:hAnsi="Calibri" w:eastAsia="PingFang SC"/>
                 <w:b w:val="0"/>
                 <w:color w:val="1F2937"/>
-                <w:sz w:val="14"/>
+                <w:sz w:val="15"/>
               </w:rPr>
               <w:t>closest related-work baseline for the present u(t) experiment; implemented numerically below</w:t>
             </w:r>
@@ -1315,9 +1315,9 @@
                 <w:rFonts w:ascii="Calibri" w:hAnsi="Calibri" w:eastAsia="PingFang SC"/>
                 <w:b w:val="0"/>
                 <w:color w:val="1F2937"/>
-                <w:sz w:val="14"/>
+                <w:sz w:val="15"/>
               </w:rPr>
-              <w:t>DeepONet HJB policy iteration [5]</w:t>
+              <w:t>DeepONet / PINN policy iteration [5,6]</w:t>
             </w:r>
           </w:p>
         </w:tc>
@@ -1336,9 +1336,9 @@
                 <w:rFonts w:ascii="Calibri" w:hAnsi="Calibri" w:eastAsia="PingFang SC"/>
                 <w:b w:val="0"/>
                 <w:color w:val="1F2937"/>
-                <w:sz w:val="14"/>
+                <w:sz w:val="15"/>
               </w:rPr>
-              <w:t>operator for value-function / HJB policy-iteration solves</w:t>
+              <w:t>policy evaluation and improvement for HJB-type equations</w:t>
             </w:r>
           </w:p>
         </w:tc>
@@ -1357,9 +1357,9 @@
                 <w:rFonts w:ascii="Calibri" w:hAnsi="Calibri" w:eastAsia="PingFang SC"/>
                 <w:b w:val="0"/>
                 <w:color w:val="1F2937"/>
-                <w:sz w:val="14"/>
+                <w:sz w:val="15"/>
               </w:rPr>
-              <w:t>methodological reference for feedback/value-function learning; requires a different training problem</w:t>
+              <w:t>methodological reference for feedback/value learning; separate from this fixed-trajectory u(t) layer</w:t>
             </w:r>
           </w:p>
         </w:tc>
@@ -1380,72 +1380,7 @@
                 <w:rFonts w:ascii="Calibri" w:hAnsi="Calibri" w:eastAsia="PingFang SC"/>
                 <w:b w:val="0"/>
                 <w:color w:val="1F2937"/>
-                <w:sz w:val="14"/>
-              </w:rPr>
-              <w:t>PINN policy iteration [6]</w:t>
-            </w:r>
-          </w:p>
-        </w:tc>
-        <w:tc>
-          <w:tcPr>
-            <w:tcW w:type="dxa" w:w="3311"/>
-            <w:vAlign w:val="center"/>
-          </w:tcPr>
-          <w:p>
-            <w:pPr>
-              <w:spacing w:before="20" w:after="20" w:line="252" w:lineRule="auto"/>
-              <w:jc w:val="left"/>
-            </w:pPr>
-            <w:r>
-              <w:rPr>
-                <w:rFonts w:ascii="Calibri" w:hAnsi="Calibri" w:eastAsia="PingFang SC"/>
-                <w:b w:val="0"/>
-                <w:color w:val="1F2937"/>
-                <w:sz w:val="14"/>
-              </w:rPr>
-              <w:t>policy evaluation / improvement PDEs with neural networks</w:t>
-            </w:r>
-          </w:p>
-        </w:tc>
-        <w:tc>
-          <w:tcPr>
-            <w:tcW w:type="dxa" w:w="3744"/>
-            <w:vAlign w:val="center"/>
-          </w:tcPr>
-          <w:p>
-            <w:pPr>
-              <w:spacing w:before="20" w:after="20" w:line="252" w:lineRule="auto"/>
-              <w:jc w:val="center"/>
-            </w:pPr>
-            <w:r>
-              <w:rPr>
-                <w:rFonts w:ascii="Calibri" w:hAnsi="Calibri" w:eastAsia="PingFang SC"/>
-                <w:b w:val="0"/>
-                <w:color w:val="1F2937"/>
-                <w:sz w:val="14"/>
-              </w:rPr>
-              <w:t>feedback/value-function route, not the same objective as trajectory-level u(t) PMP/KKT loss</w:t>
-            </w:r>
-          </w:p>
-        </w:tc>
-      </w:tr>
-      <w:tr>
-        <w:tc>
-          <w:tcPr>
-            <w:tcW w:type="dxa" w:w="2232"/>
-            <w:vAlign w:val="center"/>
-          </w:tcPr>
-          <w:p>
-            <w:pPr>
-              <w:spacing w:before="20" w:after="20" w:line="252" w:lineRule="auto"/>
-              <w:jc w:val="left"/>
-            </w:pPr>
-            <w:r>
-              <w:rPr>
-                <w:rFonts w:ascii="Calibri" w:hAnsi="Calibri" w:eastAsia="PingFang SC"/>
-                <w:b w:val="0"/>
-                <w:color w:val="1F2937"/>
-                <w:sz w:val="14"/>
+                <w:sz w:val="15"/>
               </w:rPr>
               <w:t>classical chemotherapy OC [4]</w:t>
             </w:r>
@@ -1466,9 +1401,9 @@
                 <w:rFonts w:ascii="Calibri" w:hAnsi="Calibri" w:eastAsia="PingFang SC"/>
                 <w:b w:val="0"/>
                 <w:color w:val="1F2937"/>
-                <w:sz w:val="14"/>
+                <w:sz w:val="15"/>
               </w:rPr>
-              <w:t>PMP and singular-control structure for heterogeneous population model</w:t>
+              <w:t>PMP and singular-control structure</w:t>
             </w:r>
           </w:p>
         </w:tc>
@@ -1487,9 +1422,9 @@
                 <w:rFonts w:ascii="Calibri" w:hAnsi="Calibri" w:eastAsia="PingFang SC"/>
                 <w:b w:val="0"/>
                 <w:color w:val="1F2937"/>
-                <w:sz w:val="14"/>
+                <w:sz w:val="15"/>
               </w:rPr>
-              <w:t>source of the singular-control formula used in the manuscript, not a separate learning baseline</w:t>
+              <w:t>source of the singular-control condition used in the manuscript</w:t>
             </w:r>
           </w:p>
         </w:tc>
@@ -1516,7 +1451,7 @@
           <w:color w:val="1F2937"/>
           <w:sz w:val="21"/>
         </w:rPr>
-        <w:t>Among these, [3] is the closest apples-to-apples numerical comparison. Here [3] refers to Gu, Xiong, and Chen, Pontryagin Optimal Control via Neural Networks (arXiv:2212.14566). Their Neural-PMP method contains two parts: learning a differentiable dynamics model from data, and then using a PMP-gradient update to optimize the control sequence. Since the dynamics are known in our manuscript setting, we compare against an oracle-dynamics version of the second part: forward state integration, backward costate recursion, and Hamiltonian-gradient updates of a discrete control sequence. This row should therefore be read as a controller-stage baseline following [3].</w:t>
+        <w:t>Among these, [3] is the closest apples-to-apples numerical comparison. Here [3] refers to Gu, Xiong, and Chen, Pontryagin Optimal Control via Neural Networks (arXiv:2212.14566). Their Neural-PMP method first learns a differentiable dynamics model and then updates a control sequence using PMP gradients. Since the dynamics are already known in the manuscript setting, we compare against the oracle-dynamics controller stage: forward state integration, backward costate recursion, and Hamiltonian-gradient updates of a discrete control sequence.</w:t>
       </w:r>
     </w:p>
     <w:tbl>
@@ -1527,16 +1462,17 @@
         <w:tblLook w:firstColumn="1" w:firstRow="1" w:lastColumn="0" w:lastRow="0" w:noHBand="0" w:noVBand="1" w:val="04A0"/>
       </w:tblPr>
       <w:tblGrid>
-        <w:gridCol w:w="1987"/>
-        <w:gridCol w:w="1987"/>
-        <w:gridCol w:w="1987"/>
-        <w:gridCol w:w="1987"/>
-        <w:gridCol w:w="1987"/>
+        <w:gridCol w:w="1656"/>
+        <w:gridCol w:w="1656"/>
+        <w:gridCol w:w="1656"/>
+        <w:gridCol w:w="1656"/>
+        <w:gridCol w:w="1656"/>
+        <w:gridCol w:w="1656"/>
       </w:tblGrid>
       <w:tr>
         <w:tc>
           <w:tcPr>
-            <w:tcW w:type="dxa" w:w="1944"/>
+            <w:tcW w:type="dxa" w:w="1872"/>
             <w:shd w:fill="F2F4F7"/>
             <w:vAlign w:val="center"/>
           </w:tcPr>
@@ -1550,7 +1486,7 @@
                 <w:rFonts w:ascii="Calibri" w:hAnsi="Calibri" w:eastAsia="PingFang SC"/>
                 <w:b/>
                 <w:color w:val="1F2937"/>
-                <w:sz w:val="16"/>
+                <w:sz w:val="14"/>
               </w:rPr>
               <w:t>method</w:t>
             </w:r>
@@ -1558,7 +1494,7 @@
         </w:tc>
         <w:tc>
           <w:tcPr>
-            <w:tcW w:type="dxa" w:w="3311"/>
+            <w:tcW w:type="dxa" w:w="2808"/>
             <w:shd w:fill="F2F4F7"/>
             <w:vAlign w:val="center"/>
           </w:tcPr>
@@ -1572,15 +1508,15 @@
                 <w:rFonts w:ascii="Calibri" w:hAnsi="Calibri" w:eastAsia="PingFang SC"/>
                 <w:b/>
                 <w:color w:val="1F2937"/>
-                <w:sz w:val="16"/>
+                <w:sz w:val="14"/>
               </w:rPr>
-              <w:t>control update / training criterion</w:t>
+              <w:t>training / update criterion</w:t>
             </w:r>
           </w:p>
         </w:tc>
         <w:tc>
           <w:tcPr>
-            <w:tcW w:type="dxa" w:w="1224"/>
+            <w:tcW w:type="dxa" w:w="1152"/>
             <w:shd w:fill="F2F4F7"/>
             <w:vAlign w:val="center"/>
           </w:tcPr>
@@ -1594,15 +1530,15 @@
                 <w:rFonts w:ascii="Calibri" w:hAnsi="Calibri" w:eastAsia="PingFang SC"/>
                 <w:b/>
                 <w:color w:val="1F2937"/>
-                <w:sz w:val="16"/>
+                <w:sz w:val="14"/>
               </w:rPr>
-              <w:t>PMP/KKT gap</w:t>
+              <w:t>objective J</w:t>
             </w:r>
           </w:p>
         </w:tc>
         <w:tc>
           <w:tcPr>
-            <w:tcW w:type="dxa" w:w="1224"/>
+            <w:tcW w:type="dxa" w:w="1152"/>
             <w:shd w:fill="F2F4F7"/>
             <w:vAlign w:val="center"/>
           </w:tcPr>
@@ -1616,15 +1552,15 @@
                 <w:rFonts w:ascii="Calibri" w:hAnsi="Calibri" w:eastAsia="PingFang SC"/>
                 <w:b/>
                 <w:color w:val="1F2937"/>
-                <w:sz w:val="16"/>
+                <w:sz w:val="14"/>
               </w:rPr>
-              <w:t>objective J*</w:t>
+              <w:t>J - direct</w:t>
             </w:r>
           </w:p>
         </w:tc>
         <w:tc>
           <w:tcPr>
-            <w:tcW w:type="dxa" w:w="1655"/>
+            <w:tcW w:type="dxa" w:w="1152"/>
             <w:shd w:fill="F2F4F7"/>
             <w:vAlign w:val="center"/>
           </w:tcPr>
@@ -1638,7 +1574,29 @@
                 <w:rFonts w:ascii="Calibri" w:hAnsi="Calibri" w:eastAsia="PingFang SC"/>
                 <w:b/>
                 <w:color w:val="1F2937"/>
-                <w:sz w:val="16"/>
+                <w:sz w:val="14"/>
+              </w:rPr>
+              <w:t>PMP/KKT gap</w:t>
+            </w:r>
+          </w:p>
+        </w:tc>
+        <w:tc>
+          <w:tcPr>
+            <w:tcW w:type="dxa" w:w="1440"/>
+            <w:shd w:fill="F2F4F7"/>
+            <w:vAlign w:val="center"/>
+          </w:tcPr>
+          <w:p>
+            <w:pPr>
+              <w:spacing w:before="20" w:after="20" w:line="252" w:lineRule="auto"/>
+              <w:jc w:val="center"/>
+            </w:pPr>
+            <w:r>
+              <w:rPr>
+                <w:rFonts w:ascii="Calibri" w:hAnsi="Calibri" w:eastAsia="PingFang SC"/>
+                <w:b/>
+                <w:color w:val="1F2937"/>
+                <w:sz w:val="14"/>
               </w:rPr>
               <w:t>note</w:t>
             </w:r>
@@ -1648,7 +1606,7 @@
       <w:tr>
         <w:tc>
           <w:tcPr>
-            <w:tcW w:type="dxa" w:w="1944"/>
+            <w:tcW w:type="dxa" w:w="1872"/>
             <w:vAlign w:val="center"/>
           </w:tcPr>
           <w:p>
@@ -1661,15 +1619,15 @@
                 <w:rFonts w:ascii="Calibri" w:hAnsi="Calibri" w:eastAsia="PingFang SC"/>
                 <w:b w:val="0"/>
                 <w:color w:val="1F2937"/>
-                <w:sz w:val="16"/>
+                <w:sz w:val="14"/>
               </w:rPr>
-              <w:t>Transformer u(t)</w:t>
+              <w:t>direct grid reference</w:t>
             </w:r>
           </w:p>
         </w:tc>
         <w:tc>
           <w:tcPr>
-            <w:tcW w:type="dxa" w:w="3311"/>
+            <w:tcW w:type="dxa" w:w="2808"/>
             <w:vAlign w:val="center"/>
           </w:tcPr>
           <w:p>
@@ -1682,15 +1640,15 @@
                 <w:rFonts w:ascii="Calibri" w:hAnsi="Calibri" w:eastAsia="PingFang SC"/>
                 <w:b w:val="0"/>
                 <w:color w:val="1F2937"/>
-                <w:sz w:val="16"/>
+                <w:sz w:val="14"/>
               </w:rPr>
-              <w:t>paper PMP/KKT optimality-gap loss</w:t>
+              <w:t>direct minimization of discretized J</w:t>
             </w:r>
           </w:p>
         </w:tc>
         <w:tc>
           <w:tcPr>
-            <w:tcW w:type="dxa" w:w="1224"/>
+            <w:tcW w:type="dxa" w:w="1152"/>
             <w:vAlign w:val="center"/>
           </w:tcPr>
           <w:p>
@@ -1703,15 +1661,15 @@
                 <w:rFonts w:ascii="Calibri" w:hAnsi="Calibri" w:eastAsia="PingFang SC"/>
                 <w:b w:val="0"/>
                 <w:color w:val="1F2937"/>
-                <w:sz w:val="16"/>
+                <w:sz w:val="14"/>
               </w:rPr>
-              <w:t>0.0523</w:t>
+              <w:t>386.438</w:t>
             </w:r>
           </w:p>
         </w:tc>
         <w:tc>
           <w:tcPr>
-            <w:tcW w:type="dxa" w:w="1224"/>
+            <w:tcW w:type="dxa" w:w="1152"/>
             <w:vAlign w:val="center"/>
           </w:tcPr>
           <w:p>
@@ -1724,15 +1682,15 @@
                 <w:rFonts w:ascii="Calibri" w:hAnsi="Calibri" w:eastAsia="PingFang SC"/>
                 <w:b w:val="0"/>
                 <w:color w:val="1F2937"/>
-                <w:sz w:val="16"/>
+                <w:sz w:val="14"/>
               </w:rPr>
-              <w:t>386.70</w:t>
+              <w:t>0.000</w:t>
             </w:r>
           </w:p>
         </w:tc>
         <w:tc>
           <w:tcPr>
-            <w:tcW w:type="dxa" w:w="1655"/>
+            <w:tcW w:type="dxa" w:w="1152"/>
             <w:vAlign w:val="center"/>
           </w:tcPr>
           <w:p>
@@ -1745,9 +1703,30 @@
                 <w:rFonts w:ascii="Calibri" w:hAnsi="Calibri" w:eastAsia="PingFang SC"/>
                 <w:b w:val="0"/>
                 <w:color w:val="1F2937"/>
-                <w:sz w:val="16"/>
+                <w:sz w:val="14"/>
               </w:rPr>
-              <w:t>main u(t) reproduction</w:t>
+              <w:t>1.016</w:t>
+            </w:r>
+          </w:p>
+        </w:tc>
+        <w:tc>
+          <w:tcPr>
+            <w:tcW w:type="dxa" w:w="1440"/>
+            <w:vAlign w:val="center"/>
+          </w:tcPr>
+          <w:p>
+            <w:pPr>
+              <w:spacing w:before="20" w:after="20" w:line="252" w:lineRule="auto"/>
+              <w:jc w:val="center"/>
+            </w:pPr>
+            <w:r>
+              <w:rPr>
+                <w:rFonts w:ascii="Calibri" w:hAnsi="Calibri" w:eastAsia="PingFang SC"/>
+                <w:b w:val="0"/>
+                <w:color w:val="1F2937"/>
+                <w:sz w:val="14"/>
+              </w:rPr>
+              <w:t>cost reference</w:t>
             </w:r>
           </w:p>
         </w:tc>
@@ -1755,7 +1734,7 @@
       <w:tr>
         <w:tc>
           <w:tcPr>
-            <w:tcW w:type="dxa" w:w="1944"/>
+            <w:tcW w:type="dxa" w:w="1872"/>
             <w:vAlign w:val="center"/>
           </w:tcPr>
           <w:p>
@@ -1768,15 +1747,15 @@
                 <w:rFonts w:ascii="Calibri" w:hAnsi="Calibri" w:eastAsia="PingFang SC"/>
                 <w:b w:val="0"/>
                 <w:color w:val="1F2937"/>
-                <w:sz w:val="16"/>
+                <w:sz w:val="14"/>
               </w:rPr>
-              <w:t>Neural-PMP controller-stage [3]</w:t>
+              <w:t>Transformer u(t), 6 runs</w:t>
             </w:r>
           </w:p>
         </w:tc>
         <w:tc>
           <w:tcPr>
-            <w:tcW w:type="dxa" w:w="3311"/>
+            <w:tcW w:type="dxa" w:w="2808"/>
             <w:vAlign w:val="center"/>
           </w:tcPr>
           <w:p>
@@ -1789,15 +1768,15 @@
                 <w:rFonts w:ascii="Calibri" w:hAnsi="Calibri" w:eastAsia="PingFang SC"/>
                 <w:b w:val="0"/>
                 <w:color w:val="1F2937"/>
-                <w:sz w:val="16"/>
+                <w:sz w:val="14"/>
               </w:rPr>
-              <w:t>Hamiltonian-gradient update with known dynamics</w:t>
+              <w:t>paper PMP/KKT optimality-gap loss</w:t>
             </w:r>
           </w:p>
         </w:tc>
         <w:tc>
           <w:tcPr>
-            <w:tcW w:type="dxa" w:w="1224"/>
+            <w:tcW w:type="dxa" w:w="1152"/>
             <w:vAlign w:val="center"/>
           </w:tcPr>
           <w:p>
@@ -1810,15 +1789,15 @@
                 <w:rFonts w:ascii="Calibri" w:hAnsi="Calibri" w:eastAsia="PingFang SC"/>
                 <w:b w:val="0"/>
                 <w:color w:val="1F2937"/>
-                <w:sz w:val="16"/>
+                <w:sz w:val="14"/>
               </w:rPr>
-              <w:t>7.47</w:t>
+              <w:t>386.738 +/- 0.045</w:t>
             </w:r>
           </w:p>
         </w:tc>
         <w:tc>
           <w:tcPr>
-            <w:tcW w:type="dxa" w:w="1224"/>
+            <w:tcW w:type="dxa" w:w="1152"/>
             <w:vAlign w:val="center"/>
           </w:tcPr>
           <w:p>
@@ -1831,15 +1810,15 @@
                 <w:rFonts w:ascii="Calibri" w:hAnsi="Calibri" w:eastAsia="PingFang SC"/>
                 <w:b w:val="0"/>
                 <w:color w:val="1F2937"/>
-                <w:sz w:val="16"/>
+                <w:sz w:val="14"/>
               </w:rPr>
-              <w:t>387.02</w:t>
+              <w:t>0.300 +/- 0.045</w:t>
             </w:r>
           </w:p>
         </w:tc>
         <w:tc>
           <w:tcPr>
-            <w:tcW w:type="dxa" w:w="1655"/>
+            <w:tcW w:type="dxa" w:w="1152"/>
             <w:vAlign w:val="center"/>
           </w:tcPr>
           <w:p>
@@ -1852,9 +1831,30 @@
                 <w:rFonts w:ascii="Calibri" w:hAnsi="Calibri" w:eastAsia="PingFang SC"/>
                 <w:b w:val="0"/>
                 <w:color w:val="1F2937"/>
-                <w:sz w:val="16"/>
+                <w:sz w:val="14"/>
               </w:rPr>
-              <w:t>related-work comparison</w:t>
+              <w:t>0.463 +/- 0.148</w:t>
+            </w:r>
+          </w:p>
+        </w:tc>
+        <w:tc>
+          <w:tcPr>
+            <w:tcW w:type="dxa" w:w="1440"/>
+            <w:vAlign w:val="center"/>
+          </w:tcPr>
+          <w:p>
+            <w:pPr>
+              <w:spacing w:before="20" w:after="20" w:line="252" w:lineRule="auto"/>
+              <w:jc w:val="center"/>
+            </w:pPr>
+            <w:r>
+              <w:rPr>
+                <w:rFonts w:ascii="Calibri" w:hAnsi="Calibri" w:eastAsia="PingFang SC"/>
+                <w:b w:val="0"/>
+                <w:color w:val="1F2937"/>
+                <w:sz w:val="14"/>
+              </w:rPr>
+              <w:t>main reproduction</w:t>
             </w:r>
           </w:p>
         </w:tc>
@@ -1862,7 +1862,7 @@
       <w:tr>
         <w:tc>
           <w:tcPr>
-            <w:tcW w:type="dxa" w:w="1944"/>
+            <w:tcW w:type="dxa" w:w="1872"/>
             <w:vAlign w:val="center"/>
           </w:tcPr>
           <w:p>
@@ -1875,15 +1875,15 @@
                 <w:rFonts w:ascii="Calibri" w:hAnsi="Calibri" w:eastAsia="PingFang SC"/>
                 <w:b w:val="0"/>
                 <w:color w:val="1F2937"/>
-                <w:sz w:val="16"/>
+                <w:sz w:val="14"/>
               </w:rPr>
-              <w:t>direct grid cost</w:t>
+              <w:t>best Transformer run</w:t>
             </w:r>
           </w:p>
         </w:tc>
         <w:tc>
           <w:tcPr>
-            <w:tcW w:type="dxa" w:w="3311"/>
+            <w:tcW w:type="dxa" w:w="2808"/>
             <w:vAlign w:val="center"/>
           </w:tcPr>
           <w:p>
@@ -1896,15 +1896,15 @@
                 <w:rFonts w:ascii="Calibri" w:hAnsi="Calibri" w:eastAsia="PingFang SC"/>
                 <w:b w:val="0"/>
                 <w:color w:val="1F2937"/>
-                <w:sz w:val="16"/>
+                <w:sz w:val="14"/>
               </w:rPr>
-              <w:t>minimize discretized J</w:t>
+              <w:t>same as above</w:t>
             </w:r>
           </w:p>
         </w:tc>
         <w:tc>
           <w:tcPr>
-            <w:tcW w:type="dxa" w:w="1224"/>
+            <w:tcW w:type="dxa" w:w="1152"/>
             <w:vAlign w:val="center"/>
           </w:tcPr>
           <w:p>
@@ -1917,15 +1917,15 @@
                 <w:rFonts w:ascii="Calibri" w:hAnsi="Calibri" w:eastAsia="PingFang SC"/>
                 <w:b w:val="0"/>
                 <w:color w:val="1F2937"/>
-                <w:sz w:val="16"/>
+                <w:sz w:val="14"/>
               </w:rPr>
-              <w:t>0.805</w:t>
+              <w:t>386.695</w:t>
             </w:r>
           </w:p>
         </w:tc>
         <w:tc>
           <w:tcPr>
-            <w:tcW w:type="dxa" w:w="1224"/>
+            <w:tcW w:type="dxa" w:w="1152"/>
             <w:vAlign w:val="center"/>
           </w:tcPr>
           <w:p>
@@ -1938,15 +1938,15 @@
                 <w:rFonts w:ascii="Calibri" w:hAnsi="Calibri" w:eastAsia="PingFang SC"/>
                 <w:b w:val="0"/>
                 <w:color w:val="1F2937"/>
-                <w:sz w:val="16"/>
+                <w:sz w:val="14"/>
               </w:rPr>
-              <w:t>386.47</w:t>
+              <w:t>0.257</w:t>
             </w:r>
           </w:p>
         </w:tc>
         <w:tc>
           <w:tcPr>
-            <w:tcW w:type="dxa" w:w="1655"/>
+            <w:tcW w:type="dxa" w:w="1152"/>
             <w:vAlign w:val="center"/>
           </w:tcPr>
           <w:p>
@@ -1959,9 +1959,30 @@
                 <w:rFonts w:ascii="Calibri" w:hAnsi="Calibri" w:eastAsia="PingFang SC"/>
                 <w:b w:val="0"/>
                 <w:color w:val="1F2937"/>
-                <w:sz w:val="16"/>
+                <w:sz w:val="14"/>
               </w:rPr>
-              <w:t>reference only</w:t>
+              <w:t>0.207</w:t>
+            </w:r>
+          </w:p>
+        </w:tc>
+        <w:tc>
+          <w:tcPr>
+            <w:tcW w:type="dxa" w:w="1440"/>
+            <w:vAlign w:val="center"/>
+          </w:tcPr>
+          <w:p>
+            <w:pPr>
+              <w:spacing w:before="20" w:after="20" w:line="252" w:lineRule="auto"/>
+              <w:jc w:val="center"/>
+            </w:pPr>
+            <w:r>
+              <w:rPr>
+                <w:rFonts w:ascii="Calibri" w:hAnsi="Calibri" w:eastAsia="PingFang SC"/>
+                <w:b w:val="0"/>
+                <w:color w:val="1F2937"/>
+                <w:sz w:val="14"/>
+              </w:rPr>
+              <w:t>best reported run</w:t>
             </w:r>
           </w:p>
         </w:tc>
@@ -1969,7 +1990,7 @@
       <w:tr>
         <w:tc>
           <w:tcPr>
-            <w:tcW w:type="dxa" w:w="1944"/>
+            <w:tcW w:type="dxa" w:w="1872"/>
             <w:vAlign w:val="center"/>
           </w:tcPr>
           <w:p>
@@ -1982,15 +2003,15 @@
                 <w:rFonts w:ascii="Calibri" w:hAnsi="Calibri" w:eastAsia="PingFang SC"/>
                 <w:b w:val="0"/>
                 <w:color w:val="1F2937"/>
-                <w:sz w:val="16"/>
+                <w:sz w:val="14"/>
               </w:rPr>
-              <w:t>constant u=1.5</w:t>
+              <w:t>Neural-PMP [3]</w:t>
             </w:r>
           </w:p>
         </w:tc>
         <w:tc>
           <w:tcPr>
-            <w:tcW w:type="dxa" w:w="3311"/>
+            <w:tcW w:type="dxa" w:w="2808"/>
             <w:vAlign w:val="center"/>
           </w:tcPr>
           <w:p>
@@ -2003,15 +2024,15 @@
                 <w:rFonts w:ascii="Calibri" w:hAnsi="Calibri" w:eastAsia="PingFang SC"/>
                 <w:b w:val="0"/>
                 <w:color w:val="1F2937"/>
-                <w:sz w:val="16"/>
+                <w:sz w:val="14"/>
               </w:rPr>
-              <w:t>fixed control</w:t>
+              <w:t>Hamiltonian-gradient update with known dynamics</w:t>
             </w:r>
           </w:p>
         </w:tc>
         <w:tc>
           <w:tcPr>
-            <w:tcW w:type="dxa" w:w="1224"/>
+            <w:tcW w:type="dxa" w:w="1152"/>
             <w:vAlign w:val="center"/>
           </w:tcPr>
           <w:p>
@@ -2024,15 +2045,15 @@
                 <w:rFonts w:ascii="Calibri" w:hAnsi="Calibri" w:eastAsia="PingFang SC"/>
                 <w:b w:val="0"/>
                 <w:color w:val="1F2937"/>
-                <w:sz w:val="16"/>
+                <w:sz w:val="14"/>
               </w:rPr>
-              <w:t>76.89</w:t>
+              <w:t>386.986</w:t>
             </w:r>
           </w:p>
         </w:tc>
         <w:tc>
           <w:tcPr>
-            <w:tcW w:type="dxa" w:w="1224"/>
+            <w:tcW w:type="dxa" w:w="1152"/>
             <w:vAlign w:val="center"/>
           </w:tcPr>
           <w:p>
@@ -2045,15 +2066,15 @@
                 <w:rFonts w:ascii="Calibri" w:hAnsi="Calibri" w:eastAsia="PingFang SC"/>
                 <w:b w:val="0"/>
                 <w:color w:val="1F2937"/>
-                <w:sz w:val="16"/>
+                <w:sz w:val="14"/>
               </w:rPr>
-              <w:t>400.40</w:t>
+              <w:t>0.548</w:t>
             </w:r>
           </w:p>
         </w:tc>
         <w:tc>
           <w:tcPr>
-            <w:tcW w:type="dxa" w:w="1655"/>
+            <w:tcW w:type="dxa" w:w="1152"/>
             <w:vAlign w:val="center"/>
           </w:tcPr>
           <w:p>
@@ -2066,9 +2087,286 @@
                 <w:rFonts w:ascii="Calibri" w:hAnsi="Calibri" w:eastAsia="PingFang SC"/>
                 <w:b w:val="0"/>
                 <w:color w:val="1F2937"/>
-                <w:sz w:val="16"/>
+                <w:sz w:val="14"/>
+              </w:rPr>
+              <w:t>8.574</w:t>
+            </w:r>
+          </w:p>
+        </w:tc>
+        <w:tc>
+          <w:tcPr>
+            <w:tcW w:type="dxa" w:w="1440"/>
+            <w:vAlign w:val="center"/>
+          </w:tcPr>
+          <w:p>
+            <w:pPr>
+              <w:spacing w:before="20" w:after="20" w:line="252" w:lineRule="auto"/>
+              <w:jc w:val="center"/>
+            </w:pPr>
+            <w:r>
+              <w:rPr>
+                <w:rFonts w:ascii="Calibri" w:hAnsi="Calibri" w:eastAsia="PingFang SC"/>
+                <w:b w:val="0"/>
+                <w:color w:val="1F2937"/>
+                <w:sz w:val="14"/>
+              </w:rPr>
+              <w:t>related-work baseline</w:t>
+            </w:r>
+          </w:p>
+        </w:tc>
+      </w:tr>
+      <w:tr>
+        <w:tc>
+          <w:tcPr>
+            <w:tcW w:type="dxa" w:w="1872"/>
+            <w:vAlign w:val="center"/>
+          </w:tcPr>
+          <w:p>
+            <w:pPr>
+              <w:spacing w:before="20" w:after="20" w:line="252" w:lineRule="auto"/>
+              <w:jc w:val="left"/>
+            </w:pPr>
+            <w:r>
+              <w:rPr>
+                <w:rFonts w:ascii="Calibri" w:hAnsi="Calibri" w:eastAsia="PingFang SC"/>
+                <w:b w:val="0"/>
+                <w:color w:val="1F2937"/>
+                <w:sz w:val="14"/>
+              </w:rPr>
+              <w:t>constant u=1.5</w:t>
+            </w:r>
+          </w:p>
+        </w:tc>
+        <w:tc>
+          <w:tcPr>
+            <w:tcW w:type="dxa" w:w="2808"/>
+            <w:vAlign w:val="center"/>
+          </w:tcPr>
+          <w:p>
+            <w:pPr>
+              <w:spacing w:before="20" w:after="20" w:line="252" w:lineRule="auto"/>
+              <w:jc w:val="left"/>
+            </w:pPr>
+            <w:r>
+              <w:rPr>
+                <w:rFonts w:ascii="Calibri" w:hAnsi="Calibri" w:eastAsia="PingFang SC"/>
+                <w:b w:val="0"/>
+                <w:color w:val="1F2937"/>
+                <w:sz w:val="14"/>
+              </w:rPr>
+              <w:t>fixed control</w:t>
+            </w:r>
+          </w:p>
+        </w:tc>
+        <w:tc>
+          <w:tcPr>
+            <w:tcW w:type="dxa" w:w="1152"/>
+            <w:vAlign w:val="center"/>
+          </w:tcPr>
+          <w:p>
+            <w:pPr>
+              <w:spacing w:before="20" w:after="20" w:line="252" w:lineRule="auto"/>
+              <w:jc w:val="center"/>
+            </w:pPr>
+            <w:r>
+              <w:rPr>
+                <w:rFonts w:ascii="Calibri" w:hAnsi="Calibri" w:eastAsia="PingFang SC"/>
+                <w:b w:val="0"/>
+                <w:color w:val="1F2937"/>
+                <w:sz w:val="14"/>
+              </w:rPr>
+              <w:t>400.403</w:t>
+            </w:r>
+          </w:p>
+        </w:tc>
+        <w:tc>
+          <w:tcPr>
+            <w:tcW w:type="dxa" w:w="1152"/>
+            <w:vAlign w:val="center"/>
+          </w:tcPr>
+          <w:p>
+            <w:pPr>
+              <w:spacing w:before="20" w:after="20" w:line="252" w:lineRule="auto"/>
+              <w:jc w:val="center"/>
+            </w:pPr>
+            <w:r>
+              <w:rPr>
+                <w:rFonts w:ascii="Calibri" w:hAnsi="Calibri" w:eastAsia="PingFang SC"/>
+                <w:b w:val="0"/>
+                <w:color w:val="1F2937"/>
+                <w:sz w:val="14"/>
+              </w:rPr>
+              <w:t>13.965</w:t>
+            </w:r>
+          </w:p>
+        </w:tc>
+        <w:tc>
+          <w:tcPr>
+            <w:tcW w:type="dxa" w:w="1152"/>
+            <w:vAlign w:val="center"/>
+          </w:tcPr>
+          <w:p>
+            <w:pPr>
+              <w:spacing w:before="20" w:after="20" w:line="252" w:lineRule="auto"/>
+              <w:jc w:val="center"/>
+            </w:pPr>
+            <w:r>
+              <w:rPr>
+                <w:rFonts w:ascii="Calibri" w:hAnsi="Calibri" w:eastAsia="PingFang SC"/>
+                <w:b w:val="0"/>
+                <w:color w:val="1F2937"/>
+                <w:sz w:val="14"/>
+              </w:rPr>
+              <w:t>76.556</w:t>
+            </w:r>
+          </w:p>
+        </w:tc>
+        <w:tc>
+          <w:tcPr>
+            <w:tcW w:type="dxa" w:w="1440"/>
+            <w:vAlign w:val="center"/>
+          </w:tcPr>
+          <w:p>
+            <w:pPr>
+              <w:spacing w:before="20" w:after="20" w:line="252" w:lineRule="auto"/>
+              <w:jc w:val="center"/>
+            </w:pPr>
+            <w:r>
+              <w:rPr>
+                <w:rFonts w:ascii="Calibri" w:hAnsi="Calibri" w:eastAsia="PingFang SC"/>
+                <w:b w:val="0"/>
+                <w:color w:val="1F2937"/>
+                <w:sz w:val="14"/>
               </w:rPr>
               <w:t>scale check</w:t>
+            </w:r>
+          </w:p>
+        </w:tc>
+      </w:tr>
+      <w:tr>
+        <w:tc>
+          <w:tcPr>
+            <w:tcW w:type="dxa" w:w="1872"/>
+            <w:vAlign w:val="center"/>
+          </w:tcPr>
+          <w:p>
+            <w:pPr>
+              <w:spacing w:before="20" w:after="20" w:line="252" w:lineRule="auto"/>
+              <w:jc w:val="left"/>
+            </w:pPr>
+            <w:r>
+              <w:rPr>
+                <w:rFonts w:ascii="Calibri" w:hAnsi="Calibri" w:eastAsia="PingFang SC"/>
+                <w:b w:val="0"/>
+                <w:color w:val="1F2937"/>
+                <w:sz w:val="14"/>
+              </w:rPr>
+              <w:t>repository demo output</w:t>
+            </w:r>
+          </w:p>
+        </w:tc>
+        <w:tc>
+          <w:tcPr>
+            <w:tcW w:type="dxa" w:w="2808"/>
+            <w:vAlign w:val="center"/>
+          </w:tcPr>
+          <w:p>
+            <w:pPr>
+              <w:spacing w:before="20" w:after="20" w:line="252" w:lineRule="auto"/>
+              <w:jc w:val="left"/>
+            </w:pPr>
+            <w:r>
+              <w:rPr>
+                <w:rFonts w:ascii="Calibri" w:hAnsi="Calibri" w:eastAsia="PingFang SC"/>
+                <w:b w:val="0"/>
+                <w:color w:val="1F2937"/>
+                <w:sz w:val="14"/>
+              </w:rPr>
+              <w:t>provided s.csv</w:t>
+            </w:r>
+          </w:p>
+        </w:tc>
+        <w:tc>
+          <w:tcPr>
+            <w:tcW w:type="dxa" w:w="1152"/>
+            <w:vAlign w:val="center"/>
+          </w:tcPr>
+          <w:p>
+            <w:pPr>
+              <w:spacing w:before="20" w:after="20" w:line="252" w:lineRule="auto"/>
+              <w:jc w:val="center"/>
+            </w:pPr>
+            <w:r>
+              <w:rPr>
+                <w:rFonts w:ascii="Calibri" w:hAnsi="Calibri" w:eastAsia="PingFang SC"/>
+                <w:b w:val="0"/>
+                <w:color w:val="1F2937"/>
+                <w:sz w:val="14"/>
+              </w:rPr>
+              <w:t>422.670</w:t>
+            </w:r>
+          </w:p>
+        </w:tc>
+        <w:tc>
+          <w:tcPr>
+            <w:tcW w:type="dxa" w:w="1152"/>
+            <w:vAlign w:val="center"/>
+          </w:tcPr>
+          <w:p>
+            <w:pPr>
+              <w:spacing w:before="20" w:after="20" w:line="252" w:lineRule="auto"/>
+              <w:jc w:val="center"/>
+            </w:pPr>
+            <w:r>
+              <w:rPr>
+                <w:rFonts w:ascii="Calibri" w:hAnsi="Calibri" w:eastAsia="PingFang SC"/>
+                <w:b w:val="0"/>
+                <w:color w:val="1F2937"/>
+                <w:sz w:val="14"/>
+              </w:rPr>
+              <w:t>36.232</w:t>
+            </w:r>
+          </w:p>
+        </w:tc>
+        <w:tc>
+          <w:tcPr>
+            <w:tcW w:type="dxa" w:w="1152"/>
+            <w:vAlign w:val="center"/>
+          </w:tcPr>
+          <w:p>
+            <w:pPr>
+              <w:spacing w:before="20" w:after="20" w:line="252" w:lineRule="auto"/>
+              <w:jc w:val="center"/>
+            </w:pPr>
+            <w:r>
+              <w:rPr>
+                <w:rFonts w:ascii="Calibri" w:hAnsi="Calibri" w:eastAsia="PingFang SC"/>
+                <w:b w:val="0"/>
+                <w:color w:val="1F2937"/>
+                <w:sz w:val="14"/>
+              </w:rPr>
+              <w:t>433.349</w:t>
+            </w:r>
+          </w:p>
+        </w:tc>
+        <w:tc>
+          <w:tcPr>
+            <w:tcW w:type="dxa" w:w="1440"/>
+            <w:vAlign w:val="center"/>
+          </w:tcPr>
+          <w:p>
+            <w:pPr>
+              <w:spacing w:before="20" w:after="20" w:line="252" w:lineRule="auto"/>
+              <w:jc w:val="center"/>
+            </w:pPr>
+            <w:r>
+              <w:rPr>
+                <w:rFonts w:ascii="Calibri" w:hAnsi="Calibri" w:eastAsia="PingFang SC"/>
+                <w:b w:val="0"/>
+                <w:color w:val="1F2937"/>
+                <w:sz w:val="14"/>
+              </w:rPr>
+              <w:t>original demo artifact</w:t>
             </w:r>
           </w:p>
         </w:tc>
@@ -2090,7 +2388,7 @@
           <w:color w:val="52606D"/>
           <w:sz w:val="16"/>
         </w:rPr>
-        <w:t>* The J values in this table are computed after fixing u(t), reintegrating N(t) with a finer-step fourth-order Runge-Kutta method, and then applying the manuscript objective definition. This is only to use the same numerical integration accuracy across methods.</w:t>
+        <w:t>* Objective J is computed after fixing u(t), reintegrating N(t) with the same fine-step fourth-order Runge-Kutta evaluator, and applying the manuscript objective definition. The direct row is a numerical cost reference, not a neural model.</w:t>
       </w:r>
     </w:p>
     <w:p>
@@ -2104,7 +2402,117 @@
           <w:color w:val="1F2937"/>
           <w:sz w:val="21"/>
         </w:rPr>
-        <w:t>Under the same PMP/KKT gap calculation, the Transformer u_theta(t) has a much smaller gap than this Neural-PMP controller-stage baseline. When J is recomputed with the same numerical evaluator, the Transformer also has a slightly lower objective value in this run.</w:t>
+        <w:t>The Transformer runs are stable across random seeds and remain close to the direct cost reference. Compared with the Neural-PMP controller-stage baseline [3], the Transformer has both lower objective J and a smaller PMP/KKT diagnostic gap in this fixed-initial-condition u(t) experiment.</w:t>
+      </w:r>
+    </w:p>
+    <w:p>
+      <w:pPr>
+        <w:spacing w:before="80" w:after="60"/>
+        <w:jc w:val="center"/>
+      </w:pPr>
+      <w:r>
+        <w:drawing>
+          <wp:inline xmlns:a="http://schemas.openxmlformats.org/drawingml/2006/main" xmlns:pic="http://schemas.openxmlformats.org/drawingml/2006/picture">
+            <wp:extent cx="5715000" cy="3463765"/>
+            <wp:docPr id="9" name="Picture 9"/>
+            <wp:cNvGraphicFramePr>
+              <a:graphicFrameLocks noChangeAspect="1"/>
+            </wp:cNvGraphicFramePr>
+            <a:graphic>
+              <a:graphicData uri="http://schemas.openxmlformats.org/drawingml/2006/picture">
+                <pic:pic>
+                  <pic:nvPicPr>
+                    <pic:cNvPr id="0" name="transformer_seed_loss_trajectories.png"/>
+                    <pic:cNvPicPr/>
+                  </pic:nvPicPr>
+                  <pic:blipFill>
+                    <a:blip r:embed="rId18"/>
+                    <a:stretch>
+                      <a:fillRect/>
+                    </a:stretch>
+                  </pic:blipFill>
+                  <pic:spPr>
+                    <a:xfrm>
+                      <a:off x="0" y="0"/>
+                      <a:ext cx="5715000" cy="3463765"/>
+                    </a:xfrm>
+                    <a:prstGeom prst="rect"/>
+                  </pic:spPr>
+                </pic:pic>
+              </a:graphicData>
+            </a:graphic>
+          </wp:inline>
+        </w:drawing>
+      </w:r>
+    </w:p>
+    <w:p>
+      <w:pPr>
+        <w:spacing w:after="160"/>
+        <w:jc w:val="center"/>
+      </w:pPr>
+      <w:r>
+        <w:rPr>
+          <w:rFonts w:ascii="Calibri" w:hAnsi="Calibri" w:eastAsia="PingFang SC"/>
+          <w:b w:val="0"/>
+          <w:color w:val="52606D"/>
+          <w:sz w:val="18"/>
+        </w:rPr>
+        <w:t>Figure 5. Multi-seed convergence of the Transformer u(t) PMP/KKT training loss.</w:t>
+      </w:r>
+    </w:p>
+    <w:p>
+      <w:pPr>
+        <w:spacing w:before="80" w:after="60"/>
+        <w:jc w:val="center"/>
+      </w:pPr>
+      <w:r>
+        <w:drawing>
+          <wp:inline xmlns:a="http://schemas.openxmlformats.org/drawingml/2006/main" xmlns:pic="http://schemas.openxmlformats.org/drawingml/2006/picture">
+            <wp:extent cx="5715000" cy="3391510"/>
+            <wp:docPr id="10" name="Picture 10"/>
+            <wp:cNvGraphicFramePr>
+              <a:graphicFrameLocks noChangeAspect="1"/>
+            </wp:cNvGraphicFramePr>
+            <a:graphic>
+              <a:graphicData uri="http://schemas.openxmlformats.org/drawingml/2006/picture">
+                <pic:pic>
+                  <pic:nvPicPr>
+                    <pic:cNvPr id="0" name="first_layer_objective_gap_closeup.png"/>
+                    <pic:cNvPicPr/>
+                  </pic:nvPicPr>
+                  <pic:blipFill>
+                    <a:blip r:embed="rId19"/>
+                    <a:stretch>
+                      <a:fillRect/>
+                    </a:stretch>
+                  </pic:blipFill>
+                  <pic:spPr>
+                    <a:xfrm>
+                      <a:off x="0" y="0"/>
+                      <a:ext cx="5715000" cy="3391510"/>
+                    </a:xfrm>
+                    <a:prstGeom prst="rect"/>
+                  </pic:spPr>
+                </pic:pic>
+              </a:graphicData>
+            </a:graphic>
+          </wp:inline>
+        </w:drawing>
+      </w:r>
+    </w:p>
+    <w:p>
+      <w:pPr>
+        <w:spacing w:after="160"/>
+        <w:jc w:val="center"/>
+      </w:pPr>
+      <w:r>
+        <w:rPr>
+          <w:rFonts w:ascii="Calibri" w:hAnsi="Calibri" w:eastAsia="PingFang SC"/>
+          <w:b w:val="0"/>
+          <w:color w:val="52606D"/>
+          <w:sz w:val="18"/>
+        </w:rPr>
+        <w:t>Figure 6. Objective gap relative to the direct cost reference for the main u(t) comparison.</w:t>
       </w:r>
     </w:p>
     <w:p>
@@ -2116,7 +2524,7 @@
         <w:drawing>
           <wp:inline xmlns:a="http://schemas.openxmlformats.org/drawingml/2006/main" xmlns:pic="http://schemas.openxmlformats.org/drawingml/2006/picture">
             <wp:extent cx="5806440" cy="3753899"/>
-            <wp:docPr id="9" name="Picture 9"/>
+            <wp:docPr id="11" name="Picture 11"/>
             <wp:cNvGraphicFramePr>
               <a:graphicFrameLocks noChangeAspect="1"/>
             </wp:cNvGraphicFramePr>
@@ -2128,7 +2536,7 @@
                     <pic:cNvPicPr/>
                   </pic:nvPicPr>
                   <pic:blipFill>
-                    <a:blip r:embed="rId18"/>
+                    <a:blip r:embed="rId20"/>
                     <a:stretch>
                       <a:fillRect/>
                     </a:stretch>
@@ -2159,7 +2567,7 @@
           <w:color w:val="52606D"/>
           <w:sz w:val="18"/>
         </w:rPr>
-        <w:t>Figure 5. Neural-PMP controller-stage baseline [3]: control sequence and resulting state trajectory.</w:t>
+        <w:t>Figure 7. Neural-PMP controller-stage baseline [3]: control sequence and resulting state trajectory.</w:t>
       </w:r>
     </w:p>
     <w:p>
@@ -2171,7 +2579,7 @@
         <w:drawing>
           <wp:inline xmlns:a="http://schemas.openxmlformats.org/drawingml/2006/main" xmlns:pic="http://schemas.openxmlformats.org/drawingml/2006/picture">
             <wp:extent cx="5806440" cy="2408575"/>
-            <wp:docPr id="10" name="Picture 10"/>
+            <wp:docPr id="12" name="Picture 12"/>
             <wp:cNvGraphicFramePr>
               <a:graphicFrameLocks noChangeAspect="1"/>
             </wp:cNvGraphicFramePr>
@@ -2183,7 +2591,7 @@
                     <pic:cNvPicPr/>
                   </pic:nvPicPr>
                   <pic:blipFill>
-                    <a:blip r:embed="rId19"/>
+                    <a:blip r:embed="rId21"/>
                     <a:stretch>
                       <a:fillRect/>
                     </a:stretch>
@@ -2214,62 +2622,7 @@
           <w:color w:val="52606D"/>
           <w:sz w:val="18"/>
         </w:rPr>
-        <w:t>Figure 6. Neural-PMP controller-stage baseline [3]: selected-run training trajectories.</w:t>
-      </w:r>
-    </w:p>
-    <w:p>
-      <w:pPr>
-        <w:spacing w:before="80" w:after="60"/>
-        <w:jc w:val="center"/>
-      </w:pPr>
-      <w:r>
-        <w:drawing>
-          <wp:inline xmlns:a="http://schemas.openxmlformats.org/drawingml/2006/main" xmlns:pic="http://schemas.openxmlformats.org/drawingml/2006/picture">
-            <wp:extent cx="5806440" cy="3110938"/>
-            <wp:docPr id="11" name="Picture 11"/>
-            <wp:cNvGraphicFramePr>
-              <a:graphicFrameLocks noChangeAspect="1"/>
-            </wp:cNvGraphicFramePr>
-            <a:graphic>
-              <a:graphicData uri="http://schemas.openxmlformats.org/drawingml/2006/picture">
-                <pic:pic>
-                  <pic:nvPicPr>
-                    <pic:cNvPr id="0" name="neural_pmp_reference_gap_closeup.png"/>
-                    <pic:cNvPicPr/>
-                  </pic:nvPicPr>
-                  <pic:blipFill>
-                    <a:blip r:embed="rId20"/>
-                    <a:stretch>
-                      <a:fillRect/>
-                    </a:stretch>
-                  </pic:blipFill>
-                  <pic:spPr>
-                    <a:xfrm>
-                      <a:off x="0" y="0"/>
-                      <a:ext cx="5806440" cy="3110938"/>
-                    </a:xfrm>
-                    <a:prstGeom prst="rect"/>
-                  </pic:spPr>
-                </pic:pic>
-              </a:graphicData>
-            </a:graphic>
-          </wp:inline>
-        </w:drawing>
-      </w:r>
-    </w:p>
-    <w:p>
-      <w:pPr>
-        <w:spacing w:after="160"/>
-        <w:jc w:val="center"/>
-      </w:pPr>
-      <w:r>
-        <w:rPr>
-          <w:rFonts w:ascii="Calibri" w:hAnsi="Calibri" w:eastAsia="PingFang SC"/>
-          <w:b w:val="0"/>
-          <w:color w:val="52606D"/>
-          <w:sz w:val="18"/>
-        </w:rPr>
-        <w:t>Figure 7. Objective J gap relative to the direct-cost reference under the common numerical evaluation.</w:t>
+        <w:t>Figure 8. Neural-PMP controller-stage baseline [3]: selected-run training trajectories.</w:t>
       </w:r>
     </w:p>
     <w:p>
@@ -2297,7 +2650,7 @@
           <w:color w:val="1F2937"/>
           <w:sz w:val="21"/>
         </w:rPr>
-        <w:t>The requested u(t) reproduction is complete. The Transformer control trajectory trained with the manuscript's PMP/KKT optimality-gap loss is smooth and satisfies the control bounds, reduces the training optimality gap from 76.26 to 0.02637, and gives J approximately 386.70 under the common numerical evaluation. The state-dependent extension u(t,N) is left for separate work because it requires different optimality conditions.</w:t>
+        <w:t>The requested first-layer u(t) reproduction is complete. The Transformer control trained with the manuscript's PMP/KKT optimality-gap loss is smooth, satisfies the control bounds, and reduces the training optimality gap from about 76 to 0.026 in the best run. Across six Transformer runs, the common-evaluator objective is 386.738 +/- 0.045, close to the direct cost reference 386.438 and better than the Neural-PMP [3] controller-stage baseline in this setting. The state-dependent extension u(t,N) is left for separate work because it requires different optimality conditions.</w:t>
       </w:r>
     </w:p>
     <w:sectPr>

</xml_diff>

<commit_message>
Add u(t) sensitivity sweep
</commit_message>
<xml_diff>
--- a/reports/ut_reproduction_report.docx
+++ b/reports/ut_reproduction_report.docx
@@ -2636,7 +2636,7 @@
           <w:color w:val="2E74B5"/>
           <w:sz w:val="30"/>
         </w:rPr>
-        <w:t>5. Conclusion</w:t>
+        <w:t>5. Sensitivity Experiments</w:t>
       </w:r>
     </w:p>
     <w:p>
@@ -2650,7 +2650,1268 @@
           <w:color w:val="1F2937"/>
           <w:sz w:val="21"/>
         </w:rPr>
-        <w:t>The requested first-layer u(t) reproduction is complete. The Transformer control trained with the manuscript's PMP/KKT optimality-gap loss is smooth, satisfies the control bounds, and reduces the training optimality gap from about 76 to 0.026 in the best run. Across six Transformer runs, the common-evaluator objective is 386.738 +/- 0.045, close to the direct cost reference 386.438 and better than the Neural-PMP [3] controller-stage baseline in this setting. The state-dependent extension u(t,N) is left for separate work because it requires different optimality conditions.</w:t>
+        <w:t>We also tested whether the u(t) reproduction is tied to the nominal parameter choice. In each row below, one parameter is changed while the others remain at the reported setting. The Transformer result is averaged over three random seeds; Neural-PMP [3] is the best controller-stage run from the same search protocol.</w:t>
+      </w:r>
+    </w:p>
+    <w:tbl>
+      <w:tblPr>
+        <w:tblStyle w:val="TableGrid"/>
+        <w:tblW w:type="auto" w:w="0"/>
+        <w:jc w:val="center"/>
+        <w:tblLook w:firstColumn="1" w:firstRow="1" w:lastColumn="0" w:lastRow="0" w:noHBand="0" w:noVBand="1" w:val="04A0"/>
+      </w:tblPr>
+      <w:tblGrid>
+        <w:gridCol w:w="1987"/>
+        <w:gridCol w:w="1987"/>
+        <w:gridCol w:w="1987"/>
+        <w:gridCol w:w="1987"/>
+        <w:gridCol w:w="1987"/>
+      </w:tblGrid>
+      <w:tr>
+        <w:tc>
+          <w:tcPr>
+            <w:tcW w:type="dxa" w:w="1655"/>
+            <w:shd w:fill="F2F4F7"/>
+            <w:vAlign w:val="center"/>
+          </w:tcPr>
+          <w:p>
+            <w:pPr>
+              <w:spacing w:before="20" w:after="20" w:line="252" w:lineRule="auto"/>
+              <w:jc w:val="center"/>
+            </w:pPr>
+            <w:r>
+              <w:rPr>
+                <w:rFonts w:ascii="Calibri" w:hAnsi="Calibri" w:eastAsia="PingFang SC"/>
+                <w:b/>
+                <w:color w:val="1F2937"/>
+                <w:sz w:val="14"/>
+              </w:rPr>
+              <w:t>condition</w:t>
+            </w:r>
+          </w:p>
+        </w:tc>
+        <w:tc>
+          <w:tcPr>
+            <w:tcW w:type="dxa" w:w="1296"/>
+            <w:shd w:fill="F2F4F7"/>
+            <w:vAlign w:val="center"/>
+          </w:tcPr>
+          <w:p>
+            <w:pPr>
+              <w:spacing w:before="20" w:after="20" w:line="252" w:lineRule="auto"/>
+              <w:jc w:val="center"/>
+            </w:pPr>
+            <w:r>
+              <w:rPr>
+                <w:rFonts w:ascii="Calibri" w:hAnsi="Calibri" w:eastAsia="PingFang SC"/>
+                <w:b/>
+                <w:color w:val="1F2937"/>
+                <w:sz w:val="14"/>
+              </w:rPr>
+              <w:t>direct J</w:t>
+            </w:r>
+          </w:p>
+        </w:tc>
+        <w:tc>
+          <w:tcPr>
+            <w:tcW w:type="dxa" w:w="2088"/>
+            <w:shd w:fill="F2F4F7"/>
+            <w:vAlign w:val="center"/>
+          </w:tcPr>
+          <w:p>
+            <w:pPr>
+              <w:spacing w:before="20" w:after="20" w:line="252" w:lineRule="auto"/>
+              <w:jc w:val="center"/>
+            </w:pPr>
+            <w:r>
+              <w:rPr>
+                <w:rFonts w:ascii="Calibri" w:hAnsi="Calibri" w:eastAsia="PingFang SC"/>
+                <w:b/>
+                <w:color w:val="1F2937"/>
+                <w:sz w:val="14"/>
+              </w:rPr>
+              <w:t>Transformer J</w:t>
+            </w:r>
+          </w:p>
+        </w:tc>
+        <w:tc>
+          <w:tcPr>
+            <w:tcW w:type="dxa" w:w="1655"/>
+            <w:shd w:fill="F2F4F7"/>
+            <w:vAlign w:val="center"/>
+          </w:tcPr>
+          <w:p>
+            <w:pPr>
+              <w:spacing w:before="20" w:after="20" w:line="252" w:lineRule="auto"/>
+              <w:jc w:val="center"/>
+            </w:pPr>
+            <w:r>
+              <w:rPr>
+                <w:rFonts w:ascii="Calibri" w:hAnsi="Calibri" w:eastAsia="PingFang SC"/>
+                <w:b/>
+                <w:color w:val="1F2937"/>
+                <w:sz w:val="14"/>
+              </w:rPr>
+              <w:t>Transformer gap</w:t>
+            </w:r>
+          </w:p>
+        </w:tc>
+        <w:tc>
+          <w:tcPr>
+            <w:tcW w:type="dxa" w:w="1655"/>
+            <w:shd w:fill="F2F4F7"/>
+            <w:vAlign w:val="center"/>
+          </w:tcPr>
+          <w:p>
+            <w:pPr>
+              <w:spacing w:before="20" w:after="20" w:line="252" w:lineRule="auto"/>
+              <w:jc w:val="center"/>
+            </w:pPr>
+            <w:r>
+              <w:rPr>
+                <w:rFonts w:ascii="Calibri" w:hAnsi="Calibri" w:eastAsia="PingFang SC"/>
+                <w:b/>
+                <w:color w:val="1F2937"/>
+                <w:sz w:val="14"/>
+              </w:rPr>
+              <w:t>Neural-PMP gap</w:t>
+            </w:r>
+          </w:p>
+        </w:tc>
+      </w:tr>
+      <w:tr>
+        <w:tc>
+          <w:tcPr>
+            <w:tcW w:type="dxa" w:w="1655"/>
+            <w:vAlign w:val="center"/>
+          </w:tcPr>
+          <w:p>
+            <w:pPr>
+              <w:spacing w:before="20" w:after="20" w:line="252" w:lineRule="auto"/>
+              <w:jc w:val="left"/>
+            </w:pPr>
+            <w:r>
+              <w:rPr>
+                <w:rFonts w:ascii="Calibri" w:hAnsi="Calibri" w:eastAsia="PingFang SC"/>
+                <w:b w:val="0"/>
+                <w:color w:val="1F2937"/>
+                <w:sz w:val="14"/>
+              </w:rPr>
+              <w:t>baseline</w:t>
+            </w:r>
+          </w:p>
+        </w:tc>
+        <w:tc>
+          <w:tcPr>
+            <w:tcW w:type="dxa" w:w="1296"/>
+            <w:vAlign w:val="center"/>
+          </w:tcPr>
+          <w:p>
+            <w:pPr>
+              <w:spacing w:before="20" w:after="20" w:line="252" w:lineRule="auto"/>
+              <w:jc w:val="left"/>
+            </w:pPr>
+            <w:r>
+              <w:rPr>
+                <w:rFonts w:ascii="Calibri" w:hAnsi="Calibri" w:eastAsia="PingFang SC"/>
+                <w:b w:val="0"/>
+                <w:color w:val="1F2937"/>
+                <w:sz w:val="14"/>
+              </w:rPr>
+              <w:t>386.706</w:t>
+            </w:r>
+          </w:p>
+        </w:tc>
+        <w:tc>
+          <w:tcPr>
+            <w:tcW w:type="dxa" w:w="2088"/>
+            <w:vAlign w:val="center"/>
+          </w:tcPr>
+          <w:p>
+            <w:pPr>
+              <w:spacing w:before="20" w:after="20" w:line="252" w:lineRule="auto"/>
+              <w:jc w:val="center"/>
+            </w:pPr>
+            <w:r>
+              <w:rPr>
+                <w:rFonts w:ascii="Calibri" w:hAnsi="Calibri" w:eastAsia="PingFang SC"/>
+                <w:b w:val="0"/>
+                <w:color w:val="1F2937"/>
+                <w:sz w:val="14"/>
+              </w:rPr>
+              <w:t>386.826 +/- 0.052</w:t>
+            </w:r>
+          </w:p>
+        </w:tc>
+        <w:tc>
+          <w:tcPr>
+            <w:tcW w:type="dxa" w:w="1655"/>
+            <w:vAlign w:val="center"/>
+          </w:tcPr>
+          <w:p>
+            <w:pPr>
+              <w:spacing w:before="20" w:after="20" w:line="252" w:lineRule="auto"/>
+              <w:jc w:val="center"/>
+            </w:pPr>
+            <w:r>
+              <w:rPr>
+                <w:rFonts w:ascii="Calibri" w:hAnsi="Calibri" w:eastAsia="PingFang SC"/>
+                <w:b w:val="0"/>
+                <w:color w:val="1F2937"/>
+                <w:sz w:val="14"/>
+              </w:rPr>
+              <w:t>0.031%</w:t>
+            </w:r>
+          </w:p>
+        </w:tc>
+        <w:tc>
+          <w:tcPr>
+            <w:tcW w:type="dxa" w:w="1655"/>
+            <w:vAlign w:val="center"/>
+          </w:tcPr>
+          <w:p>
+            <w:pPr>
+              <w:spacing w:before="20" w:after="20" w:line="252" w:lineRule="auto"/>
+              <w:jc w:val="center"/>
+            </w:pPr>
+            <w:r>
+              <w:rPr>
+                <w:rFonts w:ascii="Calibri" w:hAnsi="Calibri" w:eastAsia="PingFang SC"/>
+                <w:b w:val="0"/>
+                <w:color w:val="1F2937"/>
+                <w:sz w:val="14"/>
+              </w:rPr>
+              <w:t>0.240%</w:t>
+            </w:r>
+          </w:p>
+        </w:tc>
+      </w:tr>
+      <w:tr>
+        <w:tc>
+          <w:tcPr>
+            <w:tcW w:type="dxa" w:w="1655"/>
+            <w:vAlign w:val="center"/>
+          </w:tcPr>
+          <w:p>
+            <w:pPr>
+              <w:spacing w:before="20" w:after="20" w:line="252" w:lineRule="auto"/>
+              <w:jc w:val="left"/>
+            </w:pPr>
+            <w:r>
+              <w:rPr>
+                <w:rFonts w:ascii="Calibri" w:hAnsi="Calibri" w:eastAsia="PingFang SC"/>
+                <w:b w:val="0"/>
+                <w:color w:val="1F2937"/>
+                <w:sz w:val="14"/>
+              </w:rPr>
+              <w:t>beta=0.05</w:t>
+            </w:r>
+          </w:p>
+        </w:tc>
+        <w:tc>
+          <w:tcPr>
+            <w:tcW w:type="dxa" w:w="1296"/>
+            <w:vAlign w:val="center"/>
+          </w:tcPr>
+          <w:p>
+            <w:pPr>
+              <w:spacing w:before="20" w:after="20" w:line="252" w:lineRule="auto"/>
+              <w:jc w:val="left"/>
+            </w:pPr>
+            <w:r>
+              <w:rPr>
+                <w:rFonts w:ascii="Calibri" w:hAnsi="Calibri" w:eastAsia="PingFang SC"/>
+                <w:b w:val="0"/>
+                <w:color w:val="1F2937"/>
+                <w:sz w:val="14"/>
+              </w:rPr>
+              <w:t>325.457</w:t>
+            </w:r>
+          </w:p>
+        </w:tc>
+        <w:tc>
+          <w:tcPr>
+            <w:tcW w:type="dxa" w:w="2088"/>
+            <w:vAlign w:val="center"/>
+          </w:tcPr>
+          <w:p>
+            <w:pPr>
+              <w:spacing w:before="20" w:after="20" w:line="252" w:lineRule="auto"/>
+              <w:jc w:val="center"/>
+            </w:pPr>
+            <w:r>
+              <w:rPr>
+                <w:rFonts w:ascii="Calibri" w:hAnsi="Calibri" w:eastAsia="PingFang SC"/>
+                <w:b w:val="0"/>
+                <w:color w:val="1F2937"/>
+                <w:sz w:val="14"/>
+              </w:rPr>
+              <w:t>325.713 +/- 0.030</w:t>
+            </w:r>
+          </w:p>
+        </w:tc>
+        <w:tc>
+          <w:tcPr>
+            <w:tcW w:type="dxa" w:w="1655"/>
+            <w:vAlign w:val="center"/>
+          </w:tcPr>
+          <w:p>
+            <w:pPr>
+              <w:spacing w:before="20" w:after="20" w:line="252" w:lineRule="auto"/>
+              <w:jc w:val="center"/>
+            </w:pPr>
+            <w:r>
+              <w:rPr>
+                <w:rFonts w:ascii="Calibri" w:hAnsi="Calibri" w:eastAsia="PingFang SC"/>
+                <w:b w:val="0"/>
+                <w:color w:val="1F2937"/>
+                <w:sz w:val="14"/>
+              </w:rPr>
+              <w:t>0.079%</w:t>
+            </w:r>
+          </w:p>
+        </w:tc>
+        <w:tc>
+          <w:tcPr>
+            <w:tcW w:type="dxa" w:w="1655"/>
+            <w:vAlign w:val="center"/>
+          </w:tcPr>
+          <w:p>
+            <w:pPr>
+              <w:spacing w:before="20" w:after="20" w:line="252" w:lineRule="auto"/>
+              <w:jc w:val="center"/>
+            </w:pPr>
+            <w:r>
+              <w:rPr>
+                <w:rFonts w:ascii="Calibri" w:hAnsi="Calibri" w:eastAsia="PingFang SC"/>
+                <w:b w:val="0"/>
+                <w:color w:val="1F2937"/>
+                <w:sz w:val="14"/>
+              </w:rPr>
+              <w:t>0.169%</w:t>
+            </w:r>
+          </w:p>
+        </w:tc>
+      </w:tr>
+      <w:tr>
+        <w:tc>
+          <w:tcPr>
+            <w:tcW w:type="dxa" w:w="1655"/>
+            <w:vAlign w:val="center"/>
+          </w:tcPr>
+          <w:p>
+            <w:pPr>
+              <w:spacing w:before="20" w:after="20" w:line="252" w:lineRule="auto"/>
+              <w:jc w:val="left"/>
+            </w:pPr>
+            <w:r>
+              <w:rPr>
+                <w:rFonts w:ascii="Calibri" w:hAnsi="Calibri" w:eastAsia="PingFang SC"/>
+                <w:b w:val="0"/>
+                <w:color w:val="1F2937"/>
+                <w:sz w:val="14"/>
+              </w:rPr>
+              <w:t>beta=0.20</w:t>
+            </w:r>
+          </w:p>
+        </w:tc>
+        <w:tc>
+          <w:tcPr>
+            <w:tcW w:type="dxa" w:w="1296"/>
+            <w:vAlign w:val="center"/>
+          </w:tcPr>
+          <w:p>
+            <w:pPr>
+              <w:spacing w:before="20" w:after="20" w:line="252" w:lineRule="auto"/>
+              <w:jc w:val="left"/>
+            </w:pPr>
+            <w:r>
+              <w:rPr>
+                <w:rFonts w:ascii="Calibri" w:hAnsi="Calibri" w:eastAsia="PingFang SC"/>
+                <w:b w:val="0"/>
+                <w:color w:val="1F2937"/>
+                <w:sz w:val="14"/>
+              </w:rPr>
+              <w:t>444.860</w:t>
+            </w:r>
+          </w:p>
+        </w:tc>
+        <w:tc>
+          <w:tcPr>
+            <w:tcW w:type="dxa" w:w="2088"/>
+            <w:vAlign w:val="center"/>
+          </w:tcPr>
+          <w:p>
+            <w:pPr>
+              <w:spacing w:before="20" w:after="20" w:line="252" w:lineRule="auto"/>
+              <w:jc w:val="center"/>
+            </w:pPr>
+            <w:r>
+              <w:rPr>
+                <w:rFonts w:ascii="Calibri" w:hAnsi="Calibri" w:eastAsia="PingFang SC"/>
+                <w:b w:val="0"/>
+                <w:color w:val="1F2937"/>
+                <w:sz w:val="14"/>
+              </w:rPr>
+              <w:t>444.923 +/- 0.006</w:t>
+            </w:r>
+          </w:p>
+        </w:tc>
+        <w:tc>
+          <w:tcPr>
+            <w:tcW w:type="dxa" w:w="1655"/>
+            <w:vAlign w:val="center"/>
+          </w:tcPr>
+          <w:p>
+            <w:pPr>
+              <w:spacing w:before="20" w:after="20" w:line="252" w:lineRule="auto"/>
+              <w:jc w:val="center"/>
+            </w:pPr>
+            <w:r>
+              <w:rPr>
+                <w:rFonts w:ascii="Calibri" w:hAnsi="Calibri" w:eastAsia="PingFang SC"/>
+                <w:b w:val="0"/>
+                <w:color w:val="1F2937"/>
+                <w:sz w:val="14"/>
+              </w:rPr>
+              <w:t>0.014%</w:t>
+            </w:r>
+          </w:p>
+        </w:tc>
+        <w:tc>
+          <w:tcPr>
+            <w:tcW w:type="dxa" w:w="1655"/>
+            <w:vAlign w:val="center"/>
+          </w:tcPr>
+          <w:p>
+            <w:pPr>
+              <w:spacing w:before="20" w:after="20" w:line="252" w:lineRule="auto"/>
+              <w:jc w:val="center"/>
+            </w:pPr>
+            <w:r>
+              <w:rPr>
+                <w:rFonts w:ascii="Calibri" w:hAnsi="Calibri" w:eastAsia="PingFang SC"/>
+                <w:b w:val="0"/>
+                <w:color w:val="1F2937"/>
+                <w:sz w:val="14"/>
+              </w:rPr>
+              <w:t>0.160%</w:t>
+            </w:r>
+          </w:p>
+        </w:tc>
+      </w:tr>
+      <w:tr>
+        <w:tc>
+          <w:tcPr>
+            <w:tcW w:type="dxa" w:w="1655"/>
+            <w:vAlign w:val="center"/>
+          </w:tcPr>
+          <w:p>
+            <w:pPr>
+              <w:spacing w:before="20" w:after="20" w:line="252" w:lineRule="auto"/>
+              <w:jc w:val="left"/>
+            </w:pPr>
+            <w:r>
+              <w:rPr>
+                <w:rFonts w:ascii="Calibri" w:hAnsi="Calibri" w:eastAsia="PingFang SC"/>
+                <w:b w:val="0"/>
+                <w:color w:val="1F2937"/>
+                <w:sz w:val="14"/>
+              </w:rPr>
+              <w:t>gamma=10</w:t>
+            </w:r>
+          </w:p>
+        </w:tc>
+        <w:tc>
+          <w:tcPr>
+            <w:tcW w:type="dxa" w:w="1296"/>
+            <w:vAlign w:val="center"/>
+          </w:tcPr>
+          <w:p>
+            <w:pPr>
+              <w:spacing w:before="20" w:after="20" w:line="252" w:lineRule="auto"/>
+              <w:jc w:val="left"/>
+            </w:pPr>
+            <w:r>
+              <w:rPr>
+                <w:rFonts w:ascii="Calibri" w:hAnsi="Calibri" w:eastAsia="PingFang SC"/>
+                <w:b w:val="0"/>
+                <w:color w:val="1F2937"/>
+                <w:sz w:val="14"/>
+              </w:rPr>
+              <w:t>230.385</w:t>
+            </w:r>
+          </w:p>
+        </w:tc>
+        <w:tc>
+          <w:tcPr>
+            <w:tcW w:type="dxa" w:w="2088"/>
+            <w:vAlign w:val="center"/>
+          </w:tcPr>
+          <w:p>
+            <w:pPr>
+              <w:spacing w:before="20" w:after="20" w:line="252" w:lineRule="auto"/>
+              <w:jc w:val="center"/>
+            </w:pPr>
+            <w:r>
+              <w:rPr>
+                <w:rFonts w:ascii="Calibri" w:hAnsi="Calibri" w:eastAsia="PingFang SC"/>
+                <w:b w:val="0"/>
+                <w:color w:val="1F2937"/>
+                <w:sz w:val="14"/>
+              </w:rPr>
+              <w:t>230.485 +/- 0.011</w:t>
+            </w:r>
+          </w:p>
+        </w:tc>
+        <w:tc>
+          <w:tcPr>
+            <w:tcW w:type="dxa" w:w="1655"/>
+            <w:vAlign w:val="center"/>
+          </w:tcPr>
+          <w:p>
+            <w:pPr>
+              <w:spacing w:before="20" w:after="20" w:line="252" w:lineRule="auto"/>
+              <w:jc w:val="center"/>
+            </w:pPr>
+            <w:r>
+              <w:rPr>
+                <w:rFonts w:ascii="Calibri" w:hAnsi="Calibri" w:eastAsia="PingFang SC"/>
+                <w:b w:val="0"/>
+                <w:color w:val="1F2937"/>
+                <w:sz w:val="14"/>
+              </w:rPr>
+              <w:t>0.044%</w:t>
+            </w:r>
+          </w:p>
+        </w:tc>
+        <w:tc>
+          <w:tcPr>
+            <w:tcW w:type="dxa" w:w="1655"/>
+            <w:vAlign w:val="center"/>
+          </w:tcPr>
+          <w:p>
+            <w:pPr>
+              <w:spacing w:before="20" w:after="20" w:line="252" w:lineRule="auto"/>
+              <w:jc w:val="center"/>
+            </w:pPr>
+            <w:r>
+              <w:rPr>
+                <w:rFonts w:ascii="Calibri" w:hAnsi="Calibri" w:eastAsia="PingFang SC"/>
+                <w:b w:val="0"/>
+                <w:color w:val="1F2937"/>
+                <w:sz w:val="14"/>
+              </w:rPr>
+              <w:t>0.168%</w:t>
+            </w:r>
+          </w:p>
+        </w:tc>
+      </w:tr>
+      <w:tr>
+        <w:tc>
+          <w:tcPr>
+            <w:tcW w:type="dxa" w:w="1655"/>
+            <w:vAlign w:val="center"/>
+          </w:tcPr>
+          <w:p>
+            <w:pPr>
+              <w:spacing w:before="20" w:after="20" w:line="252" w:lineRule="auto"/>
+              <w:jc w:val="left"/>
+            </w:pPr>
+            <w:r>
+              <w:rPr>
+                <w:rFonts w:ascii="Calibri" w:hAnsi="Calibri" w:eastAsia="PingFang SC"/>
+                <w:b w:val="0"/>
+                <w:color w:val="1F2937"/>
+                <w:sz w:val="14"/>
+              </w:rPr>
+              <w:t>gamma=40</w:t>
+            </w:r>
+          </w:p>
+        </w:tc>
+        <w:tc>
+          <w:tcPr>
+            <w:tcW w:type="dxa" w:w="1296"/>
+            <w:vAlign w:val="center"/>
+          </w:tcPr>
+          <w:p>
+            <w:pPr>
+              <w:spacing w:before="20" w:after="20" w:line="252" w:lineRule="auto"/>
+              <w:jc w:val="left"/>
+            </w:pPr>
+            <w:r>
+              <w:rPr>
+                <w:rFonts w:ascii="Calibri" w:hAnsi="Calibri" w:eastAsia="PingFang SC"/>
+                <w:b w:val="0"/>
+                <w:color w:val="1F2937"/>
+                <w:sz w:val="14"/>
+              </w:rPr>
+              <w:t>614.915</w:t>
+            </w:r>
+          </w:p>
+        </w:tc>
+        <w:tc>
+          <w:tcPr>
+            <w:tcW w:type="dxa" w:w="2088"/>
+            <w:vAlign w:val="center"/>
+          </w:tcPr>
+          <w:p>
+            <w:pPr>
+              <w:spacing w:before="20" w:after="20" w:line="252" w:lineRule="auto"/>
+              <w:jc w:val="center"/>
+            </w:pPr>
+            <w:r>
+              <w:rPr>
+                <w:rFonts w:ascii="Calibri" w:hAnsi="Calibri" w:eastAsia="PingFang SC"/>
+                <w:b w:val="0"/>
+                <w:color w:val="1F2937"/>
+                <w:sz w:val="14"/>
+              </w:rPr>
+              <w:t>615.043 +/- 0.021</w:t>
+            </w:r>
+          </w:p>
+        </w:tc>
+        <w:tc>
+          <w:tcPr>
+            <w:tcW w:type="dxa" w:w="1655"/>
+            <w:vAlign w:val="center"/>
+          </w:tcPr>
+          <w:p>
+            <w:pPr>
+              <w:spacing w:before="20" w:after="20" w:line="252" w:lineRule="auto"/>
+              <w:jc w:val="center"/>
+            </w:pPr>
+            <w:r>
+              <w:rPr>
+                <w:rFonts w:ascii="Calibri" w:hAnsi="Calibri" w:eastAsia="PingFang SC"/>
+                <w:b w:val="0"/>
+                <w:color w:val="1F2937"/>
+                <w:sz w:val="14"/>
+              </w:rPr>
+              <w:t>0.021%</w:t>
+            </w:r>
+          </w:p>
+        </w:tc>
+        <w:tc>
+          <w:tcPr>
+            <w:tcW w:type="dxa" w:w="1655"/>
+            <w:vAlign w:val="center"/>
+          </w:tcPr>
+          <w:p>
+            <w:pPr>
+              <w:spacing w:before="20" w:after="20" w:line="252" w:lineRule="auto"/>
+              <w:jc w:val="center"/>
+            </w:pPr>
+            <w:r>
+              <w:rPr>
+                <w:rFonts w:ascii="Calibri" w:hAnsi="Calibri" w:eastAsia="PingFang SC"/>
+                <w:b w:val="0"/>
+                <w:color w:val="1F2937"/>
+                <w:sz w:val="14"/>
+              </w:rPr>
+              <w:t>0.042%</w:t>
+            </w:r>
+          </w:p>
+        </w:tc>
+      </w:tr>
+      <w:tr>
+        <w:tc>
+          <w:tcPr>
+            <w:tcW w:type="dxa" w:w="1655"/>
+            <w:vAlign w:val="center"/>
+          </w:tcPr>
+          <w:p>
+            <w:pPr>
+              <w:spacing w:before="20" w:after="20" w:line="252" w:lineRule="auto"/>
+              <w:jc w:val="left"/>
+            </w:pPr>
+            <w:r>
+              <w:rPr>
+                <w:rFonts w:ascii="Calibri" w:hAnsi="Calibri" w:eastAsia="PingFang SC"/>
+                <w:b w:val="0"/>
+                <w:color w:val="1F2937"/>
+                <w:sz w:val="14"/>
+              </w:rPr>
+              <w:t>alpha=0.5</w:t>
+            </w:r>
+          </w:p>
+        </w:tc>
+        <w:tc>
+          <w:tcPr>
+            <w:tcW w:type="dxa" w:w="1296"/>
+            <w:vAlign w:val="center"/>
+          </w:tcPr>
+          <w:p>
+            <w:pPr>
+              <w:spacing w:before="20" w:after="20" w:line="252" w:lineRule="auto"/>
+              <w:jc w:val="left"/>
+            </w:pPr>
+            <w:r>
+              <w:rPr>
+                <w:rFonts w:ascii="Calibri" w:hAnsi="Calibri" w:eastAsia="PingFang SC"/>
+                <w:b w:val="0"/>
+                <w:color w:val="1F2937"/>
+                <w:sz w:val="14"/>
+              </w:rPr>
+              <w:t>370.513</w:t>
+            </w:r>
+          </w:p>
+        </w:tc>
+        <w:tc>
+          <w:tcPr>
+            <w:tcW w:type="dxa" w:w="2088"/>
+            <w:vAlign w:val="center"/>
+          </w:tcPr>
+          <w:p>
+            <w:pPr>
+              <w:spacing w:before="20" w:after="20" w:line="252" w:lineRule="auto"/>
+              <w:jc w:val="center"/>
+            </w:pPr>
+            <w:r>
+              <w:rPr>
+                <w:rFonts w:ascii="Calibri" w:hAnsi="Calibri" w:eastAsia="PingFang SC"/>
+                <w:b w:val="0"/>
+                <w:color w:val="1F2937"/>
+                <w:sz w:val="14"/>
+              </w:rPr>
+              <w:t>370.482 +/- 0.023</w:t>
+            </w:r>
+          </w:p>
+        </w:tc>
+        <w:tc>
+          <w:tcPr>
+            <w:tcW w:type="dxa" w:w="1655"/>
+            <w:vAlign w:val="center"/>
+          </w:tcPr>
+          <w:p>
+            <w:pPr>
+              <w:spacing w:before="20" w:after="20" w:line="252" w:lineRule="auto"/>
+              <w:jc w:val="center"/>
+            </w:pPr>
+            <w:r>
+              <w:rPr>
+                <w:rFonts w:ascii="Calibri" w:hAnsi="Calibri" w:eastAsia="PingFang SC"/>
+                <w:b w:val="0"/>
+                <w:color w:val="1F2937"/>
+                <w:sz w:val="14"/>
+              </w:rPr>
+              <w:t>-0.008%</w:t>
+            </w:r>
+          </w:p>
+        </w:tc>
+        <w:tc>
+          <w:tcPr>
+            <w:tcW w:type="dxa" w:w="1655"/>
+            <w:vAlign w:val="center"/>
+          </w:tcPr>
+          <w:p>
+            <w:pPr>
+              <w:spacing w:before="20" w:after="20" w:line="252" w:lineRule="auto"/>
+              <w:jc w:val="center"/>
+            </w:pPr>
+            <w:r>
+              <w:rPr>
+                <w:rFonts w:ascii="Calibri" w:hAnsi="Calibri" w:eastAsia="PingFang SC"/>
+                <w:b w:val="0"/>
+                <w:color w:val="1F2937"/>
+                <w:sz w:val="14"/>
+              </w:rPr>
+              <w:t>0.135%</w:t>
+            </w:r>
+          </w:p>
+        </w:tc>
+      </w:tr>
+      <w:tr>
+        <w:tc>
+          <w:tcPr>
+            <w:tcW w:type="dxa" w:w="1655"/>
+            <w:vAlign w:val="center"/>
+          </w:tcPr>
+          <w:p>
+            <w:pPr>
+              <w:spacing w:before="20" w:after="20" w:line="252" w:lineRule="auto"/>
+              <w:jc w:val="left"/>
+            </w:pPr>
+            <w:r>
+              <w:rPr>
+                <w:rFonts w:ascii="Calibri" w:hAnsi="Calibri" w:eastAsia="PingFang SC"/>
+                <w:b w:val="0"/>
+                <w:color w:val="1F2937"/>
+                <w:sz w:val="14"/>
+              </w:rPr>
+              <w:t>alpha=2</w:t>
+            </w:r>
+          </w:p>
+        </w:tc>
+        <w:tc>
+          <w:tcPr>
+            <w:tcW w:type="dxa" w:w="1296"/>
+            <w:vAlign w:val="center"/>
+          </w:tcPr>
+          <w:p>
+            <w:pPr>
+              <w:spacing w:before="20" w:after="20" w:line="252" w:lineRule="auto"/>
+              <w:jc w:val="left"/>
+            </w:pPr>
+            <w:r>
+              <w:rPr>
+                <w:rFonts w:ascii="Calibri" w:hAnsi="Calibri" w:eastAsia="PingFang SC"/>
+                <w:b w:val="0"/>
+                <w:color w:val="1F2937"/>
+                <w:sz w:val="14"/>
+              </w:rPr>
+              <w:t>404.406</w:t>
+            </w:r>
+          </w:p>
+        </w:tc>
+        <w:tc>
+          <w:tcPr>
+            <w:tcW w:type="dxa" w:w="2088"/>
+            <w:vAlign w:val="center"/>
+          </w:tcPr>
+          <w:p>
+            <w:pPr>
+              <w:spacing w:before="20" w:after="20" w:line="252" w:lineRule="auto"/>
+              <w:jc w:val="center"/>
+            </w:pPr>
+            <w:r>
+              <w:rPr>
+                <w:rFonts w:ascii="Calibri" w:hAnsi="Calibri" w:eastAsia="PingFang SC"/>
+                <w:b w:val="0"/>
+                <w:color w:val="1F2937"/>
+                <w:sz w:val="14"/>
+              </w:rPr>
+              <w:t>404.600 +/- 0.033</w:t>
+            </w:r>
+          </w:p>
+        </w:tc>
+        <w:tc>
+          <w:tcPr>
+            <w:tcW w:type="dxa" w:w="1655"/>
+            <w:vAlign w:val="center"/>
+          </w:tcPr>
+          <w:p>
+            <w:pPr>
+              <w:spacing w:before="20" w:after="20" w:line="252" w:lineRule="auto"/>
+              <w:jc w:val="center"/>
+            </w:pPr>
+            <w:r>
+              <w:rPr>
+                <w:rFonts w:ascii="Calibri" w:hAnsi="Calibri" w:eastAsia="PingFang SC"/>
+                <w:b w:val="0"/>
+                <w:color w:val="1F2937"/>
+                <w:sz w:val="14"/>
+              </w:rPr>
+              <w:t>0.048%</w:t>
+            </w:r>
+          </w:p>
+        </w:tc>
+        <w:tc>
+          <w:tcPr>
+            <w:tcW w:type="dxa" w:w="1655"/>
+            <w:vAlign w:val="center"/>
+          </w:tcPr>
+          <w:p>
+            <w:pPr>
+              <w:spacing w:before="20" w:after="20" w:line="252" w:lineRule="auto"/>
+              <w:jc w:val="center"/>
+            </w:pPr>
+            <w:r>
+              <w:rPr>
+                <w:rFonts w:ascii="Calibri" w:hAnsi="Calibri" w:eastAsia="PingFang SC"/>
+                <w:b w:val="0"/>
+                <w:color w:val="1F2937"/>
+                <w:sz w:val="14"/>
+              </w:rPr>
+              <w:t>0.247%</w:t>
+            </w:r>
+          </w:p>
+        </w:tc>
+      </w:tr>
+      <w:tr>
+        <w:tc>
+          <w:tcPr>
+            <w:tcW w:type="dxa" w:w="1655"/>
+            <w:vAlign w:val="center"/>
+          </w:tcPr>
+          <w:p>
+            <w:pPr>
+              <w:spacing w:before="20" w:after="20" w:line="252" w:lineRule="auto"/>
+              <w:jc w:val="left"/>
+            </w:pPr>
+            <w:r>
+              <w:rPr>
+                <w:rFonts w:ascii="Calibri" w:hAnsi="Calibri" w:eastAsia="PingFang SC"/>
+                <w:b w:val="0"/>
+                <w:color w:val="1F2937"/>
+                <w:sz w:val="14"/>
+              </w:rPr>
+              <w:t>N0=5</w:t>
+            </w:r>
+          </w:p>
+        </w:tc>
+        <w:tc>
+          <w:tcPr>
+            <w:tcW w:type="dxa" w:w="1296"/>
+            <w:vAlign w:val="center"/>
+          </w:tcPr>
+          <w:p>
+            <w:pPr>
+              <w:spacing w:before="20" w:after="20" w:line="252" w:lineRule="auto"/>
+              <w:jc w:val="left"/>
+            </w:pPr>
+            <w:r>
+              <w:rPr>
+                <w:rFonts w:ascii="Calibri" w:hAnsi="Calibri" w:eastAsia="PingFang SC"/>
+                <w:b w:val="0"/>
+                <w:color w:val="1F2937"/>
+                <w:sz w:val="14"/>
+              </w:rPr>
+              <w:t>371.118</w:t>
+            </w:r>
+          </w:p>
+        </w:tc>
+        <w:tc>
+          <w:tcPr>
+            <w:tcW w:type="dxa" w:w="2088"/>
+            <w:vAlign w:val="center"/>
+          </w:tcPr>
+          <w:p>
+            <w:pPr>
+              <w:spacing w:before="20" w:after="20" w:line="252" w:lineRule="auto"/>
+              <w:jc w:val="center"/>
+            </w:pPr>
+            <w:r>
+              <w:rPr>
+                <w:rFonts w:ascii="Calibri" w:hAnsi="Calibri" w:eastAsia="PingFang SC"/>
+                <w:b w:val="0"/>
+                <w:color w:val="1F2937"/>
+                <w:sz w:val="14"/>
+              </w:rPr>
+              <w:t>371.168 +/- 0.037</w:t>
+            </w:r>
+          </w:p>
+        </w:tc>
+        <w:tc>
+          <w:tcPr>
+            <w:tcW w:type="dxa" w:w="1655"/>
+            <w:vAlign w:val="center"/>
+          </w:tcPr>
+          <w:p>
+            <w:pPr>
+              <w:spacing w:before="20" w:after="20" w:line="252" w:lineRule="auto"/>
+              <w:jc w:val="center"/>
+            </w:pPr>
+            <w:r>
+              <w:rPr>
+                <w:rFonts w:ascii="Calibri" w:hAnsi="Calibri" w:eastAsia="PingFang SC"/>
+                <w:b w:val="0"/>
+                <w:color w:val="1F2937"/>
+                <w:sz w:val="14"/>
+              </w:rPr>
+              <w:t>0.013%</w:t>
+            </w:r>
+          </w:p>
+        </w:tc>
+        <w:tc>
+          <w:tcPr>
+            <w:tcW w:type="dxa" w:w="1655"/>
+            <w:vAlign w:val="center"/>
+          </w:tcPr>
+          <w:p>
+            <w:pPr>
+              <w:spacing w:before="20" w:after="20" w:line="252" w:lineRule="auto"/>
+              <w:jc w:val="center"/>
+            </w:pPr>
+            <w:r>
+              <w:rPr>
+                <w:rFonts w:ascii="Calibri" w:hAnsi="Calibri" w:eastAsia="PingFang SC"/>
+                <w:b w:val="0"/>
+                <w:color w:val="1F2937"/>
+                <w:sz w:val="14"/>
+              </w:rPr>
+              <w:t>0.220%</w:t>
+            </w:r>
+          </w:p>
+        </w:tc>
+      </w:tr>
+      <w:tr>
+        <w:tc>
+          <w:tcPr>
+            <w:tcW w:type="dxa" w:w="1655"/>
+            <w:vAlign w:val="center"/>
+          </w:tcPr>
+          <w:p>
+            <w:pPr>
+              <w:spacing w:before="20" w:after="20" w:line="252" w:lineRule="auto"/>
+              <w:jc w:val="left"/>
+            </w:pPr>
+            <w:r>
+              <w:rPr>
+                <w:rFonts w:ascii="Calibri" w:hAnsi="Calibri" w:eastAsia="PingFang SC"/>
+                <w:b w:val="0"/>
+                <w:color w:val="1F2937"/>
+                <w:sz w:val="14"/>
+              </w:rPr>
+              <w:t>N0=20</w:t>
+            </w:r>
+          </w:p>
+        </w:tc>
+        <w:tc>
+          <w:tcPr>
+            <w:tcW w:type="dxa" w:w="1296"/>
+            <w:vAlign w:val="center"/>
+          </w:tcPr>
+          <w:p>
+            <w:pPr>
+              <w:spacing w:before="20" w:after="20" w:line="252" w:lineRule="auto"/>
+              <w:jc w:val="left"/>
+            </w:pPr>
+            <w:r>
+              <w:rPr>
+                <w:rFonts w:ascii="Calibri" w:hAnsi="Calibri" w:eastAsia="PingFang SC"/>
+                <w:b w:val="0"/>
+                <w:color w:val="1F2937"/>
+                <w:sz w:val="14"/>
+              </w:rPr>
+              <w:t>404.839</w:t>
+            </w:r>
+          </w:p>
+        </w:tc>
+        <w:tc>
+          <w:tcPr>
+            <w:tcW w:type="dxa" w:w="2088"/>
+            <w:vAlign w:val="center"/>
+          </w:tcPr>
+          <w:p>
+            <w:pPr>
+              <w:spacing w:before="20" w:after="20" w:line="252" w:lineRule="auto"/>
+              <w:jc w:val="center"/>
+            </w:pPr>
+            <w:r>
+              <w:rPr>
+                <w:rFonts w:ascii="Calibri" w:hAnsi="Calibri" w:eastAsia="PingFang SC"/>
+                <w:b w:val="0"/>
+                <w:color w:val="1F2937"/>
+                <w:sz w:val="14"/>
+              </w:rPr>
+              <w:t>405.201 +/- 0.074</w:t>
+            </w:r>
+          </w:p>
+        </w:tc>
+        <w:tc>
+          <w:tcPr>
+            <w:tcW w:type="dxa" w:w="1655"/>
+            <w:vAlign w:val="center"/>
+          </w:tcPr>
+          <w:p>
+            <w:pPr>
+              <w:spacing w:before="20" w:after="20" w:line="252" w:lineRule="auto"/>
+              <w:jc w:val="center"/>
+            </w:pPr>
+            <w:r>
+              <w:rPr>
+                <w:rFonts w:ascii="Calibri" w:hAnsi="Calibri" w:eastAsia="PingFang SC"/>
+                <w:b w:val="0"/>
+                <w:color w:val="1F2937"/>
+                <w:sz w:val="14"/>
+              </w:rPr>
+              <w:t>0.089%</w:t>
+            </w:r>
+          </w:p>
+        </w:tc>
+        <w:tc>
+          <w:tcPr>
+            <w:tcW w:type="dxa" w:w="1655"/>
+            <w:vAlign w:val="center"/>
+          </w:tcPr>
+          <w:p>
+            <w:pPr>
+              <w:spacing w:before="20" w:after="20" w:line="252" w:lineRule="auto"/>
+              <w:jc w:val="center"/>
+            </w:pPr>
+            <w:r>
+              <w:rPr>
+                <w:rFonts w:ascii="Calibri" w:hAnsi="Calibri" w:eastAsia="PingFang SC"/>
+                <w:b w:val="0"/>
+                <w:color w:val="1F2937"/>
+                <w:sz w:val="14"/>
+              </w:rPr>
+              <w:t>0.174%</w:t>
+            </w:r>
+          </w:p>
+        </w:tc>
+      </w:tr>
+    </w:tbl>
+    <w:p>
+      <w:pPr>
+        <w:spacing w:after="80"/>
+      </w:pPr>
+    </w:p>
+    <w:p>
+      <w:pPr>
+        <w:spacing w:after="120" w:line="252" w:lineRule="auto"/>
+      </w:pPr>
+      <w:r>
+        <w:rPr>
+          <w:rFonts w:ascii="Calibri" w:hAnsi="Calibri" w:eastAsia="PingFang SC"/>
+          <w:b w:val="0"/>
+          <w:color w:val="52606D"/>
+          <w:sz w:val="16"/>
+        </w:rPr>
+        <w:t>* In this sensitivity table, the direct row is an n=400 grid cost reference evaluated with the same RK4 evaluator. The small negative alpha=0.5 gap is within this reference tolerance and should be read as a numerical tie, not as beating the optimum.</w:t>
+      </w:r>
+    </w:p>
+    <w:p>
+      <w:pPr>
+        <w:spacing w:after="120" w:line="264" w:lineRule="auto"/>
+      </w:pPr>
+      <w:r>
+        <w:rPr>
+          <w:rFonts w:ascii="Calibri" w:hAnsi="Calibri" w:eastAsia="PingFang SC"/>
+          <w:b w:val="0"/>
+          <w:color w:val="1F2937"/>
+          <w:sz w:val="21"/>
+        </w:rPr>
+        <w:t>Across these one-factor tests, the Transformer remains within about 0.09% of the direct reference. Neural-PMP [3] is also close in objective value, but the Transformer is consistently closer to the direct reference and has a smaller PMP/KKT diagnostic gap.</w:t>
+      </w:r>
+    </w:p>
+    <w:p>
+      <w:pPr>
+        <w:spacing w:before="80" w:after="60"/>
+        <w:jc w:val="center"/>
+      </w:pPr>
+      <w:r>
+        <w:drawing>
+          <wp:inline xmlns:a="http://schemas.openxmlformats.org/drawingml/2006/main" xmlns:pic="http://schemas.openxmlformats.org/drawingml/2006/picture">
+            <wp:extent cx="5806440" cy="2473338"/>
+            <wp:docPr id="13" name="Picture 13"/>
+            <wp:cNvGraphicFramePr>
+              <a:graphicFrameLocks noChangeAspect="1"/>
+            </wp:cNvGraphicFramePr>
+            <a:graphic>
+              <a:graphicData uri="http://schemas.openxmlformats.org/drawingml/2006/picture">
+                <pic:pic>
+                  <pic:nvPicPr>
+                    <pic:cNvPr id="0" name="sensitivity_relative_gap_zoom.png"/>
+                    <pic:cNvPicPr/>
+                  </pic:nvPicPr>
+                  <pic:blipFill>
+                    <a:blip r:embed="rId22"/>
+                    <a:stretch>
+                      <a:fillRect/>
+                    </a:stretch>
+                  </pic:blipFill>
+                  <pic:spPr>
+                    <a:xfrm>
+                      <a:off x="0" y="0"/>
+                      <a:ext cx="5806440" cy="2473338"/>
+                    </a:xfrm>
+                    <a:prstGeom prst="rect"/>
+                  </pic:spPr>
+                </pic:pic>
+              </a:graphicData>
+            </a:graphic>
+          </wp:inline>
+        </w:drawing>
+      </w:r>
+    </w:p>
+    <w:p>
+      <w:pPr>
+        <w:spacing w:after="160"/>
+        <w:jc w:val="center"/>
+      </w:pPr>
+      <w:r>
+        <w:rPr>
+          <w:rFonts w:ascii="Calibri" w:hAnsi="Calibri" w:eastAsia="PingFang SC"/>
+          <w:b w:val="0"/>
+          <w:color w:val="52606D"/>
+          <w:sz w:val="18"/>
+        </w:rPr>
+        <w:t>Figure 9. Objective gap relative to the direct reference across parameter and initial-condition changes.</w:t>
+      </w:r>
+    </w:p>
+    <w:p>
+      <w:pPr>
+        <w:spacing w:before="80" w:after="60"/>
+        <w:jc w:val="center"/>
+      </w:pPr>
+      <w:r>
+        <w:drawing>
+          <wp:inline xmlns:a="http://schemas.openxmlformats.org/drawingml/2006/main" xmlns:pic="http://schemas.openxmlformats.org/drawingml/2006/picture">
+            <wp:extent cx="5806440" cy="2473338"/>
+            <wp:docPr id="14" name="Picture 14"/>
+            <wp:cNvGraphicFramePr>
+              <a:graphicFrameLocks noChangeAspect="1"/>
+            </wp:cNvGraphicFramePr>
+            <a:graphic>
+              <a:graphicData uri="http://schemas.openxmlformats.org/drawingml/2006/picture">
+                <pic:pic>
+                  <pic:nvPicPr>
+                    <pic:cNvPr id="0" name="sensitivity_pmp_gap.png"/>
+                    <pic:cNvPicPr/>
+                  </pic:nvPicPr>
+                  <pic:blipFill>
+                    <a:blip r:embed="rId23"/>
+                    <a:stretch>
+                      <a:fillRect/>
+                    </a:stretch>
+                  </pic:blipFill>
+                  <pic:spPr>
+                    <a:xfrm>
+                      <a:off x="0" y="0"/>
+                      <a:ext cx="5806440" cy="2473338"/>
+                    </a:xfrm>
+                    <a:prstGeom prst="rect"/>
+                  </pic:spPr>
+                </pic:pic>
+              </a:graphicData>
+            </a:graphic>
+          </wp:inline>
+        </w:drawing>
+      </w:r>
+    </w:p>
+    <w:p>
+      <w:pPr>
+        <w:spacing w:after="160"/>
+        <w:jc w:val="center"/>
+      </w:pPr>
+      <w:r>
+        <w:rPr>
+          <w:rFonts w:ascii="Calibri" w:hAnsi="Calibri" w:eastAsia="PingFang SC"/>
+          <w:b w:val="0"/>
+          <w:color w:val="52606D"/>
+          <w:sz w:val="18"/>
+        </w:rPr>
+        <w:t>Figure 10. PMP/KKT diagnostic gap across the same sensitivity conditions.</w:t>
+      </w:r>
+    </w:p>
+    <w:p>
+      <w:pPr>
+        <w:spacing w:before="280" w:after="100"/>
+      </w:pPr>
+      <w:r>
+        <w:rPr>
+          <w:rFonts w:ascii="Calibri" w:hAnsi="Calibri" w:eastAsia="PingFang SC"/>
+          <w:b/>
+          <w:color w:val="2E74B5"/>
+          <w:sz w:val="30"/>
+        </w:rPr>
+        <w:t>6. Conclusion</w:t>
+      </w:r>
+    </w:p>
+    <w:p>
+      <w:pPr>
+        <w:spacing w:after="120" w:line="264" w:lineRule="auto"/>
+      </w:pPr>
+      <w:r>
+        <w:rPr>
+          <w:rFonts w:ascii="Calibri" w:hAnsi="Calibri" w:eastAsia="PingFang SC"/>
+          <w:b w:val="0"/>
+          <w:color w:val="1F2937"/>
+          <w:sz w:val="21"/>
+        </w:rPr>
+        <w:t>The requested first-layer u(t) reproduction is complete. The Transformer control trained with the manuscript's PMP/KKT optimality-gap loss is smooth, satisfies the control bounds, and reduces the training optimality gap from about 76 to 0.026 in the best run. Across six Transformer runs in the nominal setting, the common-evaluator objective is 386.738 +/- 0.045, close to the direct cost reference 386.438 and better than the Neural-PMP [3] controller-stage baseline. The sensitivity sweep further shows that the same u(t) training procedure remains close to the direct reference under changes in beta, gamma, alpha, and N0. The state-dependent extension u(t,N) is left for separate work because it requires different optimality conditions.</w:t>
       </w:r>
     </w:p>
     <w:sectPr>

</xml_diff>

<commit_message>
Polish u(t) report terminology
</commit_message>
<xml_diff>
--- a/reports/ut_reproduction_report.docx
+++ b/reports/ut_reproduction_report.docx
@@ -13,7 +13,7 @@
           <w:color w:val="1F2937"/>
           <w:sz w:val="46"/>
         </w:rPr>
-        <w:t>Transformer u(t) First-Layer Experiment Report</w:t>
+        <w:t>Transformer u(t) Reproduction Report</w:t>
       </w:r>
     </w:p>
     <w:p>
@@ -27,7 +27,7 @@
           <w:color w:val="52606D"/>
           <w:sz w:val="21"/>
         </w:rPr>
-        <w:t>Fixed-initial-condition time-dependent control trained by PMP/KKT optimality gaps</w:t>
+        <w:t>Fixed-initial-condition time-dependent control under PMP/KKT optimality conditions</w:t>
       </w:r>
     </w:p>
     <w:p>
@@ -817,7 +817,7 @@
                 <w:color w:val="1F2937"/>
                 <w:sz w:val="18"/>
               </w:rPr>
-              <w:t>objective J on the training grid</w:t>
+              <w:t>objective J during training</w:t>
             </w:r>
           </w:p>
         </w:tc>
@@ -1003,7 +1003,7 @@
           <w:color w:val="1F2937"/>
           <w:sz w:val="21"/>
         </w:rPr>
-        <w:t>The final pointwise diagnostic below uses a smooth weight q(t) to separate the two regimes: near psi(t)=0 it emphasizes the singular-condition error; away from psi(t)=0 it emphasizes the boundary KKT error.</w:t>
+        <w:t>The final pointwise condition plot below uses a smooth weight q(t) to separate the two regimes: near psi(t)=0 it emphasizes the singular-condition error; away from psi(t)=0 it emphasizes the boundary KKT error.</w:t>
       </w:r>
     </w:p>
     <w:p>
@@ -1072,7 +1072,7 @@
           <w:color w:val="2E74B5"/>
           <w:sz w:val="30"/>
         </w:rPr>
-        <w:t>4. First-Layer Benchmark and Related Work</w:t>
+        <w:t>4. Comparison with Related Work</w:t>
       </w:r>
     </w:p>
     <w:p>
@@ -1086,7 +1086,7 @@
           <w:color w:val="1F2937"/>
           <w:sz w:val="21"/>
         </w:rPr>
-        <w:t>For this first-layer experiment, all numerical comparisons keep the same fixed initial condition and compare time-dependent controls u(t). Several related-work papers in the manuscript target value-function or feedback formulations; those are important method references, but they are not the same numerical task as this u(t) reproduction.</w:t>
+        <w:t>For the fixed-initial-condition u(t) reproduction, all numerical comparisons keep the same initial condition and compare time-dependent controls u(t). Several related-work papers in the manuscript target value-function or feedback formulations; those are important related formulations, but they are not the same numerical task as this u(t) reproduction.</w:t>
       </w:r>
     </w:p>
     <w:tbl>
@@ -1120,7 +1120,7 @@
                 <w:color w:val="1F2937"/>
                 <w:sz w:val="15"/>
               </w:rPr>
-              <w:t>reference</w:t>
+              <w:t>method family</w:t>
             </w:r>
           </w:p>
         </w:tc>
@@ -1229,7 +1229,7 @@
                 <w:color w:val="1F2937"/>
                 <w:sz w:val="15"/>
               </w:rPr>
-              <w:t>state-domain feedback/value formulation; not a direct u(t) baseline</w:t>
+              <w:t>state-domain feedback/value formulation; not a direct numerical comparison for fixed u(t)</w:t>
             </w:r>
           </w:p>
         </w:tc>
@@ -1294,7 +1294,7 @@
                 <w:color w:val="1F2937"/>
                 <w:sz w:val="15"/>
               </w:rPr>
-              <w:t>closest related-work baseline for the present u(t) experiment; implemented numerically below</w:t>
+              <w:t>closest related-work method for the present u(t) experiment; implemented numerically below</w:t>
             </w:r>
           </w:p>
         </w:tc>
@@ -1359,7 +1359,7 @@
                 <w:color w:val="1F2937"/>
                 <w:sz w:val="15"/>
               </w:rPr>
-              <w:t>methodological reference for feedback/value learning; separate from this fixed-trajectory u(t) layer</w:t>
+              <w:t>related feedback/value-learning formulation; separate from this fixed-trajectory u(t) layer</w:t>
             </w:r>
           </w:p>
         </w:tc>
@@ -1451,7 +1451,7 @@
           <w:color w:val="1F2937"/>
           <w:sz w:val="21"/>
         </w:rPr>
-        <w:t>Among these, [3] is the closest apples-to-apples numerical comparison. Here [3] refers to Gu, Xiong, and Chen, Pontryagin Optimal Control via Neural Networks (arXiv:2212.14566). Their Neural-PMP method first learns a differentiable dynamics model and then updates a control sequence using PMP gradients. Since the dynamics are already known in the manuscript setting, we compare against the oracle-dynamics controller stage: forward state integration, backward costate recursion, and Hamiltonian-gradient updates of a discrete control sequence.</w:t>
+        <w:t>Among these, [3] is the closest numerical comparison. Here [3] refers to Gu, Xiong, and Chen, Pontryagin Optimal Control via Neural Networks (arXiv:2212.14566). Their Neural-PMP method first learns a differentiable dynamics model and then updates a control sequence using PMP gradients. Since the dynamics are already known in the manuscript setting, we compare with the corresponding known-dynamics u(t) update: forward state integration, backward costate recursion, and Hamiltonian-gradient updates of a discrete control sequence.</w:t>
       </w:r>
     </w:p>
     <w:tbl>
@@ -1510,7 +1510,7 @@
                 <w:color w:val="1F2937"/>
                 <w:sz w:val="14"/>
               </w:rPr>
-              <w:t>training / update criterion</w:t>
+              <w:t>optimization condition</w:t>
             </w:r>
           </w:p>
         </w:tc>
@@ -1554,7 +1554,7 @@
                 <w:color w:val="1F2937"/>
                 <w:sz w:val="14"/>
               </w:rPr>
-              <w:t>J - direct</w:t>
+              <w:t>J - direct J</w:t>
             </w:r>
           </w:p>
         </w:tc>
@@ -1598,7 +1598,7 @@
                 <w:color w:val="1F2937"/>
                 <w:sz w:val="14"/>
               </w:rPr>
-              <w:t>note</w:t>
+              <w:t>role</w:t>
             </w:r>
           </w:p>
         </w:tc>
@@ -1621,7 +1621,7 @@
                 <w:color w:val="1F2937"/>
                 <w:sz w:val="14"/>
               </w:rPr>
-              <w:t>direct grid reference</w:t>
+              <w:t>direct minimization of J</w:t>
             </w:r>
           </w:p>
         </w:tc>
@@ -1642,7 +1642,7 @@
                 <w:color w:val="1F2937"/>
                 <w:sz w:val="14"/>
               </w:rPr>
-              <w:t>direct minimization of discretized J</w:t>
+              <w:t>minimize discretized J on a time mesh</w:t>
             </w:r>
           </w:p>
         </w:tc>
@@ -1726,7 +1726,7 @@
                 <w:color w:val="1F2937"/>
                 <w:sz w:val="14"/>
               </w:rPr>
-              <w:t>cost reference</w:t>
+              <w:t>cost comparison</w:t>
             </w:r>
           </w:p>
         </w:tc>
@@ -1749,7 +1749,7 @@
                 <w:color w:val="1F2937"/>
                 <w:sz w:val="14"/>
               </w:rPr>
-              <w:t>Transformer u(t), 6 runs</w:t>
+              <w:t>Transformer u(t), 6 trainings</w:t>
             </w:r>
           </w:p>
         </w:tc>
@@ -1770,7 +1770,7 @@
                 <w:color w:val="1F2937"/>
                 <w:sz w:val="14"/>
               </w:rPr>
-              <w:t>paper PMP/KKT optimality-gap loss</w:t>
+              <w:t>manuscript PMP/KKT optimality-gap loss</w:t>
             </w:r>
           </w:p>
         </w:tc>
@@ -1854,7 +1854,7 @@
                 <w:color w:val="1F2937"/>
                 <w:sz w:val="14"/>
               </w:rPr>
-              <w:t>main reproduction</w:t>
+              <w:t>reproduction</w:t>
             </w:r>
           </w:p>
         </w:tc>
@@ -1877,7 +1877,7 @@
                 <w:color w:val="1F2937"/>
                 <w:sz w:val="14"/>
               </w:rPr>
-              <w:t>best Transformer run</w:t>
+              <w:t>best Transformer training</w:t>
             </w:r>
           </w:p>
         </w:tc>
@@ -1982,7 +1982,7 @@
                 <w:color w:val="1F2937"/>
                 <w:sz w:val="14"/>
               </w:rPr>
-              <w:t>best reported run</w:t>
+              <w:t>best Transformer result</w:t>
             </w:r>
           </w:p>
         </w:tc>
@@ -2026,7 +2026,7 @@
                 <w:color w:val="1F2937"/>
                 <w:sz w:val="14"/>
               </w:rPr>
-              <w:t>Hamiltonian-gradient update with known dynamics</w:t>
+              <w:t>PMP-gradient update for u(t) with known dynamics</w:t>
             </w:r>
           </w:p>
         </w:tc>
@@ -2110,7 +2110,7 @@
                 <w:color w:val="1F2937"/>
                 <w:sz w:val="14"/>
               </w:rPr>
-              <w:t>related-work baseline</w:t>
+              <w:t>related-work comparison</w:t>
             </w:r>
           </w:p>
         </w:tc>
@@ -2238,7 +2238,7 @@
                 <w:color w:val="1F2937"/>
                 <w:sz w:val="14"/>
               </w:rPr>
-              <w:t>scale check</w:t>
+              <w:t>simple control</w:t>
             </w:r>
           </w:p>
         </w:tc>
@@ -2261,7 +2261,7 @@
                 <w:color w:val="1F2937"/>
                 <w:sz w:val="14"/>
               </w:rPr>
-              <w:t>repository demo output</w:t>
+              <w:t>provided repository output</w:t>
             </w:r>
           </w:p>
         </w:tc>
@@ -2366,7 +2366,7 @@
                 <w:color w:val="1F2937"/>
                 <w:sz w:val="14"/>
               </w:rPr>
-              <w:t>original demo artifact</w:t>
+              <w:t>provided output file</w:t>
             </w:r>
           </w:p>
         </w:tc>
@@ -2388,7 +2388,7 @@
           <w:color w:val="52606D"/>
           <w:sz w:val="16"/>
         </w:rPr>
-        <w:t>* Objective J is computed after fixing u(t), reintegrating N(t) with the same fine-step fourth-order Runge-Kutta evaluator, and applying the manuscript objective definition. The direct row is a numerical cost reference, not a neural model.</w:t>
+        <w:t>* For comparison, after u(t) is fixed, N(t) and J are recomputed on a common fine time mesh using fourth-order Runge-Kutta. This is only the numerical evaluation of the manuscript objective.</w:t>
       </w:r>
     </w:p>
     <w:p>
@@ -2402,7 +2402,7 @@
           <w:color w:val="1F2937"/>
           <w:sz w:val="21"/>
         </w:rPr>
-        <w:t>The Transformer runs are stable across random seeds and remain close to the direct cost reference. Compared with the Neural-PMP controller-stage baseline [3], the Transformer has both lower objective J and a smaller PMP/KKT diagnostic gap in this fixed-initial-condition u(t) experiment.</w:t>
+        <w:t>The Transformer trainings are stable across independent initializations and remain close to direct minimization of J. Compared with Neural-PMP [3], the Transformer has both lower objective J and a smaller PMP/KKT optimality gap in this fixed-initial-condition u(t) experiment.</w:t>
       </w:r>
     </w:p>
     <w:p>
@@ -2457,7 +2457,7 @@
           <w:color w:val="52606D"/>
           <w:sz w:val="18"/>
         </w:rPr>
-        <w:t>Figure 5. Multi-seed convergence of the Transformer u(t) PMP/KKT training loss.</w:t>
+        <w:t>Figure 5. Convergence of the Transformer u(t) PMP/KKT training loss across independent trainings.</w:t>
       </w:r>
     </w:p>
     <w:p>
@@ -2477,7 +2477,7 @@
               <a:graphicData uri="http://schemas.openxmlformats.org/drawingml/2006/picture">
                 <pic:pic>
                   <pic:nvPicPr>
-                    <pic:cNvPr id="0" name="first_layer_objective_gap_closeup.png"/>
+                    <pic:cNvPr id="0" name="objective_gap_comparison.png"/>
                     <pic:cNvPicPr/>
                   </pic:nvPicPr>
                   <pic:blipFill>
@@ -2512,7 +2512,7 @@
           <w:color w:val="52606D"/>
           <w:sz w:val="18"/>
         </w:rPr>
-        <w:t>Figure 6. Objective gap relative to the direct cost reference for the main u(t) comparison.</w:t>
+        <w:t>Figure 6. Difference in J from direct minimization for the main u(t) comparison.</w:t>
       </w:r>
     </w:p>
     <w:p>
@@ -2523,7 +2523,7 @@
       <w:r>
         <w:drawing>
           <wp:inline xmlns:a="http://schemas.openxmlformats.org/drawingml/2006/main" xmlns:pic="http://schemas.openxmlformats.org/drawingml/2006/picture">
-            <wp:extent cx="5806440" cy="3753899"/>
+            <wp:extent cx="5806440" cy="3776072"/>
             <wp:docPr id="11" name="Picture 11"/>
             <wp:cNvGraphicFramePr>
               <a:graphicFrameLocks noChangeAspect="1"/>
@@ -2544,7 +2544,7 @@
                   <pic:spPr>
                     <a:xfrm>
                       <a:off x="0" y="0"/>
-                      <a:ext cx="5806440" cy="3753899"/>
+                      <a:ext cx="5806440" cy="3776072"/>
                     </a:xfrm>
                     <a:prstGeom prst="rect"/>
                   </pic:spPr>
@@ -2567,7 +2567,7 @@
           <w:color w:val="52606D"/>
           <w:sz w:val="18"/>
         </w:rPr>
-        <w:t>Figure 7. Neural-PMP controller-stage baseline [3]: control sequence and resulting state trajectory.</w:t>
+        <w:t>Figure 7. Neural-PMP [3]: control sequence and resulting state trajectory.</w:t>
       </w:r>
     </w:p>
     <w:p>
@@ -2622,7 +2622,7 @@
           <w:color w:val="52606D"/>
           <w:sz w:val="18"/>
         </w:rPr>
-        <w:t>Figure 8. Neural-PMP controller-stage baseline [3]: selected-run training trajectories.</w:t>
+        <w:t>Figure 8. Neural-PMP [3]: selected training trajectories.</w:t>
       </w:r>
     </w:p>
     <w:p>
@@ -2636,7 +2636,7 @@
           <w:color w:val="2E74B5"/>
           <w:sz w:val="30"/>
         </w:rPr>
-        <w:t>5. Sensitivity Experiments</w:t>
+        <w:t>5. Parameter Sensitivity</w:t>
       </w:r>
     </w:p>
     <w:p>
@@ -2650,7 +2650,7 @@
           <w:color w:val="1F2937"/>
           <w:sz w:val="21"/>
         </w:rPr>
-        <w:t>We also tested whether the u(t) reproduction is tied to the nominal parameter choice. In each row below, one parameter is changed while the others remain at the reported setting. The Transformer result is averaged over three random seeds; Neural-PMP [3] is the best controller-stage run from the same search protocol.</w:t>
+        <w:t>We also tested whether the u(t) reproduction is tied to the nominal parameter choice. In each row below, one parameter is changed while the others remain at the reported setting. The Transformer result is averaged over three independent trainings; Neural-PMP [3] is the best result from the same search protocol.</w:t>
       </w:r>
     </w:p>
     <w:tbl>
@@ -2797,7 +2797,7 @@
                 <w:color w:val="1F2937"/>
                 <w:sz w:val="14"/>
               </w:rPr>
-              <w:t>baseline</w:t>
+              <w:t>nominal</w:t>
             </w:r>
           </w:p>
         </w:tc>
@@ -3759,7 +3759,7 @@
           <w:color w:val="52606D"/>
           <w:sz w:val="16"/>
         </w:rPr>
-        <w:t>* In this sensitivity table, the direct row is an n=400 grid cost reference evaluated with the same RK4 evaluator. The small negative alpha=0.5 gap is within this reference tolerance and should be read as a numerical tie, not as beating the optimum.</w:t>
+        <w:t>* In this sensitivity table, direct J is obtained by direct minimization on an n=400 time mesh and then recomputed on the common fine time mesh. The small negative alpha=0.5 gap is within this numerical tolerance and should be read as a tie, not as beating the optimum.</w:t>
       </w:r>
     </w:p>
     <w:p>
@@ -3773,7 +3773,7 @@
           <w:color w:val="1F2937"/>
           <w:sz w:val="21"/>
         </w:rPr>
-        <w:t>Across these one-factor tests, the Transformer remains within about 0.09% of the direct reference. Neural-PMP [3] is also close in objective value, but the Transformer is consistently closer to the direct reference and has a smaller PMP/KKT diagnostic gap.</w:t>
+        <w:t>Across these one-factor tests, the Transformer remains within about 0.09% of direct minimization. Neural-PMP [3] is also close in objective value, but the Transformer is consistently closer to direct minimization and has a smaller PMP/KKT optimality gap.</w:t>
       </w:r>
     </w:p>
     <w:p>
@@ -3828,7 +3828,7 @@
           <w:color w:val="52606D"/>
           <w:sz w:val="18"/>
         </w:rPr>
-        <w:t>Figure 9. Objective gap relative to the direct reference across parameter and initial-condition changes.</w:t>
+        <w:t>Figure 9. Difference in objective J from direct minimization across parameter and initial-condition changes.</w:t>
       </w:r>
     </w:p>
     <w:p>
@@ -3883,7 +3883,7 @@
           <w:color w:val="52606D"/>
           <w:sz w:val="18"/>
         </w:rPr>
-        <w:t>Figure 10. PMP/KKT diagnostic gap across the same sensitivity conditions.</w:t>
+        <w:t>Figure 10. PMP/KKT optimality gap across the same sensitivity conditions.</w:t>
       </w:r>
     </w:p>
     <w:p>
@@ -3911,7 +3911,7 @@
           <w:color w:val="1F2937"/>
           <w:sz w:val="21"/>
         </w:rPr>
-        <w:t>The requested first-layer u(t) reproduction is complete. The Transformer control trained with the manuscript's PMP/KKT optimality-gap loss is smooth, satisfies the control bounds, and reduces the training optimality gap from about 76 to 0.026 in the best run. Across six Transformer runs in the nominal setting, the common-evaluator objective is 386.738 +/- 0.045, close to the direct cost reference 386.438 and better than the Neural-PMP [3] controller-stage baseline. The sensitivity sweep further shows that the same u(t) training procedure remains close to the direct reference under changes in beta, gamma, alpha, and N0. The state-dependent extension u(t,N) is left for separate work because it requires different optimality conditions.</w:t>
+        <w:t>The requested u(t) reproduction is complete. The Transformer control trained with the manuscript's PMP/KKT optimality-gap loss is smooth, satisfies the control bounds, and reduces the training optimality gap from about 76 to 0.026 in the best training. Across six Transformer trainings in the nominal setting, the recomputed objective is 386.738 +/- 0.045, close to direct minimization of J at 386.438 and better than Neural-PMP [3] in this comparison. The parameter sensitivity experiments further show that the same u(t) training procedure remains close to direct minimization under changes in beta, gamma, alpha, and N0. The state-dependent extension u(t,N) is left for separate work because it requires different optimality conditions.</w:t>
       </w:r>
     </w:p>
     <w:sectPr>

</xml_diff>

<commit_message>
Clarify N-u phase plot
</commit_message>
<xml_diff>
--- a/reports/ut_reproduction_report.docx
+++ b/reports/ut_reproduction_report.docx
@@ -530,7 +530,7 @@
       <w:r>
         <w:drawing>
           <wp:inline xmlns:a="http://schemas.openxmlformats.org/drawingml/2006/main" xmlns:pic="http://schemas.openxmlformats.org/drawingml/2006/picture">
-            <wp:extent cx="6172200" cy="4239809"/>
+            <wp:extent cx="6172200" cy="4237843"/>
             <wp:docPr id="6" name="Picture 6"/>
             <wp:cNvGraphicFramePr>
               <a:graphicFrameLocks noChangeAspect="1"/>
@@ -551,7 +551,7 @@
                   <pic:spPr>
                     <a:xfrm>
                       <a:off x="0" y="0"/>
-                      <a:ext cx="6172200" cy="4239809"/>
+                      <a:ext cx="6172200" cy="4237843"/>
                     </a:xfrm>
                     <a:prstGeom prst="rect"/>
                   </pic:spPr>

</xml_diff>